<commit_message>
Substitui diagrama ASCII feio por tabela academica estruturada de pipeline em todos os formatos
</commit_message>
<xml_diff>
--- a/TECHNICAL_PAPER_T_NSE_ARC_2026.docx
+++ b/TECHNICAL_PAPER_T_NSE_ARC_2026.docx
@@ -392,7 +392,7 @@
         <w:spacing w:after="80"/>
       </w:pPr>
       <w:r>
-        <w:t>T-NSE executes an entirely deterministic, five-module pipeline:</w:t>
+        <w:t>T-NSE organizes spatial induction into an end-to-end deterministic pipeline structured across five sequential modules:</w:t>
       </w:r>
     </w:p>
     <w:tbl>
@@ -402,113 +402,794 @@
         <w:tblLook w:firstColumn="1" w:firstRow="1" w:lastColumn="0" w:lastRow="0" w:noHBand="0" w:noVBand="1" w:val="04A0"/>
       </w:tblPr>
       <w:tblGrid>
-        <w:gridCol w:w="9360"/>
+        <w:gridCol w:w="2340"/>
+        <w:gridCol w:w="2340"/>
+        <w:gridCol w:w="2340"/>
+        <w:gridCol w:w="2340"/>
       </w:tblGrid>
       <w:tr>
         <w:tc>
           <w:tcPr>
-            <w:tcW w:type="dxa" w:w="9360"/>
-            <w:shd w:fill="F6F8FA"/>
+            <w:tcW w:type="dxa" w:w="2340"/>
+            <w:shd w:fill="0F3C73"/>
             <w:tcMar>
-              <w:top w:w="140" w:type="dxa"/>
-              <w:bottom w:w="140" w:type="dxa"/>
-              <w:left w:w="180" w:type="dxa"/>
-              <w:right w:w="180" w:type="dxa"/>
+              <w:top w:w="120" w:type="dxa"/>
+              <w:bottom w:w="120" w:type="dxa"/>
+              <w:left w:w="130" w:type="dxa"/>
+              <w:right w:w="130" w:type="dxa"/>
             </w:tcMar>
           </w:tcPr>
           <w:p>
             <w:pPr>
-              <w:spacing w:after="0" w:line="252" w:lineRule="auto"/>
+              <w:spacing w:after="0"/>
             </w:pPr>
             <w:r>
               <w:rPr>
-                <w:rFonts w:ascii="Consolas" w:hAnsi="Consolas"/>
-                <w:color w:val="24292F"/>
-                <w:sz w:val="17"/>
+                <w:rFonts w:ascii="Calibri" w:hAnsi="Calibri"/>
+                <w:b/>
+                <w:color w:val="FFFFFF"/>
+                <w:sz w:val="19"/>
               </w:rPr>
-              <w:t>+-----------------------------------------------------------------------------------------+</w:t>
-              <w:br/>
-              <w:t>|                                    INPUT GRID G                                         |</w:t>
-              <w:br/>
-              <w:t>+-----------------------------------------------------------------------------------------+</w:t>
-              <w:br/>
-              <w:t xml:space="preserve">                                             |</w:t>
-              <w:br/>
-              <w:t xml:space="preserve">                                             v</w:t>
-              <w:br/>
-              <w:t>+-----------------------------------------------------------------------------------------+</w:t>
-              <w:br/>
-              <w:t>|  MODULE 1: TOPOLOGICAL PERCEPTION (ARCObjectExtractor)                                  |</w:t>
-              <w:br/>
-              <w:t>|  * Multilayer color segmentation (c ∈ {1..9}, background c=0)                           |</w:t>
-              <w:br/>
-              <w:t>|  * Connected component labeling (4- or 8-connectivity with NumPy BFS fallback)          |</w:t>
-              <w:br/>
-              <w:t>|  * Entity formalization: o_i = ⟨ c_i, M_i, b_i, A_i, c_i ⟩                              |</w:t>
-              <w:br/>
-              <w:t>+-----------------------------------------------------------------------------------------+</w:t>
-              <w:br/>
-              <w:t xml:space="preserve">                                             |</w:t>
-              <w:br/>
-              <w:t xml:space="preserve">                                             v</w:t>
-              <w:br/>
-              <w:t>+-----------------------------------------------------------------------------------------+</w:t>
-              <w:br/>
-              <w:t>|  MODULE 2: TOPOLOGICAL SCENE GRAPH - TSG (build_scene_graph)                            |</w:t>
-              <w:br/>
-              <w:t>|  * Boundary flood-fill cavity detection (enclosed_cells)                                |</w:t>
-              <w:br/>
-              <w:t>|  * Typed relational edges: Adjacency (dist ≤ 1) and Containment (M_j ⊂ Hole(M_i))       |</w:t>
-              <w:br/>
-              <w:t>|  * Relative centroid offset vector: Δc_ij = c_j - c_i                                   |</w:t>
-              <w:br/>
-              <w:t>+-----------------------------------------------------------------------------------------+</w:t>
-              <w:br/>
-              <w:t xml:space="preserve">                                             |</w:t>
-              <w:br/>
-              <w:t xml:space="preserve">                                             v</w:t>
-              <w:br/>
-              <w:t>+-----------------------------------------------------------------------------------------+</w:t>
-              <w:br/>
-              <w:t>|  MODULE 3: HEURISTIC HYPOTHESIS PRUNER (prune_dsl)                                      |</w:t>
-              <w:br/>
-              <w:t>|  * Demonstration pair delta analysis (dimension shifts, transposition, scale, palette)  |</w:t>
-              <w:br/>
-              <w:t>|  * Selective active DSL subspace pruning (reducing 75 down to 3-15 active primitives)   |</w:t>
-              <w:br/>
-              <w:t>+-----------------------------------------------------------------------------------------+</w:t>
-              <w:br/>
-              <w:t xml:space="preserve">                                             |</w:t>
-              <w:br/>
-              <w:t xml:space="preserve">                                             v</w:t>
-              <w:br/>
-              <w:t>+-----------------------------------------------------------------------------------------+</w:t>
-              <w:br/>
-              <w:t>|  MODULE 4: SYMBOLIC DSL ENGINE &amp; VERIFICATION (ARCSymbolicEngine)                       |</w:t>
-              <w:br/>
-              <w:t>|  * Shortest-first exhaustive enumeration (depth 1 -&gt; depth 2)                           |</w:t>
-              <w:br/>
-              <w:t>|  * Deterministic acceptance criterion: Loss = 0 across ALL training demonstrations     |</w:t>
-              <w:br/>
-              <w:t>|  * Deterministic application to hidden test input: O_test = P*(I_test)                  |</w:t>
-              <w:br/>
-              <w:t>+-----------------------------------------------------------------------------------------+</w:t>
-              <w:br/>
-              <w:t xml:space="preserve">                                             |</w:t>
-              <w:br/>
-              <w:t xml:space="preserve">                                             v</w:t>
-              <w:br/>
-              <w:t>+-----------------------------------------------------------------------------------------+</w:t>
-              <w:br/>
-              <w:t>|  MODULE 5: KAGGLE ARC-AGI-2 SUBMISSION PIPELINE (submission.json)                       |</w:t>
-              <w:br/>
-              <w:t>|  * Robust glob discovery across arbitrary /kaggle/input/ directory structures           |</w:t>
-              <w:br/>
-              <w:t>|  * Per-task timeout quota (max_time=1.5s with guaranteed identity fallback)             |</w:t>
-              <w:br/>
-              <w:t>|  * Official submission formatting with attempt_1 and attempt_2                          |</w:t>
-              <w:br/>
-              <w:t>+-----------------------------------------------------------------------------------------+</w:t>
+              <w:t>Pipeline Stage</w:t>
+            </w:r>
+          </w:p>
+        </w:tc>
+        <w:tc>
+          <w:tcPr>
+            <w:tcW w:type="dxa" w:w="2340"/>
+            <w:shd w:fill="0F3C73"/>
+            <w:tcMar>
+              <w:top w:w="120" w:type="dxa"/>
+              <w:bottom w:w="120" w:type="dxa"/>
+              <w:left w:w="130" w:type="dxa"/>
+              <w:right w:w="130" w:type="dxa"/>
+            </w:tcMar>
+          </w:tcPr>
+          <w:p>
+            <w:pPr>
+              <w:spacing w:after="0"/>
+            </w:pPr>
+            <w:r>
+              <w:rPr>
+                <w:rFonts w:ascii="Calibri" w:hAnsi="Calibri"/>
+                <w:b/>
+                <w:color w:val="FFFFFF"/>
+                <w:sz w:val="19"/>
+              </w:rPr>
+              <w:t>Implementation Module</w:t>
+            </w:r>
+          </w:p>
+        </w:tc>
+        <w:tc>
+          <w:tcPr>
+            <w:tcW w:type="dxa" w:w="2340"/>
+            <w:shd w:fill="0F3C73"/>
+            <w:tcMar>
+              <w:top w:w="120" w:type="dxa"/>
+              <w:bottom w:w="120" w:type="dxa"/>
+              <w:left w:w="130" w:type="dxa"/>
+              <w:right w:w="130" w:type="dxa"/>
+            </w:tcMar>
+          </w:tcPr>
+          <w:p>
+            <w:pPr>
+              <w:spacing w:after="0"/>
+            </w:pPr>
+            <w:r>
+              <w:rPr>
+                <w:rFonts w:ascii="Calibri" w:hAnsi="Calibri"/>
+                <w:b/>
+                <w:color w:val="FFFFFF"/>
+                <w:sz w:val="19"/>
+              </w:rPr>
+              <w:t>Formal Operation &amp; Mathematical Mechanism</w:t>
+            </w:r>
+          </w:p>
+        </w:tc>
+        <w:tc>
+          <w:tcPr>
+            <w:tcW w:type="dxa" w:w="2340"/>
+            <w:shd w:fill="0F3C73"/>
+            <w:tcMar>
+              <w:top w:w="120" w:type="dxa"/>
+              <w:bottom w:w="120" w:type="dxa"/>
+              <w:left w:w="130" w:type="dxa"/>
+              <w:right w:w="130" w:type="dxa"/>
+            </w:tcMar>
+          </w:tcPr>
+          <w:p>
+            <w:pPr>
+              <w:spacing w:after="0"/>
+            </w:pPr>
+            <w:r>
+              <w:rPr>
+                <w:rFonts w:ascii="Calibri" w:hAnsi="Calibri"/>
+                <w:b/>
+                <w:color w:val="FFFFFF"/>
+                <w:sz w:val="19"/>
+              </w:rPr>
+              <w:t>Output Representation</w:t>
+            </w:r>
+          </w:p>
+        </w:tc>
+      </w:tr>
+      <w:tr>
+        <w:tc>
+          <w:tcPr>
+            <w:tcW w:type="dxa" w:w="2340"/>
+            <w:shd w:fill="FFFFFF"/>
+            <w:tcMar>
+              <w:top w:w="90" w:type="dxa"/>
+              <w:bottom w:w="90" w:type="dxa"/>
+              <w:left w:w="130" w:type="dxa"/>
+              <w:right w:w="130" w:type="dxa"/>
+            </w:tcMar>
+          </w:tcPr>
+          <w:p>
+            <w:pPr>
+              <w:spacing w:after="0"/>
+            </w:pPr>
+            <w:r>
+              <w:rPr>
+                <w:rFonts w:ascii="Calibri" w:hAnsi="Calibri"/>
+                <w:b/>
+                <w:sz w:val="18"/>
+              </w:rPr>
+              <w:t>0. Raw Ingestion</w:t>
+            </w:r>
+          </w:p>
+        </w:tc>
+        <w:tc>
+          <w:tcPr>
+            <w:tcW w:type="dxa" w:w="2340"/>
+            <w:shd w:fill="FFFFFF"/>
+            <w:tcMar>
+              <w:top w:w="90" w:type="dxa"/>
+              <w:bottom w:w="90" w:type="dxa"/>
+              <w:left w:w="130" w:type="dxa"/>
+              <w:right w:w="130" w:type="dxa"/>
+            </w:tcMar>
+          </w:tcPr>
+          <w:p>
+            <w:pPr>
+              <w:spacing w:after="0"/>
+            </w:pPr>
+            <w:r>
+              <w:rPr>
+                <w:rFonts w:ascii="Calibri" w:hAnsi="Calibri"/>
+                <w:sz w:val="18"/>
+              </w:rPr>
+              <w:t>Input Grid $\mathbf{G}$</w:t>
+            </w:r>
+          </w:p>
+        </w:tc>
+        <w:tc>
+          <w:tcPr>
+            <w:tcW w:type="dxa" w:w="2340"/>
+            <w:shd w:fill="FFFFFF"/>
+            <w:tcMar>
+              <w:top w:w="90" w:type="dxa"/>
+              <w:bottom w:w="90" w:type="dxa"/>
+              <w:left w:w="130" w:type="dxa"/>
+              <w:right w:w="130" w:type="dxa"/>
+            </w:tcMar>
+          </w:tcPr>
+          <w:p>
+            <w:pPr>
+              <w:spacing w:after="0"/>
+            </w:pPr>
+            <w:r>
+              <w:rPr>
+                <w:rFonts w:ascii="Calibri" w:hAnsi="Calibri"/>
+                <w:sz w:val="18"/>
+              </w:rPr>
+              <w:t>Parse raw task JSON into discrete 2D integer lattice $\mathbf{G} \in \{0,\dots,9\}^{H \times W}$</w:t>
+            </w:r>
+          </w:p>
+        </w:tc>
+        <w:tc>
+          <w:tcPr>
+            <w:tcW w:type="dxa" w:w="2340"/>
+            <w:shd w:fill="FFFFFF"/>
+            <w:tcMar>
+              <w:top w:w="90" w:type="dxa"/>
+              <w:bottom w:w="90" w:type="dxa"/>
+              <w:left w:w="130" w:type="dxa"/>
+              <w:right w:w="130" w:type="dxa"/>
+            </w:tcMar>
+          </w:tcPr>
+          <w:p>
+            <w:pPr>
+              <w:spacing w:after="0"/>
+            </w:pPr>
+            <w:r>
+              <w:rPr>
+                <w:rFonts w:ascii="Calibri" w:hAnsi="Calibri"/>
+                <w:sz w:val="18"/>
+              </w:rPr>
+              <w:t>Raw Discrete Lattice</w:t>
+            </w:r>
+          </w:p>
+        </w:tc>
+      </w:tr>
+      <w:tr>
+        <w:tc>
+          <w:tcPr>
+            <w:tcW w:type="dxa" w:w="2340"/>
+            <w:shd w:fill="F9FAFB"/>
+            <w:tcMar>
+              <w:top w:w="90" w:type="dxa"/>
+              <w:bottom w:w="90" w:type="dxa"/>
+              <w:left w:w="130" w:type="dxa"/>
+              <w:right w:w="130" w:type="dxa"/>
+            </w:tcMar>
+          </w:tcPr>
+          <w:p>
+            <w:pPr>
+              <w:spacing w:after="0"/>
+            </w:pPr>
+            <w:r>
+              <w:rPr>
+                <w:rFonts w:ascii="Calibri" w:hAnsi="Calibri"/>
+                <w:b/>
+                <w:sz w:val="18"/>
+              </w:rPr>
+              <w:t>Stage 1 · Perception</w:t>
+            </w:r>
+          </w:p>
+        </w:tc>
+        <w:tc>
+          <w:tcPr>
+            <w:tcW w:type="dxa" w:w="2340"/>
+            <w:shd w:fill="F9FAFB"/>
+            <w:tcMar>
+              <w:top w:w="90" w:type="dxa"/>
+              <w:bottom w:w="90" w:type="dxa"/>
+              <w:left w:w="130" w:type="dxa"/>
+              <w:right w:w="130" w:type="dxa"/>
+            </w:tcMar>
+          </w:tcPr>
+          <w:p>
+            <w:pPr>
+              <w:spacing w:after="0"/>
+            </w:pPr>
+            <w:r>
+              <w:rPr>
+                <w:rFonts w:ascii="Calibri" w:hAnsi="Calibri"/>
+                <w:color w:val="B41E1E"/>
+                <w:sz w:val="18"/>
+              </w:rPr>
+              <w:t>ARCObjectExtractor</w:t>
+            </w:r>
+          </w:p>
+        </w:tc>
+        <w:tc>
+          <w:tcPr>
+            <w:tcW w:type="dxa" w:w="2340"/>
+            <w:shd w:fill="F9FAFB"/>
+            <w:tcMar>
+              <w:top w:w="90" w:type="dxa"/>
+              <w:bottom w:w="90" w:type="dxa"/>
+              <w:left w:w="130" w:type="dxa"/>
+              <w:right w:w="130" w:type="dxa"/>
+            </w:tcMar>
+          </w:tcPr>
+          <w:p>
+            <w:pPr>
+              <w:spacing w:after="0"/>
+            </w:pPr>
+            <w:r>
+              <w:rPr>
+                <w:rFonts w:ascii="Calibri" w:hAnsi="Calibri"/>
+                <w:sz w:val="18"/>
+              </w:rPr>
+              <w:t>Multilayer color filtering; 4- or 8-connectivity labeling (OpenCV / pure-NumPy BFS)</w:t>
+            </w:r>
+          </w:p>
+        </w:tc>
+        <w:tc>
+          <w:tcPr>
+            <w:tcW w:type="dxa" w:w="2340"/>
+            <w:shd w:fill="F9FAFB"/>
+            <w:tcMar>
+              <w:top w:w="90" w:type="dxa"/>
+              <w:bottom w:w="90" w:type="dxa"/>
+              <w:left w:w="130" w:type="dxa"/>
+              <w:right w:w="130" w:type="dxa"/>
+            </w:tcMar>
+          </w:tcPr>
+          <w:p>
+            <w:pPr>
+              <w:spacing w:after="0"/>
+            </w:pPr>
+            <w:r>
+              <w:rPr>
+                <w:rFonts w:ascii="Calibri" w:hAnsi="Calibri"/>
+                <w:sz w:val="18"/>
+              </w:rPr>
+              <w:t>Entity Set $\mathcal{O} = \{o_i = \langle c_i, \mathcal{M}_i, \mathbf{b}_i, A_i, \mathbf{c}_i \rangle\}$</w:t>
+            </w:r>
+          </w:p>
+        </w:tc>
+      </w:tr>
+      <w:tr>
+        <w:tc>
+          <w:tcPr>
+            <w:tcW w:type="dxa" w:w="2340"/>
+            <w:shd w:fill="FFFFFF"/>
+            <w:tcMar>
+              <w:top w:w="90" w:type="dxa"/>
+              <w:bottom w:w="90" w:type="dxa"/>
+              <w:left w:w="130" w:type="dxa"/>
+              <w:right w:w="130" w:type="dxa"/>
+            </w:tcMar>
+          </w:tcPr>
+          <w:p>
+            <w:pPr>
+              <w:spacing w:after="0"/>
+            </w:pPr>
+            <w:r>
+              <w:rPr>
+                <w:rFonts w:ascii="Calibri" w:hAnsi="Calibri"/>
+                <w:b/>
+                <w:sz w:val="18"/>
+              </w:rPr>
+              <w:t>Stage 2 · Topology</w:t>
+            </w:r>
+          </w:p>
+        </w:tc>
+        <w:tc>
+          <w:tcPr>
+            <w:tcW w:type="dxa" w:w="2340"/>
+            <w:shd w:fill="FFFFFF"/>
+            <w:tcMar>
+              <w:top w:w="90" w:type="dxa"/>
+              <w:bottom w:w="90" w:type="dxa"/>
+              <w:left w:w="130" w:type="dxa"/>
+              <w:right w:w="130" w:type="dxa"/>
+            </w:tcMar>
+          </w:tcPr>
+          <w:p>
+            <w:pPr>
+              <w:spacing w:after="0"/>
+            </w:pPr>
+            <w:r>
+              <w:rPr>
+                <w:rFonts w:ascii="Calibri" w:hAnsi="Calibri"/>
+                <w:color w:val="B41E1E"/>
+                <w:sz w:val="18"/>
+              </w:rPr>
+              <w:t>build_scene_graph</w:t>
+            </w:r>
+          </w:p>
+        </w:tc>
+        <w:tc>
+          <w:tcPr>
+            <w:tcW w:type="dxa" w:w="2340"/>
+            <w:shd w:fill="FFFFFF"/>
+            <w:tcMar>
+              <w:top w:w="90" w:type="dxa"/>
+              <w:bottom w:w="90" w:type="dxa"/>
+              <w:left w:w="130" w:type="dxa"/>
+              <w:right w:w="130" w:type="dxa"/>
+            </w:tcMar>
+          </w:tcPr>
+          <w:p>
+            <w:pPr>
+              <w:spacing w:after="0"/>
+            </w:pPr>
+            <w:r>
+              <w:rPr>
+                <w:rFonts w:ascii="Calibri" w:hAnsi="Calibri"/>
+                <w:sz w:val="18"/>
+              </w:rPr>
+              <w:t>Boundary flood-fill cavity detection (</w:t>
+            </w:r>
+            <w:r>
+              <w:rPr>
+                <w:rFonts w:ascii="Calibri" w:hAnsi="Calibri"/>
+                <w:color w:val="B41E1E"/>
+                <w:sz w:val="18"/>
+              </w:rPr>
+              <w:t>enclosed_cells</w:t>
+            </w:r>
+            <w:r>
+              <w:rPr>
+                <w:rFonts w:ascii="Calibri" w:hAnsi="Calibri"/>
+                <w:sz w:val="18"/>
+              </w:rPr>
+              <w:t>); typed relation extraction</w:t>
+            </w:r>
+          </w:p>
+        </w:tc>
+        <w:tc>
+          <w:tcPr>
+            <w:tcW w:type="dxa" w:w="2340"/>
+            <w:shd w:fill="FFFFFF"/>
+            <w:tcMar>
+              <w:top w:w="90" w:type="dxa"/>
+              <w:bottom w:w="90" w:type="dxa"/>
+              <w:left w:w="130" w:type="dxa"/>
+              <w:right w:w="130" w:type="dxa"/>
+            </w:tcMar>
+          </w:tcPr>
+          <w:p>
+            <w:pPr>
+              <w:spacing w:after="0"/>
+            </w:pPr>
+            <w:r>
+              <w:rPr>
+                <w:rFonts w:ascii="Calibri" w:hAnsi="Calibri"/>
+                <w:sz w:val="18"/>
+              </w:rPr>
+              <w:t xml:space="preserve">Attributed Graph $\mathcal{G} = (\mathcal{V}, \mathcal{E})$ with </w:t>
+            </w:r>
+            <w:r>
+              <w:rPr>
+                <w:rFonts w:ascii="Calibri" w:hAnsi="Calibri"/>
+                <w:color w:val="B41E1E"/>
+                <w:sz w:val="18"/>
+              </w:rPr>
+              <w:t>contains</w:t>
+            </w:r>
+            <w:r>
+              <w:rPr>
+                <w:rFonts w:ascii="Calibri" w:hAnsi="Calibri"/>
+                <w:sz w:val="18"/>
+              </w:rPr>
+              <w:t xml:space="preserve">, </w:t>
+            </w:r>
+            <w:r>
+              <w:rPr>
+                <w:rFonts w:ascii="Calibri" w:hAnsi="Calibri"/>
+                <w:color w:val="B41E1E"/>
+                <w:sz w:val="18"/>
+              </w:rPr>
+              <w:t>adjacent</w:t>
+            </w:r>
+            <w:r>
+              <w:rPr>
+                <w:rFonts w:ascii="Calibri" w:hAnsi="Calibri"/>
+                <w:sz w:val="18"/>
+              </w:rPr>
+              <w:t>, $\Delta\mathbf{c}_{ij}$</w:t>
+            </w:r>
+          </w:p>
+        </w:tc>
+      </w:tr>
+      <w:tr>
+        <w:tc>
+          <w:tcPr>
+            <w:tcW w:type="dxa" w:w="2340"/>
+            <w:shd w:fill="F9FAFB"/>
+            <w:tcMar>
+              <w:top w:w="90" w:type="dxa"/>
+              <w:bottom w:w="90" w:type="dxa"/>
+              <w:left w:w="130" w:type="dxa"/>
+              <w:right w:w="130" w:type="dxa"/>
+            </w:tcMar>
+          </w:tcPr>
+          <w:p>
+            <w:pPr>
+              <w:spacing w:after="0"/>
+            </w:pPr>
+            <w:r>
+              <w:rPr>
+                <w:rFonts w:ascii="Calibri" w:hAnsi="Calibri"/>
+                <w:b/>
+                <w:sz w:val="18"/>
+              </w:rPr>
+              <w:t>Stage 3 · Pruning</w:t>
+            </w:r>
+          </w:p>
+        </w:tc>
+        <w:tc>
+          <w:tcPr>
+            <w:tcW w:type="dxa" w:w="2340"/>
+            <w:shd w:fill="F9FAFB"/>
+            <w:tcMar>
+              <w:top w:w="90" w:type="dxa"/>
+              <w:bottom w:w="90" w:type="dxa"/>
+              <w:left w:w="130" w:type="dxa"/>
+              <w:right w:w="130" w:type="dxa"/>
+            </w:tcMar>
+          </w:tcPr>
+          <w:p>
+            <w:pPr>
+              <w:spacing w:after="0"/>
+            </w:pPr>
+            <w:r>
+              <w:rPr>
+                <w:rFonts w:ascii="Calibri" w:hAnsi="Calibri"/>
+                <w:color w:val="B41E1E"/>
+                <w:sz w:val="18"/>
+              </w:rPr>
+              <w:t>prune_dsl</w:t>
+            </w:r>
+          </w:p>
+        </w:tc>
+        <w:tc>
+          <w:tcPr>
+            <w:tcW w:type="dxa" w:w="2340"/>
+            <w:shd w:fill="F9FAFB"/>
+            <w:tcMar>
+              <w:top w:w="90" w:type="dxa"/>
+              <w:bottom w:w="90" w:type="dxa"/>
+              <w:left w:w="130" w:type="dxa"/>
+              <w:right w:w="130" w:type="dxa"/>
+            </w:tcMar>
+          </w:tcPr>
+          <w:p>
+            <w:pPr>
+              <w:spacing w:after="0"/>
+            </w:pPr>
+            <w:r>
+              <w:rPr>
+                <w:rFonts w:ascii="Calibri" w:hAnsi="Calibri"/>
+                <w:sz w:val="18"/>
+              </w:rPr>
+              <w:t>Pairwise training deltas (shape preservation, scale factor, transpositions, active colors)</w:t>
+            </w:r>
+          </w:p>
+        </w:tc>
+        <w:tc>
+          <w:tcPr>
+            <w:tcW w:type="dxa" w:w="2340"/>
+            <w:shd w:fill="F9FAFB"/>
+            <w:tcMar>
+              <w:top w:w="90" w:type="dxa"/>
+              <w:bottom w:w="90" w:type="dxa"/>
+              <w:left w:w="130" w:type="dxa"/>
+              <w:right w:w="130" w:type="dxa"/>
+            </w:tcMar>
+          </w:tcPr>
+          <w:p>
+            <w:pPr>
+              <w:spacing w:after="0"/>
+            </w:pPr>
+            <w:r>
+              <w:rPr>
+                <w:rFonts w:ascii="Calibri" w:hAnsi="Calibri"/>
+                <w:sz w:val="18"/>
+              </w:rPr>
+              <w:t>Filtered Sub-DSL $\mathcal{D}^* \subset \mathcal{D}$ (3 to 15 active primitives)</w:t>
+            </w:r>
+          </w:p>
+        </w:tc>
+      </w:tr>
+      <w:tr>
+        <w:tc>
+          <w:tcPr>
+            <w:tcW w:type="dxa" w:w="2340"/>
+            <w:shd w:fill="FFFFFF"/>
+            <w:tcMar>
+              <w:top w:w="90" w:type="dxa"/>
+              <w:bottom w:w="90" w:type="dxa"/>
+              <w:left w:w="130" w:type="dxa"/>
+              <w:right w:w="130" w:type="dxa"/>
+            </w:tcMar>
+          </w:tcPr>
+          <w:p>
+            <w:pPr>
+              <w:spacing w:after="0"/>
+            </w:pPr>
+            <w:r>
+              <w:rPr>
+                <w:rFonts w:ascii="Calibri" w:hAnsi="Calibri"/>
+                <w:b/>
+                <w:sz w:val="18"/>
+              </w:rPr>
+              <w:t>Stage 4 · Synthesis</w:t>
+            </w:r>
+          </w:p>
+        </w:tc>
+        <w:tc>
+          <w:tcPr>
+            <w:tcW w:type="dxa" w:w="2340"/>
+            <w:shd w:fill="FFFFFF"/>
+            <w:tcMar>
+              <w:top w:w="90" w:type="dxa"/>
+              <w:bottom w:w="90" w:type="dxa"/>
+              <w:left w:w="130" w:type="dxa"/>
+              <w:right w:w="130" w:type="dxa"/>
+            </w:tcMar>
+          </w:tcPr>
+          <w:p>
+            <w:pPr>
+              <w:spacing w:after="0"/>
+            </w:pPr>
+            <w:r>
+              <w:rPr>
+                <w:rFonts w:ascii="Calibri" w:hAnsi="Calibri"/>
+                <w:color w:val="B41E1E"/>
+                <w:sz w:val="18"/>
+              </w:rPr>
+              <w:t>ARCSymbolicEngine</w:t>
+            </w:r>
+          </w:p>
+        </w:tc>
+        <w:tc>
+          <w:tcPr>
+            <w:tcW w:type="dxa" w:w="2340"/>
+            <w:shd w:fill="FFFFFF"/>
+            <w:tcMar>
+              <w:top w:w="90" w:type="dxa"/>
+              <w:bottom w:w="90" w:type="dxa"/>
+              <w:left w:w="130" w:type="dxa"/>
+              <w:right w:w="130" w:type="dxa"/>
+            </w:tcMar>
+          </w:tcPr>
+          <w:p>
+            <w:pPr>
+              <w:spacing w:after="0"/>
+            </w:pPr>
+            <w:r>
+              <w:rPr>
+                <w:rFonts w:ascii="Calibri" w:hAnsi="Calibri"/>
+                <w:sz w:val="18"/>
+              </w:rPr>
+              <w:t>Shortest-first enumerative search (depth 1–2); verification loss $\sum \</w:t>
+            </w:r>
+          </w:p>
+        </w:tc>
+        <w:tc>
+          <w:tcPr>
+            <w:tcW w:type="dxa" w:w="2340"/>
+            <w:shd w:fill="FFFFFF"/>
+            <w:tcMar>
+              <w:top w:w="90" w:type="dxa"/>
+              <w:bottom w:w="90" w:type="dxa"/>
+              <w:left w:w="130" w:type="dxa"/>
+              <w:right w:w="130" w:type="dxa"/>
+            </w:tcMar>
+          </w:tcPr>
+          <w:p>
+            <w:pPr>
+              <w:spacing w:after="0"/>
+            </w:pPr>
+            <w:r>
+              <w:rPr>
+                <w:rFonts w:ascii="Calibri" w:hAnsi="Calibri"/>
+                <w:sz w:val="18"/>
+              </w:rPr>
+              <w:t>P(I_k) - O_k\</w:t>
+            </w:r>
+          </w:p>
+        </w:tc>
+      </w:tr>
+      <w:tr>
+        <w:tc>
+          <w:tcPr>
+            <w:tcW w:type="dxa" w:w="2340"/>
+            <w:shd w:fill="F9FAFB"/>
+            <w:tcMar>
+              <w:top w:w="90" w:type="dxa"/>
+              <w:bottom w:w="90" w:type="dxa"/>
+              <w:left w:w="130" w:type="dxa"/>
+              <w:right w:w="130" w:type="dxa"/>
+            </w:tcMar>
+          </w:tcPr>
+          <w:p>
+            <w:pPr>
+              <w:spacing w:after="0"/>
+            </w:pPr>
+            <w:r>
+              <w:rPr>
+                <w:rFonts w:ascii="Calibri" w:hAnsi="Calibri"/>
+                <w:b/>
+                <w:sz w:val="18"/>
+              </w:rPr>
+              <w:t>Stage 5 · Inference</w:t>
+            </w:r>
+          </w:p>
+        </w:tc>
+        <w:tc>
+          <w:tcPr>
+            <w:tcW w:type="dxa" w:w="2340"/>
+            <w:shd w:fill="F9FAFB"/>
+            <w:tcMar>
+              <w:top w:w="90" w:type="dxa"/>
+              <w:bottom w:w="90" w:type="dxa"/>
+              <w:left w:w="130" w:type="dxa"/>
+              <w:right w:w="130" w:type="dxa"/>
+            </w:tcMar>
+          </w:tcPr>
+          <w:p>
+            <w:pPr>
+              <w:spacing w:after="0"/>
+            </w:pPr>
+            <w:r>
+              <w:rPr>
+                <w:rFonts w:ascii="Calibri" w:hAnsi="Calibri"/>
+                <w:sz w:val="18"/>
+              </w:rPr>
+              <w:t>Submission Generator</w:t>
+            </w:r>
+          </w:p>
+        </w:tc>
+        <w:tc>
+          <w:tcPr>
+            <w:tcW w:type="dxa" w:w="2340"/>
+            <w:shd w:fill="F9FAFB"/>
+            <w:tcMar>
+              <w:top w:w="90" w:type="dxa"/>
+              <w:bottom w:w="90" w:type="dxa"/>
+              <w:left w:w="130" w:type="dxa"/>
+              <w:right w:w="130" w:type="dxa"/>
+            </w:tcMar>
+          </w:tcPr>
+          <w:p>
+            <w:pPr>
+              <w:spacing w:after="0"/>
+            </w:pPr>
+            <w:r>
+              <w:rPr>
+                <w:rFonts w:ascii="Calibri" w:hAnsi="Calibri"/>
+                <w:sz w:val="18"/>
+              </w:rPr>
+              <w:t xml:space="preserve">Apply $P^*(I_{\text{test}})$; compile </w:t>
+            </w:r>
+            <w:r>
+              <w:rPr>
+                <w:rFonts w:ascii="Calibri" w:hAnsi="Calibri"/>
+                <w:color w:val="B41E1E"/>
+                <w:sz w:val="18"/>
+              </w:rPr>
+              <w:t>attempt_1</w:t>
+            </w:r>
+            <w:r>
+              <w:rPr>
+                <w:rFonts w:ascii="Calibri" w:hAnsi="Calibri"/>
+                <w:sz w:val="18"/>
+              </w:rPr>
+              <w:t xml:space="preserve"> &amp; </w:t>
+            </w:r>
+            <w:r>
+              <w:rPr>
+                <w:rFonts w:ascii="Calibri" w:hAnsi="Calibri"/>
+                <w:color w:val="B41E1E"/>
+                <w:sz w:val="18"/>
+              </w:rPr>
+              <w:t>attempt_2</w:t>
+            </w:r>
+            <w:r>
+              <w:rPr>
+                <w:rFonts w:ascii="Calibri" w:hAnsi="Calibri"/>
+                <w:sz w:val="18"/>
+              </w:rPr>
+              <w:t xml:space="preserve"> into </w:t>
+            </w:r>
+            <w:r>
+              <w:rPr>
+                <w:rFonts w:ascii="Calibri" w:hAnsi="Calibri"/>
+                <w:color w:val="B41E1E"/>
+                <w:sz w:val="18"/>
+              </w:rPr>
+              <w:t>/kaggle/working/submission.json</w:t>
+            </w:r>
+          </w:p>
+        </w:tc>
+        <w:tc>
+          <w:tcPr>
+            <w:tcW w:type="dxa" w:w="2340"/>
+            <w:shd w:fill="F9FAFB"/>
+            <w:tcMar>
+              <w:top w:w="90" w:type="dxa"/>
+              <w:bottom w:w="90" w:type="dxa"/>
+              <w:left w:w="130" w:type="dxa"/>
+              <w:right w:w="130" w:type="dxa"/>
+            </w:tcMar>
+          </w:tcPr>
+          <w:p>
+            <w:pPr>
+              <w:spacing w:after="0"/>
+            </w:pPr>
+            <w:r>
+              <w:rPr>
+                <w:rFonts w:ascii="Calibri" w:hAnsi="Calibri"/>
+                <w:sz w:val="18"/>
+              </w:rPr>
+              <w:t>Scored Kaggle ARC-AGI-2 Submission</w:t>
             </w:r>
           </w:p>
         </w:tc>
@@ -516,7 +1197,7 @@
     </w:tbl>
     <w:p>
       <w:pPr>
-        <w:spacing w:after="80"/>
+        <w:spacing w:after="120"/>
       </w:pPr>
     </w:p>
     <w:p>
@@ -765,8 +1446,8 @@
             <w:tcMar>
               <w:top w:w="120" w:type="dxa"/>
               <w:bottom w:w="120" w:type="dxa"/>
-              <w:left w:w="140" w:type="dxa"/>
-              <w:right w:w="140" w:type="dxa"/>
+              <w:left w:w="130" w:type="dxa"/>
+              <w:right w:w="130" w:type="dxa"/>
             </w:tcMar>
           </w:tcPr>
           <w:p>
@@ -791,8 +1472,8 @@
             <w:tcMar>
               <w:top w:w="120" w:type="dxa"/>
               <w:bottom w:w="120" w:type="dxa"/>
-              <w:left w:w="140" w:type="dxa"/>
-              <w:right w:w="140" w:type="dxa"/>
+              <w:left w:w="130" w:type="dxa"/>
+              <w:right w:w="130" w:type="dxa"/>
             </w:tcMar>
           </w:tcPr>
           <w:p>
@@ -817,8 +1498,8 @@
             <w:tcMar>
               <w:top w:w="120" w:type="dxa"/>
               <w:bottom w:w="120" w:type="dxa"/>
-              <w:left w:w="140" w:type="dxa"/>
-              <w:right w:w="140" w:type="dxa"/>
+              <w:left w:w="130" w:type="dxa"/>
+              <w:right w:w="130" w:type="dxa"/>
             </w:tcMar>
           </w:tcPr>
           <w:p>
@@ -843,10 +1524,10 @@
             <w:tcW w:type="dxa" w:w="3120"/>
             <w:shd w:fill="FFFFFF"/>
             <w:tcMar>
-              <w:top w:w="100" w:type="dxa"/>
-              <w:bottom w:w="100" w:type="dxa"/>
-              <w:left w:w="140" w:type="dxa"/>
-              <w:right w:w="140" w:type="dxa"/>
+              <w:top w:w="90" w:type="dxa"/>
+              <w:bottom w:w="90" w:type="dxa"/>
+              <w:left w:w="130" w:type="dxa"/>
+              <w:right w:w="130" w:type="dxa"/>
             </w:tcMar>
           </w:tcPr>
           <w:p>
@@ -856,10 +1537,10 @@
             <w:r>
               <w:rPr>
                 <w:rFonts w:ascii="Calibri" w:hAnsi="Calibri"/>
-                <w:color w:val="212529"/>
-                <w:sz w:val="19"/>
+                <w:b/>
+                <w:sz w:val="18"/>
               </w:rPr>
-              <w:t>**Affine (Dihedral Group $\mathcal{D}_4$)**</w:t>
+              <w:t>Affine (Dihedral Group $\mathcal{D}_4$)</w:t>
             </w:r>
           </w:p>
         </w:tc>
@@ -868,10 +1549,10 @@
             <w:tcW w:type="dxa" w:w="3120"/>
             <w:shd w:fill="FFFFFF"/>
             <w:tcMar>
-              <w:top w:w="100" w:type="dxa"/>
-              <w:bottom w:w="100" w:type="dxa"/>
-              <w:left w:w="140" w:type="dxa"/>
-              <w:right w:w="140" w:type="dxa"/>
+              <w:top w:w="90" w:type="dxa"/>
+              <w:bottom w:w="90" w:type="dxa"/>
+              <w:left w:w="130" w:type="dxa"/>
+              <w:right w:w="130" w:type="dxa"/>
             </w:tcMar>
           </w:tcPr>
           <w:p>
@@ -881,10 +1562,85 @@
             <w:r>
               <w:rPr>
                 <w:rFonts w:ascii="Calibri" w:hAnsi="Calibri"/>
-                <w:color w:val="212529"/>
-                <w:sz w:val="19"/>
+                <w:color w:val="B41E1E"/>
+                <w:sz w:val="18"/>
               </w:rPr>
-              <w:t>`rot90`, `rot180`, `rot270`, `flip_h`, `flip_v`, `transpose`</w:t>
+              <w:t>rot90</w:t>
+            </w:r>
+            <w:r>
+              <w:rPr>
+                <w:rFonts w:ascii="Calibri" w:hAnsi="Calibri"/>
+                <w:sz w:val="18"/>
+              </w:rPr>
+              <w:t xml:space="preserve">, </w:t>
+            </w:r>
+            <w:r>
+              <w:rPr>
+                <w:rFonts w:ascii="Calibri" w:hAnsi="Calibri"/>
+                <w:color w:val="B41E1E"/>
+                <w:sz w:val="18"/>
+              </w:rPr>
+              <w:t>rot180</w:t>
+            </w:r>
+            <w:r>
+              <w:rPr>
+                <w:rFonts w:ascii="Calibri" w:hAnsi="Calibri"/>
+                <w:sz w:val="18"/>
+              </w:rPr>
+              <w:t xml:space="preserve">, </w:t>
+            </w:r>
+            <w:r>
+              <w:rPr>
+                <w:rFonts w:ascii="Calibri" w:hAnsi="Calibri"/>
+                <w:color w:val="B41E1E"/>
+                <w:sz w:val="18"/>
+              </w:rPr>
+              <w:t>rot270</w:t>
+            </w:r>
+            <w:r>
+              <w:rPr>
+                <w:rFonts w:ascii="Calibri" w:hAnsi="Calibri"/>
+                <w:sz w:val="18"/>
+              </w:rPr>
+              <w:t xml:space="preserve">, </w:t>
+            </w:r>
+            <w:r>
+              <w:rPr>
+                <w:rFonts w:ascii="Calibri" w:hAnsi="Calibri"/>
+                <w:color w:val="B41E1E"/>
+                <w:sz w:val="18"/>
+              </w:rPr>
+              <w:t>flip_h</w:t>
+            </w:r>
+            <w:r>
+              <w:rPr>
+                <w:rFonts w:ascii="Calibri" w:hAnsi="Calibri"/>
+                <w:sz w:val="18"/>
+              </w:rPr>
+              <w:t xml:space="preserve">, </w:t>
+            </w:r>
+            <w:r>
+              <w:rPr>
+                <w:rFonts w:ascii="Calibri" w:hAnsi="Calibri"/>
+                <w:color w:val="B41E1E"/>
+                <w:sz w:val="18"/>
+              </w:rPr>
+              <w:t>flip_v</w:t>
+            </w:r>
+            <w:r>
+              <w:rPr>
+                <w:rFonts w:ascii="Calibri" w:hAnsi="Calibri"/>
+                <w:sz w:val="18"/>
+              </w:rPr>
+              <w:t xml:space="preserve">, </w:t>
+            </w:r>
+            <w:r>
+              <w:rPr>
+                <w:rFonts w:ascii="Calibri" w:hAnsi="Calibri"/>
+                <w:color w:val="B41E1E"/>
+                <w:sz w:val="18"/>
+              </w:rPr>
+              <w:t>transpose</w:t>
             </w:r>
           </w:p>
         </w:tc>
@@ -893,10 +1649,10 @@
             <w:tcW w:type="dxa" w:w="3120"/>
             <w:shd w:fill="FFFFFF"/>
             <w:tcMar>
-              <w:top w:w="100" w:type="dxa"/>
-              <w:bottom w:w="100" w:type="dxa"/>
-              <w:left w:w="140" w:type="dxa"/>
-              <w:right w:w="140" w:type="dxa"/>
+              <w:top w:w="90" w:type="dxa"/>
+              <w:bottom w:w="90" w:type="dxa"/>
+              <w:left w:w="130" w:type="dxa"/>
+              <w:right w:w="130" w:type="dxa"/>
             </w:tcMar>
           </w:tcPr>
           <w:p>
@@ -906,8 +1662,7 @@
             <w:r>
               <w:rPr>
                 <w:rFonts w:ascii="Calibri" w:hAnsi="Calibri"/>
-                <w:color w:val="212529"/>
-                <w:sz w:val="19"/>
+                <w:sz w:val="18"/>
               </w:rPr>
               <w:t>6</w:t>
             </w:r>
@@ -920,10 +1675,10 @@
             <w:tcW w:type="dxa" w:w="3120"/>
             <w:shd w:fill="F9FAFB"/>
             <w:tcMar>
-              <w:top w:w="100" w:type="dxa"/>
-              <w:bottom w:w="100" w:type="dxa"/>
-              <w:left w:w="140" w:type="dxa"/>
-              <w:right w:w="140" w:type="dxa"/>
+              <w:top w:w="90" w:type="dxa"/>
+              <w:bottom w:w="90" w:type="dxa"/>
+              <w:left w:w="130" w:type="dxa"/>
+              <w:right w:w="130" w:type="dxa"/>
             </w:tcMar>
           </w:tcPr>
           <w:p>
@@ -933,10 +1688,10 @@
             <w:r>
               <w:rPr>
                 <w:rFonts w:ascii="Calibri" w:hAnsi="Calibri"/>
-                <w:color w:val="212529"/>
-                <w:sz w:val="19"/>
+                <w:b/>
+                <w:sz w:val="18"/>
               </w:rPr>
-              <w:t>**Topological**</w:t>
+              <w:t>Topological</w:t>
             </w:r>
           </w:p>
         </w:tc>
@@ -945,10 +1700,10 @@
             <w:tcW w:type="dxa" w:w="3120"/>
             <w:shd w:fill="F9FAFB"/>
             <w:tcMar>
-              <w:top w:w="100" w:type="dxa"/>
-              <w:bottom w:w="100" w:type="dxa"/>
-              <w:left w:w="140" w:type="dxa"/>
-              <w:right w:w="140" w:type="dxa"/>
+              <w:top w:w="90" w:type="dxa"/>
+              <w:bottom w:w="90" w:type="dxa"/>
+              <w:left w:w="130" w:type="dxa"/>
+              <w:right w:w="130" w:type="dxa"/>
             </w:tcMar>
           </w:tcPr>
           <w:p>
@@ -958,10 +1713,17 @@
             <w:r>
               <w:rPr>
                 <w:rFonts w:ascii="Calibri" w:hAnsi="Calibri"/>
-                <w:color w:val="212529"/>
-                <w:sz w:val="19"/>
+                <w:color w:val="B41E1E"/>
+                <w:sz w:val="18"/>
               </w:rPr>
-              <w:t>`fill_holes(c)`: flood-fills enclosed cavities with color $c \in \{1..9\}$</w:t>
+              <w:t>fill_holes(c)</w:t>
+            </w:r>
+            <w:r>
+              <w:rPr>
+                <w:rFonts w:ascii="Calibri" w:hAnsi="Calibri"/>
+                <w:sz w:val="18"/>
+              </w:rPr>
+              <w:t>: flood-fills enclosed cavities with color $c \in \{1..9\}$</w:t>
             </w:r>
           </w:p>
         </w:tc>
@@ -970,10 +1732,10 @@
             <w:tcW w:type="dxa" w:w="3120"/>
             <w:shd w:fill="F9FAFB"/>
             <w:tcMar>
-              <w:top w:w="100" w:type="dxa"/>
-              <w:bottom w:w="100" w:type="dxa"/>
-              <w:left w:w="140" w:type="dxa"/>
-              <w:right w:w="140" w:type="dxa"/>
+              <w:top w:w="90" w:type="dxa"/>
+              <w:bottom w:w="90" w:type="dxa"/>
+              <w:left w:w="130" w:type="dxa"/>
+              <w:right w:w="130" w:type="dxa"/>
             </w:tcMar>
           </w:tcPr>
           <w:p>
@@ -983,8 +1745,7 @@
             <w:r>
               <w:rPr>
                 <w:rFonts w:ascii="Calibri" w:hAnsi="Calibri"/>
-                <w:color w:val="212529"/>
-                <w:sz w:val="19"/>
+                <w:sz w:val="18"/>
               </w:rPr>
               <w:t>9</w:t>
             </w:r>
@@ -997,10 +1758,10 @@
             <w:tcW w:type="dxa" w:w="3120"/>
             <w:shd w:fill="FFFFFF"/>
             <w:tcMar>
-              <w:top w:w="100" w:type="dxa"/>
-              <w:bottom w:w="100" w:type="dxa"/>
-              <w:left w:w="140" w:type="dxa"/>
-              <w:right w:w="140" w:type="dxa"/>
+              <w:top w:w="90" w:type="dxa"/>
+              <w:bottom w:w="90" w:type="dxa"/>
+              <w:left w:w="130" w:type="dxa"/>
+              <w:right w:w="130" w:type="dxa"/>
             </w:tcMar>
           </w:tcPr>
           <w:p>
@@ -1010,10 +1771,10 @@
             <w:r>
               <w:rPr>
                 <w:rFonts w:ascii="Calibri" w:hAnsi="Calibri"/>
-                <w:color w:val="212529"/>
-                <w:sz w:val="19"/>
+                <w:b/>
+                <w:sz w:val="18"/>
               </w:rPr>
-              <w:t>**Palette / Colorimetric**</w:t>
+              <w:t>Palette / Colorimetric</w:t>
             </w:r>
           </w:p>
         </w:tc>
@@ -1022,10 +1783,10 @@
             <w:tcW w:type="dxa" w:w="3120"/>
             <w:shd w:fill="FFFFFF"/>
             <w:tcMar>
-              <w:top w:w="100" w:type="dxa"/>
-              <w:bottom w:w="100" w:type="dxa"/>
-              <w:left w:w="140" w:type="dxa"/>
-              <w:right w:w="140" w:type="dxa"/>
+              <w:top w:w="90" w:type="dxa"/>
+              <w:bottom w:w="90" w:type="dxa"/>
+              <w:left w:w="130" w:type="dxa"/>
+              <w:right w:w="130" w:type="dxa"/>
             </w:tcMar>
           </w:tcPr>
           <w:p>
@@ -1035,10 +1796,17 @@
             <w:r>
               <w:rPr>
                 <w:rFonts w:ascii="Calibri" w:hAnsi="Calibri"/>
-                <w:color w:val="212529"/>
-                <w:sz w:val="19"/>
+                <w:color w:val="B41E1E"/>
+                <w:sz w:val="18"/>
               </w:rPr>
-              <w:t>`recolor_all(c)`: recolors all foreground cells to color $c \in \{1..9\}$</w:t>
+              <w:t>recolor_all(c)</w:t>
+            </w:r>
+            <w:r>
+              <w:rPr>
+                <w:rFonts w:ascii="Calibri" w:hAnsi="Calibri"/>
+                <w:sz w:val="18"/>
+              </w:rPr>
+              <w:t>: recolors all foreground cells to color $c \in \{1..9\}$</w:t>
             </w:r>
           </w:p>
         </w:tc>
@@ -1047,10 +1815,10 @@
             <w:tcW w:type="dxa" w:w="3120"/>
             <w:shd w:fill="FFFFFF"/>
             <w:tcMar>
-              <w:top w:w="100" w:type="dxa"/>
-              <w:bottom w:w="100" w:type="dxa"/>
-              <w:left w:w="140" w:type="dxa"/>
-              <w:right w:w="140" w:type="dxa"/>
+              <w:top w:w="90" w:type="dxa"/>
+              <w:bottom w:w="90" w:type="dxa"/>
+              <w:left w:w="130" w:type="dxa"/>
+              <w:right w:w="130" w:type="dxa"/>
             </w:tcMar>
           </w:tcPr>
           <w:p>
@@ -1060,8 +1828,7 @@
             <w:r>
               <w:rPr>
                 <w:rFonts w:ascii="Calibri" w:hAnsi="Calibri"/>
-                <w:color w:val="212529"/>
-                <w:sz w:val="19"/>
+                <w:sz w:val="18"/>
               </w:rPr>
               <w:t>9</w:t>
             </w:r>
@@ -1074,10 +1841,10 @@
             <w:tcW w:type="dxa" w:w="3120"/>
             <w:shd w:fill="F9FAFB"/>
             <w:tcMar>
-              <w:top w:w="100" w:type="dxa"/>
-              <w:bottom w:w="100" w:type="dxa"/>
-              <w:left w:w="140" w:type="dxa"/>
-              <w:right w:w="140" w:type="dxa"/>
+              <w:top w:w="90" w:type="dxa"/>
+              <w:bottom w:w="90" w:type="dxa"/>
+              <w:left w:w="130" w:type="dxa"/>
+              <w:right w:w="130" w:type="dxa"/>
             </w:tcMar>
           </w:tcPr>
           <w:p>
@@ -1087,10 +1854,10 @@
             <w:r>
               <w:rPr>
                 <w:rFonts w:ascii="Calibri" w:hAnsi="Calibri"/>
-                <w:color w:val="212529"/>
-                <w:sz w:val="19"/>
+                <w:b/>
+                <w:sz w:val="18"/>
               </w:rPr>
-              <w:t>**Geometric (Translation)**</w:t>
+              <w:t>Geometric (Translation)</w:t>
             </w:r>
           </w:p>
         </w:tc>
@@ -1099,10 +1866,10 @@
             <w:tcW w:type="dxa" w:w="3120"/>
             <w:shd w:fill="F9FAFB"/>
             <w:tcMar>
-              <w:top w:w="100" w:type="dxa"/>
-              <w:bottom w:w="100" w:type="dxa"/>
-              <w:left w:w="140" w:type="dxa"/>
-              <w:right w:w="140" w:type="dxa"/>
+              <w:top w:w="90" w:type="dxa"/>
+              <w:bottom w:w="90" w:type="dxa"/>
+              <w:left w:w="130" w:type="dxa"/>
+              <w:right w:w="130" w:type="dxa"/>
             </w:tcMar>
           </w:tcPr>
           <w:p>
@@ -1112,10 +1879,17 @@
             <w:r>
               <w:rPr>
                 <w:rFonts w:ascii="Calibri" w:hAnsi="Calibri"/>
-                <w:color w:val="212529"/>
-                <w:sz w:val="19"/>
+                <w:color w:val="B41E1E"/>
+                <w:sz w:val="18"/>
               </w:rPr>
-              <w:t>`translate(dx, dy)` for $dx, dy \in \{-3..3\} \setminus \{(0,0)\}$</w:t>
+              <w:t>translate(dx, dy)</w:t>
+            </w:r>
+            <w:r>
+              <w:rPr>
+                <w:rFonts w:ascii="Calibri" w:hAnsi="Calibri"/>
+                <w:sz w:val="18"/>
+              </w:rPr>
+              <w:t xml:space="preserve"> for $dx, dy \in \{-3..3\} \setminus \{(0,0)\}$</w:t>
             </w:r>
           </w:p>
         </w:tc>
@@ -1124,10 +1898,10 @@
             <w:tcW w:type="dxa" w:w="3120"/>
             <w:shd w:fill="F9FAFB"/>
             <w:tcMar>
-              <w:top w:w="100" w:type="dxa"/>
-              <w:bottom w:w="100" w:type="dxa"/>
-              <w:left w:w="140" w:type="dxa"/>
-              <w:right w:w="140" w:type="dxa"/>
+              <w:top w:w="90" w:type="dxa"/>
+              <w:bottom w:w="90" w:type="dxa"/>
+              <w:left w:w="130" w:type="dxa"/>
+              <w:right w:w="130" w:type="dxa"/>
             </w:tcMar>
           </w:tcPr>
           <w:p>
@@ -1137,8 +1911,7 @@
             <w:r>
               <w:rPr>
                 <w:rFonts w:ascii="Calibri" w:hAnsi="Calibri"/>
-                <w:color w:val="212529"/>
-                <w:sz w:val="19"/>
+                <w:sz w:val="18"/>
               </w:rPr>
               <w:t>48</w:t>
             </w:r>
@@ -1151,10 +1924,10 @@
             <w:tcW w:type="dxa" w:w="3120"/>
             <w:shd w:fill="FFFFFF"/>
             <w:tcMar>
-              <w:top w:w="100" w:type="dxa"/>
-              <w:bottom w:w="100" w:type="dxa"/>
-              <w:left w:w="140" w:type="dxa"/>
-              <w:right w:w="140" w:type="dxa"/>
+              <w:top w:w="90" w:type="dxa"/>
+              <w:bottom w:w="90" w:type="dxa"/>
+              <w:left w:w="130" w:type="dxa"/>
+              <w:right w:w="130" w:type="dxa"/>
             </w:tcMar>
           </w:tcPr>
           <w:p>
@@ -1164,10 +1937,10 @@
             <w:r>
               <w:rPr>
                 <w:rFonts w:ascii="Calibri" w:hAnsi="Calibri"/>
-                <w:color w:val="212529"/>
-                <w:sz w:val="19"/>
+                <w:b/>
+                <w:sz w:val="18"/>
               </w:rPr>
-              <w:t>**Structural / Fractal**</w:t>
+              <w:t>Structural / Fractal</w:t>
             </w:r>
           </w:p>
         </w:tc>
@@ -1176,10 +1949,10 @@
             <w:tcW w:type="dxa" w:w="3120"/>
             <w:shd w:fill="FFFFFF"/>
             <w:tcMar>
-              <w:top w:w="100" w:type="dxa"/>
-              <w:bottom w:w="100" w:type="dxa"/>
-              <w:left w:w="140" w:type="dxa"/>
-              <w:right w:w="140" w:type="dxa"/>
+              <w:top w:w="90" w:type="dxa"/>
+              <w:bottom w:w="90" w:type="dxa"/>
+              <w:left w:w="130" w:type="dxa"/>
+              <w:right w:w="130" w:type="dxa"/>
             </w:tcMar>
           </w:tcPr>
           <w:p>
@@ -1189,10 +1962,32 @@
             <w:r>
               <w:rPr>
                 <w:rFonts w:ascii="Calibri" w:hAnsi="Calibri"/>
-                <w:color w:val="212529"/>
-                <w:sz w:val="19"/>
+                <w:color w:val="B41E1E"/>
+                <w:sz w:val="18"/>
               </w:rPr>
-              <w:t>`fractal_self_tile` (Kronecker self-tiling), `upscale(k)` for $k \in \{2, 3\}$</w:t>
+              <w:t>fractal_self_tile</w:t>
+            </w:r>
+            <w:r>
+              <w:rPr>
+                <w:rFonts w:ascii="Calibri" w:hAnsi="Calibri"/>
+                <w:sz w:val="18"/>
+              </w:rPr>
+              <w:t xml:space="preserve"> (Kronecker self-tiling), </w:t>
+            </w:r>
+            <w:r>
+              <w:rPr>
+                <w:rFonts w:ascii="Calibri" w:hAnsi="Calibri"/>
+                <w:color w:val="B41E1E"/>
+                <w:sz w:val="18"/>
+              </w:rPr>
+              <w:t>upscale(k)</w:t>
+            </w:r>
+            <w:r>
+              <w:rPr>
+                <w:rFonts w:ascii="Calibri" w:hAnsi="Calibri"/>
+                <w:sz w:val="18"/>
+              </w:rPr>
+              <w:t xml:space="preserve"> for $k \in \{2, 3\}$</w:t>
             </w:r>
           </w:p>
         </w:tc>
@@ -1201,10 +1996,10 @@
             <w:tcW w:type="dxa" w:w="3120"/>
             <w:shd w:fill="FFFFFF"/>
             <w:tcMar>
-              <w:top w:w="100" w:type="dxa"/>
-              <w:bottom w:w="100" w:type="dxa"/>
-              <w:left w:w="140" w:type="dxa"/>
-              <w:right w:w="140" w:type="dxa"/>
+              <w:top w:w="90" w:type="dxa"/>
+              <w:bottom w:w="90" w:type="dxa"/>
+              <w:left w:w="130" w:type="dxa"/>
+              <w:right w:w="130" w:type="dxa"/>
             </w:tcMar>
           </w:tcPr>
           <w:p>
@@ -1214,8 +2009,7 @@
             <w:r>
               <w:rPr>
                 <w:rFonts w:ascii="Calibri" w:hAnsi="Calibri"/>
-                <w:color w:val="212529"/>
-                <w:sz w:val="19"/>
+                <w:sz w:val="18"/>
               </w:rPr>
               <w:t>3</w:t>
             </w:r>
@@ -1228,10 +2022,10 @@
             <w:tcW w:type="dxa" w:w="3120"/>
             <w:shd w:fill="F9FAFB"/>
             <w:tcMar>
-              <w:top w:w="100" w:type="dxa"/>
-              <w:bottom w:w="100" w:type="dxa"/>
-              <w:left w:w="140" w:type="dxa"/>
-              <w:right w:w="140" w:type="dxa"/>
+              <w:top w:w="90" w:type="dxa"/>
+              <w:bottom w:w="90" w:type="dxa"/>
+              <w:left w:w="130" w:type="dxa"/>
+              <w:right w:w="130" w:type="dxa"/>
             </w:tcMar>
           </w:tcPr>
           <w:p>
@@ -1241,10 +2035,10 @@
             <w:r>
               <w:rPr>
                 <w:rFonts w:ascii="Calibri" w:hAnsi="Calibri"/>
-                <w:color w:val="212529"/>
-                <w:sz w:val="19"/>
+                <w:b/>
+                <w:sz w:val="18"/>
               </w:rPr>
-              <w:t>**Identity**</w:t>
+              <w:t>Identity</w:t>
             </w:r>
           </w:p>
         </w:tc>
@@ -1253,10 +2047,10 @@
             <w:tcW w:type="dxa" w:w="3120"/>
             <w:shd w:fill="F9FAFB"/>
             <w:tcMar>
-              <w:top w:w="100" w:type="dxa"/>
-              <w:bottom w:w="100" w:type="dxa"/>
-              <w:left w:w="140" w:type="dxa"/>
-              <w:right w:w="140" w:type="dxa"/>
+              <w:top w:w="90" w:type="dxa"/>
+              <w:bottom w:w="90" w:type="dxa"/>
+              <w:left w:w="130" w:type="dxa"/>
+              <w:right w:w="130" w:type="dxa"/>
             </w:tcMar>
           </w:tcPr>
           <w:p>
@@ -1266,10 +2060,10 @@
             <w:r>
               <w:rPr>
                 <w:rFonts w:ascii="Calibri" w:hAnsi="Calibri"/>
-                <w:color w:val="212529"/>
-                <w:sz w:val="19"/>
+                <w:color w:val="B41E1E"/>
+                <w:sz w:val="18"/>
               </w:rPr>
-              <w:t>`identity`</w:t>
+              <w:t>identity</w:t>
             </w:r>
           </w:p>
         </w:tc>
@@ -1278,10 +2072,10 @@
             <w:tcW w:type="dxa" w:w="3120"/>
             <w:shd w:fill="F9FAFB"/>
             <w:tcMar>
-              <w:top w:w="100" w:type="dxa"/>
-              <w:bottom w:w="100" w:type="dxa"/>
-              <w:left w:w="140" w:type="dxa"/>
-              <w:right w:w="140" w:type="dxa"/>
+              <w:top w:w="90" w:type="dxa"/>
+              <w:bottom w:w="90" w:type="dxa"/>
+              <w:left w:w="130" w:type="dxa"/>
+              <w:right w:w="130" w:type="dxa"/>
             </w:tcMar>
           </w:tcPr>
           <w:p>
@@ -1291,8 +2085,7 @@
             <w:r>
               <w:rPr>
                 <w:rFonts w:ascii="Calibri" w:hAnsi="Calibri"/>
-                <w:color w:val="212529"/>
-                <w:sz w:val="19"/>
+                <w:sz w:val="18"/>
               </w:rPr>
               <w:t>1</w:t>
             </w:r>
@@ -1305,10 +2098,10 @@
             <w:tcW w:type="dxa" w:w="3120"/>
             <w:shd w:fill="FFFFFF"/>
             <w:tcMar>
-              <w:top w:w="100" w:type="dxa"/>
-              <w:bottom w:w="100" w:type="dxa"/>
-              <w:left w:w="140" w:type="dxa"/>
-              <w:right w:w="140" w:type="dxa"/>
+              <w:top w:w="90" w:type="dxa"/>
+              <w:bottom w:w="90" w:type="dxa"/>
+              <w:left w:w="130" w:type="dxa"/>
+              <w:right w:w="130" w:type="dxa"/>
             </w:tcMar>
           </w:tcPr>
           <w:p>
@@ -1318,10 +2111,10 @@
             <w:r>
               <w:rPr>
                 <w:rFonts w:ascii="Calibri" w:hAnsi="Calibri"/>
-                <w:color w:val="212529"/>
-                <w:sz w:val="19"/>
+                <w:b/>
+                <w:sz w:val="18"/>
               </w:rPr>
-              <w:t>**Total**</w:t>
+              <w:t>Total</w:t>
             </w:r>
           </w:p>
         </w:tc>
@@ -1330,10 +2123,27 @@
             <w:tcW w:type="dxa" w:w="3120"/>
             <w:shd w:fill="FFFFFF"/>
             <w:tcMar>
-              <w:top w:w="100" w:type="dxa"/>
-              <w:bottom w:w="100" w:type="dxa"/>
-              <w:left w:w="140" w:type="dxa"/>
-              <w:right w:w="140" w:type="dxa"/>
+              <w:top w:w="90" w:type="dxa"/>
+              <w:bottom w:w="90" w:type="dxa"/>
+              <w:left w:w="130" w:type="dxa"/>
+              <w:right w:w="130" w:type="dxa"/>
+            </w:tcMar>
+          </w:tcPr>
+          <w:p>
+            <w:pPr>
+              <w:spacing w:after="0"/>
+            </w:pPr>
+          </w:p>
+        </w:tc>
+        <w:tc>
+          <w:tcPr>
+            <w:tcW w:type="dxa" w:w="3120"/>
+            <w:shd w:fill="FFFFFF"/>
+            <w:tcMar>
+              <w:top w:w="90" w:type="dxa"/>
+              <w:bottom w:w="90" w:type="dxa"/>
+              <w:left w:w="130" w:type="dxa"/>
+              <w:right w:w="130" w:type="dxa"/>
             </w:tcMar>
           </w:tcPr>
           <w:p>
@@ -1343,34 +2153,10 @@
             <w:r>
               <w:rPr>
                 <w:rFonts w:ascii="Calibri" w:hAnsi="Calibri"/>
-                <w:color w:val="212529"/>
-                <w:sz w:val="19"/>
+                <w:b/>
+                <w:sz w:val="18"/>
               </w:rPr>
-            </w:r>
-          </w:p>
-        </w:tc>
-        <w:tc>
-          <w:tcPr>
-            <w:tcW w:type="dxa" w:w="3120"/>
-            <w:shd w:fill="FFFFFF"/>
-            <w:tcMar>
-              <w:top w:w="100" w:type="dxa"/>
-              <w:bottom w:w="100" w:type="dxa"/>
-              <w:left w:w="140" w:type="dxa"/>
-              <w:right w:w="140" w:type="dxa"/>
-            </w:tcMar>
-          </w:tcPr>
-          <w:p>
-            <w:pPr>
-              <w:spacing w:after="0"/>
-            </w:pPr>
-            <w:r>
-              <w:rPr>
-                <w:rFonts w:ascii="Calibri" w:hAnsi="Calibri"/>
-                <w:color w:val="212529"/>
-                <w:sz w:val="19"/>
-              </w:rPr>
-              <w:t>**75**</w:t>
+              <w:t>75</w:t>
             </w:r>
           </w:p>
         </w:tc>
@@ -1709,8 +2495,8 @@
             <w:tcMar>
               <w:top w:w="120" w:type="dxa"/>
               <w:bottom w:w="120" w:type="dxa"/>
-              <w:left w:w="140" w:type="dxa"/>
-              <w:right w:w="140" w:type="dxa"/>
+              <w:left w:w="130" w:type="dxa"/>
+              <w:right w:w="130" w:type="dxa"/>
             </w:tcMar>
           </w:tcPr>
           <w:p>
@@ -1735,8 +2521,8 @@
             <w:tcMar>
               <w:top w:w="120" w:type="dxa"/>
               <w:bottom w:w="120" w:type="dxa"/>
-              <w:left w:w="140" w:type="dxa"/>
-              <w:right w:w="140" w:type="dxa"/>
+              <w:left w:w="130" w:type="dxa"/>
+              <w:right w:w="130" w:type="dxa"/>
             </w:tcMar>
           </w:tcPr>
           <w:p>
@@ -1761,8 +2547,8 @@
             <w:tcMar>
               <w:top w:w="120" w:type="dxa"/>
               <w:bottom w:w="120" w:type="dxa"/>
-              <w:left w:w="140" w:type="dxa"/>
-              <w:right w:w="140" w:type="dxa"/>
+              <w:left w:w="130" w:type="dxa"/>
+              <w:right w:w="130" w:type="dxa"/>
             </w:tcMar>
           </w:tcPr>
           <w:p>
@@ -1787,8 +2573,8 @@
             <w:tcMar>
               <w:top w:w="120" w:type="dxa"/>
               <w:bottom w:w="120" w:type="dxa"/>
-              <w:left w:w="140" w:type="dxa"/>
-              <w:right w:w="140" w:type="dxa"/>
+              <w:left w:w="130" w:type="dxa"/>
+              <w:right w:w="130" w:type="dxa"/>
             </w:tcMar>
           </w:tcPr>
           <w:p>
@@ -1813,8 +2599,8 @@
             <w:tcMar>
               <w:top w:w="120" w:type="dxa"/>
               <w:bottom w:w="120" w:type="dxa"/>
-              <w:left w:w="140" w:type="dxa"/>
-              <w:right w:w="140" w:type="dxa"/>
+              <w:left w:w="130" w:type="dxa"/>
+              <w:right w:w="130" w:type="dxa"/>
             </w:tcMar>
           </w:tcPr>
           <w:p>
@@ -1839,10 +2625,10 @@
             <w:tcW w:type="dxa" w:w="1872"/>
             <w:shd w:fill="FFFFFF"/>
             <w:tcMar>
-              <w:top w:w="100" w:type="dxa"/>
-              <w:bottom w:w="100" w:type="dxa"/>
-              <w:left w:w="140" w:type="dxa"/>
-              <w:right w:w="140" w:type="dxa"/>
+              <w:top w:w="90" w:type="dxa"/>
+              <w:bottom w:w="90" w:type="dxa"/>
+              <w:left w:w="130" w:type="dxa"/>
+              <w:right w:w="130" w:type="dxa"/>
             </w:tcMar>
           </w:tcPr>
           <w:p>
@@ -1852,10 +2638,10 @@
             <w:r>
               <w:rPr>
                 <w:rFonts w:ascii="Calibri" w:hAnsi="Calibri"/>
-                <w:color w:val="212529"/>
-                <w:sz w:val="19"/>
+                <w:b/>
+                <w:sz w:val="18"/>
               </w:rPr>
-              <w:t>**Official Task `007bbfb7`**</w:t>
+              <w:t>Official Task `007bbfb7`</w:t>
             </w:r>
           </w:p>
         </w:tc>
@@ -1864,10 +2650,10 @@
             <w:tcW w:type="dxa" w:w="1872"/>
             <w:shd w:fill="FFFFFF"/>
             <w:tcMar>
-              <w:top w:w="100" w:type="dxa"/>
-              <w:bottom w:w="100" w:type="dxa"/>
-              <w:left w:w="140" w:type="dxa"/>
-              <w:right w:w="140" w:type="dxa"/>
+              <w:top w:w="90" w:type="dxa"/>
+              <w:bottom w:w="90" w:type="dxa"/>
+              <w:left w:w="130" w:type="dxa"/>
+              <w:right w:w="130" w:type="dxa"/>
             </w:tcMar>
           </w:tcPr>
           <w:p>
@@ -1877,8 +2663,7 @@
             <w:r>
               <w:rPr>
                 <w:rFonts w:ascii="Calibri" w:hAnsi="Calibri"/>
-                <w:color w:val="212529"/>
-                <w:sz w:val="19"/>
+                <w:sz w:val="18"/>
               </w:rPr>
               <w:t>Kronecker fractal self-replication</w:t>
             </w:r>
@@ -1889,10 +2674,10 @@
             <w:tcW w:type="dxa" w:w="1872"/>
             <w:shd w:fill="FFFFFF"/>
             <w:tcMar>
-              <w:top w:w="100" w:type="dxa"/>
-              <w:bottom w:w="100" w:type="dxa"/>
-              <w:left w:w="140" w:type="dxa"/>
-              <w:right w:w="140" w:type="dxa"/>
+              <w:top w:w="90" w:type="dxa"/>
+              <w:bottom w:w="90" w:type="dxa"/>
+              <w:left w:w="130" w:type="dxa"/>
+              <w:right w:w="130" w:type="dxa"/>
             </w:tcMar>
           </w:tcPr>
           <w:p>
@@ -1902,8 +2687,7 @@
             <w:r>
               <w:rPr>
                 <w:rFonts w:ascii="Calibri" w:hAnsi="Calibri"/>
-                <w:color w:val="212529"/>
-                <w:sz w:val="19"/>
+                <w:sz w:val="18"/>
               </w:rPr>
               <w:t>2 candidates</w:t>
             </w:r>
@@ -1914,10 +2698,10 @@
             <w:tcW w:type="dxa" w:w="1872"/>
             <w:shd w:fill="FFFFFF"/>
             <w:tcMar>
-              <w:top w:w="100" w:type="dxa"/>
-              <w:bottom w:w="100" w:type="dxa"/>
-              <w:left w:w="140" w:type="dxa"/>
-              <w:right w:w="140" w:type="dxa"/>
+              <w:top w:w="90" w:type="dxa"/>
+              <w:bottom w:w="90" w:type="dxa"/>
+              <w:left w:w="130" w:type="dxa"/>
+              <w:right w:w="130" w:type="dxa"/>
             </w:tcMar>
           </w:tcPr>
           <w:p>
@@ -1927,10 +2711,10 @@
             <w:r>
               <w:rPr>
                 <w:rFonts w:ascii="Calibri" w:hAnsi="Calibri"/>
-                <w:color w:val="212529"/>
-                <w:sz w:val="19"/>
+                <w:color w:val="B41E1E"/>
+                <w:sz w:val="18"/>
               </w:rPr>
-              <w:t>`fractal_self_tile`</w:t>
+              <w:t>fractal_self_tile</w:t>
             </w:r>
           </w:p>
         </w:tc>
@@ -1939,10 +2723,10 @@
             <w:tcW w:type="dxa" w:w="1872"/>
             <w:shd w:fill="FFFFFF"/>
             <w:tcMar>
-              <w:top w:w="100" w:type="dxa"/>
-              <w:bottom w:w="100" w:type="dxa"/>
-              <w:left w:w="140" w:type="dxa"/>
-              <w:right w:w="140" w:type="dxa"/>
+              <w:top w:w="90" w:type="dxa"/>
+              <w:bottom w:w="90" w:type="dxa"/>
+              <w:left w:w="130" w:type="dxa"/>
+              <w:right w:w="130" w:type="dxa"/>
             </w:tcMar>
           </w:tcPr>
           <w:p>
@@ -1952,10 +2736,10 @@
             <w:r>
               <w:rPr>
                 <w:rFonts w:ascii="Calibri" w:hAnsi="Calibri"/>
-                <w:color w:val="212529"/>
-                <w:sz w:val="19"/>
+                <w:b/>
+                <w:sz w:val="18"/>
               </w:rPr>
-              <w:t>**Exact ($\text{Loss}=0$)**</w:t>
+              <w:t>Exact ($\text{Loss}=0$)</w:t>
             </w:r>
           </w:p>
         </w:tc>
@@ -1966,10 +2750,10 @@
             <w:tcW w:type="dxa" w:w="1872"/>
             <w:shd w:fill="F9FAFB"/>
             <w:tcMar>
-              <w:top w:w="100" w:type="dxa"/>
-              <w:bottom w:w="100" w:type="dxa"/>
-              <w:left w:w="140" w:type="dxa"/>
-              <w:right w:w="140" w:type="dxa"/>
+              <w:top w:w="90" w:type="dxa"/>
+              <w:bottom w:w="90" w:type="dxa"/>
+              <w:left w:w="130" w:type="dxa"/>
+              <w:right w:w="130" w:type="dxa"/>
             </w:tcMar>
           </w:tcPr>
           <w:p>
@@ -1979,10 +2763,10 @@
             <w:r>
               <w:rPr>
                 <w:rFonts w:ascii="Calibri" w:hAnsi="Calibri"/>
-                <w:color w:val="212529"/>
-                <w:sz w:val="19"/>
+                <w:b/>
+                <w:sz w:val="18"/>
               </w:rPr>
-              <w:t>**Synthetic: 90° Rotation**</w:t>
+              <w:t>Synthetic: 90° Rotation</w:t>
             </w:r>
           </w:p>
         </w:tc>
@@ -1991,10 +2775,10 @@
             <w:tcW w:type="dxa" w:w="1872"/>
             <w:shd w:fill="F9FAFB"/>
             <w:tcMar>
-              <w:top w:w="100" w:type="dxa"/>
-              <w:bottom w:w="100" w:type="dxa"/>
-              <w:left w:w="140" w:type="dxa"/>
-              <w:right w:w="140" w:type="dxa"/>
+              <w:top w:w="90" w:type="dxa"/>
+              <w:bottom w:w="90" w:type="dxa"/>
+              <w:left w:w="130" w:type="dxa"/>
+              <w:right w:w="130" w:type="dxa"/>
             </w:tcMar>
           </w:tcPr>
           <w:p>
@@ -2004,8 +2788,7 @@
             <w:r>
               <w:rPr>
                 <w:rFonts w:ascii="Calibri" w:hAnsi="Calibri"/>
-                <w:color w:val="212529"/>
-                <w:sz w:val="19"/>
+                <w:sz w:val="18"/>
               </w:rPr>
               <w:t>Pure clockwise rotation</w:t>
             </w:r>
@@ -2016,10 +2799,10 @@
             <w:tcW w:type="dxa" w:w="1872"/>
             <w:shd w:fill="F9FAFB"/>
             <w:tcMar>
-              <w:top w:w="100" w:type="dxa"/>
-              <w:bottom w:w="100" w:type="dxa"/>
-              <w:left w:w="140" w:type="dxa"/>
-              <w:right w:w="140" w:type="dxa"/>
+              <w:top w:w="90" w:type="dxa"/>
+              <w:bottom w:w="90" w:type="dxa"/>
+              <w:left w:w="130" w:type="dxa"/>
+              <w:right w:w="130" w:type="dxa"/>
             </w:tcMar>
           </w:tcPr>
           <w:p>
@@ -2029,8 +2812,7 @@
             <w:r>
               <w:rPr>
                 <w:rFonts w:ascii="Calibri" w:hAnsi="Calibri"/>
-                <w:color w:val="212529"/>
-                <w:sz w:val="19"/>
+                <w:sz w:val="18"/>
               </w:rPr>
               <w:t>2 candidates</w:t>
             </w:r>
@@ -2041,10 +2823,10 @@
             <w:tcW w:type="dxa" w:w="1872"/>
             <w:shd w:fill="F9FAFB"/>
             <w:tcMar>
-              <w:top w:w="100" w:type="dxa"/>
-              <w:bottom w:w="100" w:type="dxa"/>
-              <w:left w:w="140" w:type="dxa"/>
-              <w:right w:w="140" w:type="dxa"/>
+              <w:top w:w="90" w:type="dxa"/>
+              <w:bottom w:w="90" w:type="dxa"/>
+              <w:left w:w="130" w:type="dxa"/>
+              <w:right w:w="130" w:type="dxa"/>
             </w:tcMar>
           </w:tcPr>
           <w:p>
@@ -2054,10 +2836,10 @@
             <w:r>
               <w:rPr>
                 <w:rFonts w:ascii="Calibri" w:hAnsi="Calibri"/>
-                <w:color w:val="212529"/>
-                <w:sz w:val="19"/>
+                <w:color w:val="B41E1E"/>
+                <w:sz w:val="18"/>
               </w:rPr>
-              <w:t>`rot90`</w:t>
+              <w:t>rot90</w:t>
             </w:r>
           </w:p>
         </w:tc>
@@ -2066,10 +2848,10 @@
             <w:tcW w:type="dxa" w:w="1872"/>
             <w:shd w:fill="F9FAFB"/>
             <w:tcMar>
-              <w:top w:w="100" w:type="dxa"/>
-              <w:bottom w:w="100" w:type="dxa"/>
-              <w:left w:w="140" w:type="dxa"/>
-              <w:right w:w="140" w:type="dxa"/>
+              <w:top w:w="90" w:type="dxa"/>
+              <w:bottom w:w="90" w:type="dxa"/>
+              <w:left w:w="130" w:type="dxa"/>
+              <w:right w:w="130" w:type="dxa"/>
             </w:tcMar>
           </w:tcPr>
           <w:p>
@@ -2079,10 +2861,10 @@
             <w:r>
               <w:rPr>
                 <w:rFonts w:ascii="Calibri" w:hAnsi="Calibri"/>
-                <w:color w:val="212529"/>
-                <w:sz w:val="19"/>
+                <w:b/>
+                <w:sz w:val="18"/>
               </w:rPr>
-              <w:t>**Exact ($\text{Loss}=0$)**</w:t>
+              <w:t>Exact ($\text{Loss}=0$)</w:t>
             </w:r>
           </w:p>
         </w:tc>
@@ -2093,10 +2875,10 @@
             <w:tcW w:type="dxa" w:w="1872"/>
             <w:shd w:fill="FFFFFF"/>
             <w:tcMar>
-              <w:top w:w="100" w:type="dxa"/>
-              <w:bottom w:w="100" w:type="dxa"/>
-              <w:left w:w="140" w:type="dxa"/>
-              <w:right w:w="140" w:type="dxa"/>
+              <w:top w:w="90" w:type="dxa"/>
+              <w:bottom w:w="90" w:type="dxa"/>
+              <w:left w:w="130" w:type="dxa"/>
+              <w:right w:w="130" w:type="dxa"/>
             </w:tcMar>
           </w:tcPr>
           <w:p>
@@ -2106,10 +2888,10 @@
             <w:r>
               <w:rPr>
                 <w:rFonts w:ascii="Calibri" w:hAnsi="Calibri"/>
-                <w:color w:val="212529"/>
-                <w:sz w:val="19"/>
+                <w:b/>
+                <w:sz w:val="18"/>
               </w:rPr>
-              <w:t>**Synthetic: Horizontal Mirror**</w:t>
+              <w:t>Synthetic: Horizontal Mirror</w:t>
             </w:r>
           </w:p>
         </w:tc>
@@ -2118,10 +2900,10 @@
             <w:tcW w:type="dxa" w:w="1872"/>
             <w:shd w:fill="FFFFFF"/>
             <w:tcMar>
-              <w:top w:w="100" w:type="dxa"/>
-              <w:bottom w:w="100" w:type="dxa"/>
-              <w:left w:w="140" w:type="dxa"/>
-              <w:right w:w="140" w:type="dxa"/>
+              <w:top w:w="90" w:type="dxa"/>
+              <w:bottom w:w="90" w:type="dxa"/>
+              <w:left w:w="130" w:type="dxa"/>
+              <w:right w:w="130" w:type="dxa"/>
             </w:tcMar>
           </w:tcPr>
           <w:p>
@@ -2131,8 +2913,7 @@
             <w:r>
               <w:rPr>
                 <w:rFonts w:ascii="Calibri" w:hAnsi="Calibri"/>
-                <w:color w:val="212529"/>
-                <w:sz w:val="19"/>
+                <w:sz w:val="18"/>
               </w:rPr>
               <w:t>Reflection along the vertical axis</w:t>
             </w:r>
@@ -2143,10 +2924,10 @@
             <w:tcW w:type="dxa" w:w="1872"/>
             <w:shd w:fill="FFFFFF"/>
             <w:tcMar>
-              <w:top w:w="100" w:type="dxa"/>
-              <w:bottom w:w="100" w:type="dxa"/>
-              <w:left w:w="140" w:type="dxa"/>
-              <w:right w:w="140" w:type="dxa"/>
+              <w:top w:w="90" w:type="dxa"/>
+              <w:bottom w:w="90" w:type="dxa"/>
+              <w:left w:w="130" w:type="dxa"/>
+              <w:right w:w="130" w:type="dxa"/>
             </w:tcMar>
           </w:tcPr>
           <w:p>
@@ -2156,8 +2937,7 @@
             <w:r>
               <w:rPr>
                 <w:rFonts w:ascii="Calibri" w:hAnsi="Calibri"/>
-                <w:color w:val="212529"/>
-                <w:sz w:val="19"/>
+                <w:sz w:val="18"/>
               </w:rPr>
               <w:t>18 candidates</w:t>
             </w:r>
@@ -2168,10 +2948,10 @@
             <w:tcW w:type="dxa" w:w="1872"/>
             <w:shd w:fill="FFFFFF"/>
             <w:tcMar>
-              <w:top w:w="100" w:type="dxa"/>
-              <w:bottom w:w="100" w:type="dxa"/>
-              <w:left w:w="140" w:type="dxa"/>
-              <w:right w:w="140" w:type="dxa"/>
+              <w:top w:w="90" w:type="dxa"/>
+              <w:bottom w:w="90" w:type="dxa"/>
+              <w:left w:w="130" w:type="dxa"/>
+              <w:right w:w="130" w:type="dxa"/>
             </w:tcMar>
           </w:tcPr>
           <w:p>
@@ -2181,10 +2961,10 @@
             <w:r>
               <w:rPr>
                 <w:rFonts w:ascii="Calibri" w:hAnsi="Calibri"/>
-                <w:color w:val="212529"/>
-                <w:sz w:val="19"/>
+                <w:color w:val="B41E1E"/>
+                <w:sz w:val="18"/>
               </w:rPr>
-              <w:t>`flip_h`</w:t>
+              <w:t>flip_h</w:t>
             </w:r>
           </w:p>
         </w:tc>
@@ -2193,10 +2973,10 @@
             <w:tcW w:type="dxa" w:w="1872"/>
             <w:shd w:fill="FFFFFF"/>
             <w:tcMar>
-              <w:top w:w="100" w:type="dxa"/>
-              <w:bottom w:w="100" w:type="dxa"/>
-              <w:left w:w="140" w:type="dxa"/>
-              <w:right w:w="140" w:type="dxa"/>
+              <w:top w:w="90" w:type="dxa"/>
+              <w:bottom w:w="90" w:type="dxa"/>
+              <w:left w:w="130" w:type="dxa"/>
+              <w:right w:w="130" w:type="dxa"/>
             </w:tcMar>
           </w:tcPr>
           <w:p>
@@ -2206,10 +2986,10 @@
             <w:r>
               <w:rPr>
                 <w:rFonts w:ascii="Calibri" w:hAnsi="Calibri"/>
-                <w:color w:val="212529"/>
-                <w:sz w:val="19"/>
+                <w:b/>
+                <w:sz w:val="18"/>
               </w:rPr>
-              <w:t>**Exact ($\text{Loss}=0$)**</w:t>
+              <w:t>Exact ($\text{Loss}=0$)</w:t>
             </w:r>
           </w:p>
         </w:tc>
@@ -2220,10 +3000,10 @@
             <w:tcW w:type="dxa" w:w="1872"/>
             <w:shd w:fill="F9FAFB"/>
             <w:tcMar>
-              <w:top w:w="100" w:type="dxa"/>
-              <w:bottom w:w="100" w:type="dxa"/>
-              <w:left w:w="140" w:type="dxa"/>
-              <w:right w:w="140" w:type="dxa"/>
+              <w:top w:w="90" w:type="dxa"/>
+              <w:bottom w:w="90" w:type="dxa"/>
+              <w:left w:w="130" w:type="dxa"/>
+              <w:right w:w="130" w:type="dxa"/>
             </w:tcMar>
           </w:tcPr>
           <w:p>
@@ -2233,10 +3013,10 @@
             <w:r>
               <w:rPr>
                 <w:rFonts w:ascii="Calibri" w:hAnsi="Calibri"/>
-                <w:color w:val="212529"/>
-                <w:sz w:val="19"/>
+                <w:b/>
+                <w:sz w:val="18"/>
               </w:rPr>
-              <w:t>**Synthetic: Cavity Filling**</w:t>
+              <w:t>Synthetic: Cavity Filling</w:t>
             </w:r>
           </w:p>
         </w:tc>
@@ -2245,10 +3025,10 @@
             <w:tcW w:type="dxa" w:w="1872"/>
             <w:shd w:fill="F9FAFB"/>
             <w:tcMar>
-              <w:top w:w="100" w:type="dxa"/>
-              <w:bottom w:w="100" w:type="dxa"/>
-              <w:left w:w="140" w:type="dxa"/>
-              <w:right w:w="140" w:type="dxa"/>
+              <w:top w:w="90" w:type="dxa"/>
+              <w:bottom w:w="90" w:type="dxa"/>
+              <w:left w:w="130" w:type="dxa"/>
+              <w:right w:w="130" w:type="dxa"/>
             </w:tcMar>
           </w:tcPr>
           <w:p>
@@ -2258,8 +3038,7 @@
             <w:r>
               <w:rPr>
                 <w:rFonts w:ascii="Calibri" w:hAnsi="Calibri"/>
-                <w:color w:val="212529"/>
-                <w:sz w:val="19"/>
+                <w:sz w:val="18"/>
               </w:rPr>
               <w:t>Enclosed hole filled with color 3</w:t>
             </w:r>
@@ -2270,10 +3049,10 @@
             <w:tcW w:type="dxa" w:w="1872"/>
             <w:shd w:fill="F9FAFB"/>
             <w:tcMar>
-              <w:top w:w="100" w:type="dxa"/>
-              <w:bottom w:w="100" w:type="dxa"/>
-              <w:left w:w="140" w:type="dxa"/>
-              <w:right w:w="140" w:type="dxa"/>
+              <w:top w:w="90" w:type="dxa"/>
+              <w:bottom w:w="90" w:type="dxa"/>
+              <w:left w:w="130" w:type="dxa"/>
+              <w:right w:w="130" w:type="dxa"/>
             </w:tcMar>
           </w:tcPr>
           <w:p>
@@ -2283,8 +3062,7 @@
             <w:r>
               <w:rPr>
                 <w:rFonts w:ascii="Calibri" w:hAnsi="Calibri"/>
-                <w:color w:val="212529"/>
-                <w:sz w:val="19"/>
+                <w:sz w:val="18"/>
               </w:rPr>
               <w:t>6 candidates</w:t>
             </w:r>
@@ -2295,10 +3073,10 @@
             <w:tcW w:type="dxa" w:w="1872"/>
             <w:shd w:fill="F9FAFB"/>
             <w:tcMar>
-              <w:top w:w="100" w:type="dxa"/>
-              <w:bottom w:w="100" w:type="dxa"/>
-              <w:left w:w="140" w:type="dxa"/>
-              <w:right w:w="140" w:type="dxa"/>
+              <w:top w:w="90" w:type="dxa"/>
+              <w:bottom w:w="90" w:type="dxa"/>
+              <w:left w:w="130" w:type="dxa"/>
+              <w:right w:w="130" w:type="dxa"/>
             </w:tcMar>
           </w:tcPr>
           <w:p>
@@ -2308,10 +3086,10 @@
             <w:r>
               <w:rPr>
                 <w:rFonts w:ascii="Calibri" w:hAnsi="Calibri"/>
-                <w:color w:val="212529"/>
-                <w:sz w:val="19"/>
+                <w:color w:val="B41E1E"/>
+                <w:sz w:val="18"/>
               </w:rPr>
-              <w:t>`fill_holes(3)`</w:t>
+              <w:t>fill_holes(3)</w:t>
             </w:r>
           </w:p>
         </w:tc>
@@ -2320,10 +3098,10 @@
             <w:tcW w:type="dxa" w:w="1872"/>
             <w:shd w:fill="F9FAFB"/>
             <w:tcMar>
-              <w:top w:w="100" w:type="dxa"/>
-              <w:bottom w:w="100" w:type="dxa"/>
-              <w:left w:w="140" w:type="dxa"/>
-              <w:right w:w="140" w:type="dxa"/>
+              <w:top w:w="90" w:type="dxa"/>
+              <w:bottom w:w="90" w:type="dxa"/>
+              <w:left w:w="130" w:type="dxa"/>
+              <w:right w:w="130" w:type="dxa"/>
             </w:tcMar>
           </w:tcPr>
           <w:p>
@@ -2333,10 +3111,10 @@
             <w:r>
               <w:rPr>
                 <w:rFonts w:ascii="Calibri" w:hAnsi="Calibri"/>
-                <w:color w:val="212529"/>
-                <w:sz w:val="19"/>
+                <w:b/>
+                <w:sz w:val="18"/>
               </w:rPr>
-              <w:t>**Exact ($\text{Loss}=0$)**</w:t>
+              <w:t>Exact ($\text{Loss}=0$)</w:t>
             </w:r>
           </w:p>
         </w:tc>
@@ -2347,10 +3125,10 @@
             <w:tcW w:type="dxa" w:w="1872"/>
             <w:shd w:fill="FFFFFF"/>
             <w:tcMar>
-              <w:top w:w="100" w:type="dxa"/>
-              <w:bottom w:w="100" w:type="dxa"/>
-              <w:left w:w="140" w:type="dxa"/>
-              <w:right w:w="140" w:type="dxa"/>
+              <w:top w:w="90" w:type="dxa"/>
+              <w:bottom w:w="90" w:type="dxa"/>
+              <w:left w:w="130" w:type="dxa"/>
+              <w:right w:w="130" w:type="dxa"/>
             </w:tcMar>
           </w:tcPr>
           <w:p>
@@ -2360,10 +3138,10 @@
             <w:r>
               <w:rPr>
                 <w:rFonts w:ascii="Calibri" w:hAnsi="Calibri"/>
-                <w:color w:val="212529"/>
-                <w:sz w:val="19"/>
+                <w:b/>
+                <w:sz w:val="18"/>
               </w:rPr>
-              <w:t>**Synthetic: Palette Recolor**</w:t>
+              <w:t>Synthetic: Palette Recolor</w:t>
             </w:r>
           </w:p>
         </w:tc>
@@ -2372,10 +3150,10 @@
             <w:tcW w:type="dxa" w:w="1872"/>
             <w:shd w:fill="FFFFFF"/>
             <w:tcMar>
-              <w:top w:w="100" w:type="dxa"/>
-              <w:bottom w:w="100" w:type="dxa"/>
-              <w:left w:w="140" w:type="dxa"/>
-              <w:right w:w="140" w:type="dxa"/>
+              <w:top w:w="90" w:type="dxa"/>
+              <w:bottom w:w="90" w:type="dxa"/>
+              <w:left w:w="130" w:type="dxa"/>
+              <w:right w:w="130" w:type="dxa"/>
             </w:tcMar>
           </w:tcPr>
           <w:p>
@@ -2385,8 +3163,7 @@
             <w:r>
               <w:rPr>
                 <w:rFonts w:ascii="Calibri" w:hAnsi="Calibri"/>
-                <w:color w:val="212529"/>
-                <w:sz w:val="19"/>
+                <w:sz w:val="18"/>
               </w:rPr>
               <w:t>Global foreground recoloring to color 5</w:t>
             </w:r>
@@ -2397,10 +3174,10 @@
             <w:tcW w:type="dxa" w:w="1872"/>
             <w:shd w:fill="FFFFFF"/>
             <w:tcMar>
-              <w:top w:w="100" w:type="dxa"/>
-              <w:bottom w:w="100" w:type="dxa"/>
-              <w:left w:w="140" w:type="dxa"/>
-              <w:right w:w="140" w:type="dxa"/>
+              <w:top w:w="90" w:type="dxa"/>
+              <w:bottom w:w="90" w:type="dxa"/>
+              <w:left w:w="130" w:type="dxa"/>
+              <w:right w:w="130" w:type="dxa"/>
             </w:tcMar>
           </w:tcPr>
           <w:p>
@@ -2410,8 +3187,7 @@
             <w:r>
               <w:rPr>
                 <w:rFonts w:ascii="Calibri" w:hAnsi="Calibri"/>
-                <w:color w:val="212529"/>
-                <w:sz w:val="19"/>
+                <w:sz w:val="18"/>
               </w:rPr>
               <w:t>55 candidates</w:t>
             </w:r>
@@ -2422,10 +3198,10 @@
             <w:tcW w:type="dxa" w:w="1872"/>
             <w:shd w:fill="FFFFFF"/>
             <w:tcMar>
-              <w:top w:w="100" w:type="dxa"/>
-              <w:bottom w:w="100" w:type="dxa"/>
-              <w:left w:w="140" w:type="dxa"/>
-              <w:right w:w="140" w:type="dxa"/>
+              <w:top w:w="90" w:type="dxa"/>
+              <w:bottom w:w="90" w:type="dxa"/>
+              <w:left w:w="130" w:type="dxa"/>
+              <w:right w:w="130" w:type="dxa"/>
             </w:tcMar>
           </w:tcPr>
           <w:p>
@@ -2435,10 +3211,10 @@
             <w:r>
               <w:rPr>
                 <w:rFonts w:ascii="Calibri" w:hAnsi="Calibri"/>
-                <w:color w:val="212529"/>
-                <w:sz w:val="19"/>
+                <w:color w:val="B41E1E"/>
+                <w:sz w:val="18"/>
               </w:rPr>
-              <w:t>`recolor_all(5)`</w:t>
+              <w:t>recolor_all(5)</w:t>
             </w:r>
           </w:p>
         </w:tc>
@@ -2447,10 +3223,10 @@
             <w:tcW w:type="dxa" w:w="1872"/>
             <w:shd w:fill="FFFFFF"/>
             <w:tcMar>
-              <w:top w:w="100" w:type="dxa"/>
-              <w:bottom w:w="100" w:type="dxa"/>
-              <w:left w:w="140" w:type="dxa"/>
-              <w:right w:w="140" w:type="dxa"/>
+              <w:top w:w="90" w:type="dxa"/>
+              <w:bottom w:w="90" w:type="dxa"/>
+              <w:left w:w="130" w:type="dxa"/>
+              <w:right w:w="130" w:type="dxa"/>
             </w:tcMar>
           </w:tcPr>
           <w:p>
@@ -2460,10 +3236,10 @@
             <w:r>
               <w:rPr>
                 <w:rFonts w:ascii="Calibri" w:hAnsi="Calibri"/>
-                <w:color w:val="212529"/>
-                <w:sz w:val="19"/>
+                <w:b/>
+                <w:sz w:val="18"/>
               </w:rPr>
-              <w:t>**Exact ($\text{Loss}=0$)**</w:t>
+              <w:t>Exact ($\text{Loss}=0$)</w:t>
             </w:r>
           </w:p>
         </w:tc>
@@ -2474,10 +3250,10 @@
             <w:tcW w:type="dxa" w:w="1872"/>
             <w:shd w:fill="F9FAFB"/>
             <w:tcMar>
-              <w:top w:w="100" w:type="dxa"/>
-              <w:bottom w:w="100" w:type="dxa"/>
-              <w:left w:w="140" w:type="dxa"/>
-              <w:right w:w="140" w:type="dxa"/>
+              <w:top w:w="90" w:type="dxa"/>
+              <w:bottom w:w="90" w:type="dxa"/>
+              <w:left w:w="130" w:type="dxa"/>
+              <w:right w:w="130" w:type="dxa"/>
             </w:tcMar>
           </w:tcPr>
           <w:p>
@@ -2487,10 +3263,10 @@
             <w:r>
               <w:rPr>
                 <w:rFonts w:ascii="Calibri" w:hAnsi="Calibri"/>
-                <w:color w:val="212529"/>
-                <w:sz w:val="19"/>
+                <w:b/>
+                <w:sz w:val="18"/>
               </w:rPr>
-              <w:t>**Synthetic: Affine Composition**</w:t>
+              <w:t>Synthetic: Affine Composition</w:t>
             </w:r>
           </w:p>
         </w:tc>
@@ -2499,10 +3275,10 @@
             <w:tcW w:type="dxa" w:w="1872"/>
             <w:shd w:fill="F9FAFB"/>
             <w:tcMar>
-              <w:top w:w="100" w:type="dxa"/>
-              <w:bottom w:w="100" w:type="dxa"/>
-              <w:left w:w="140" w:type="dxa"/>
-              <w:right w:w="140" w:type="dxa"/>
+              <w:top w:w="90" w:type="dxa"/>
+              <w:bottom w:w="90" w:type="dxa"/>
+              <w:left w:w="130" w:type="dxa"/>
+              <w:right w:w="130" w:type="dxa"/>
             </w:tcMar>
           </w:tcPr>
           <w:p>
@@ -2512,8 +3288,7 @@
             <w:r>
               <w:rPr>
                 <w:rFonts w:ascii="Calibri" w:hAnsi="Calibri"/>
-                <w:color w:val="212529"/>
-                <w:sz w:val="19"/>
+                <w:sz w:val="18"/>
               </w:rPr>
               <w:t>180° rotation followed by transposition</w:t>
             </w:r>
@@ -2524,10 +3299,10 @@
             <w:tcW w:type="dxa" w:w="1872"/>
             <w:shd w:fill="F9FAFB"/>
             <w:tcMar>
-              <w:top w:w="100" w:type="dxa"/>
-              <w:bottom w:w="100" w:type="dxa"/>
-              <w:left w:w="140" w:type="dxa"/>
-              <w:right w:w="140" w:type="dxa"/>
+              <w:top w:w="90" w:type="dxa"/>
+              <w:bottom w:w="90" w:type="dxa"/>
+              <w:left w:w="130" w:type="dxa"/>
+              <w:right w:w="130" w:type="dxa"/>
             </w:tcMar>
           </w:tcPr>
           <w:p>
@@ -2537,8 +3312,7 @@
             <w:r>
               <w:rPr>
                 <w:rFonts w:ascii="Calibri" w:hAnsi="Calibri"/>
-                <w:color w:val="212529"/>
-                <w:sz w:val="19"/>
+                <w:sz w:val="18"/>
               </w:rPr>
               <w:t>9 candidates</w:t>
             </w:r>
@@ -2549,10 +3323,10 @@
             <w:tcW w:type="dxa" w:w="1872"/>
             <w:shd w:fill="F9FAFB"/>
             <w:tcMar>
-              <w:top w:w="100" w:type="dxa"/>
-              <w:bottom w:w="100" w:type="dxa"/>
-              <w:left w:w="140" w:type="dxa"/>
-              <w:right w:w="140" w:type="dxa"/>
+              <w:top w:w="90" w:type="dxa"/>
+              <w:bottom w:w="90" w:type="dxa"/>
+              <w:left w:w="130" w:type="dxa"/>
+              <w:right w:w="130" w:type="dxa"/>
             </w:tcMar>
           </w:tcPr>
           <w:p>
@@ -2562,10 +3336,10 @@
             <w:r>
               <w:rPr>
                 <w:rFonts w:ascii="Calibri" w:hAnsi="Calibri"/>
-                <w:color w:val="212529"/>
-                <w:sz w:val="19"/>
+                <w:color w:val="B41E1E"/>
+                <w:sz w:val="18"/>
               </w:rPr>
-              <w:t>`rot180 -&gt; transpose`</w:t>
+              <w:t>rot180 -&gt; transpose</w:t>
             </w:r>
           </w:p>
         </w:tc>
@@ -2574,10 +3348,10 @@
             <w:tcW w:type="dxa" w:w="1872"/>
             <w:shd w:fill="F9FAFB"/>
             <w:tcMar>
-              <w:top w:w="100" w:type="dxa"/>
-              <w:bottom w:w="100" w:type="dxa"/>
-              <w:left w:w="140" w:type="dxa"/>
-              <w:right w:w="140" w:type="dxa"/>
+              <w:top w:w="90" w:type="dxa"/>
+              <w:bottom w:w="90" w:type="dxa"/>
+              <w:left w:w="130" w:type="dxa"/>
+              <w:right w:w="130" w:type="dxa"/>
             </w:tcMar>
           </w:tcPr>
           <w:p>
@@ -2587,10 +3361,10 @@
             <w:r>
               <w:rPr>
                 <w:rFonts w:ascii="Calibri" w:hAnsi="Calibri"/>
-                <w:color w:val="212529"/>
-                <w:sz w:val="19"/>
+                <w:b/>
+                <w:sz w:val="18"/>
               </w:rPr>
-              <w:t>**Exact (Depth 2)**</w:t>
+              <w:t>Exact (Depth 2)</w:t>
             </w:r>
           </w:p>
         </w:tc>

</xml_diff>

<commit_message>
Aprimora escrita e tipografia matematica para total legibilidade nos documentos DOCX, MD e HTML
</commit_message>
<xml_diff>
--- a/TECHNICAL_PAPER_T_NSE_ARC_2026.docx
+++ b/TECHNICAL_PAPER_T_NSE_ARC_2026.docx
@@ -12,7 +12,7 @@
           <w:rFonts w:ascii="Calibri" w:hAnsi="Calibri"/>
           <w:b/>
           <w:color w:val="0F3C73"/>
-          <w:sz w:val="40"/>
+          <w:sz w:val="36"/>
         </w:rPr>
         <w:t>Topological Neuro-Symbolic Engine (T-NSE): Object-Centric Spatial Induction for the Abstraction and Reasoning Corpus</w:t>
       </w:r>
@@ -222,7 +222,7 @@
           <w:rFonts w:ascii="Calibri" w:hAnsi="Calibri"/>
           <w:b/>
           <w:color w:val="0F3C73"/>
-          <w:sz w:val="28"/>
+          <w:sz w:val="27"/>
         </w:rPr>
         <w:t>Executive Abstract</w:t>
       </w:r>
@@ -242,11 +242,30 @@
       <w:r>
         <w:rPr>
           <w:rFonts w:ascii="Cambria Math" w:hAnsi="Cambria Math"/>
-          <w:i/>
+          <w:b w:val="0"/>
           <w:color w:val="0F3C73"/>
           <w:sz w:val="20"/>
         </w:rPr>
-        <w:t>O(|D|^L)</w:t>
+        <w:t>O(|D|</w:t>
+      </w:r>
+      <w:r>
+        <w:rPr>
+          <w:rFonts w:ascii="Cambria Math" w:hAnsi="Cambria Math"/>
+          <w:b w:val="0"/>
+          <w:color w:val="0F3C73"/>
+          <w:sz w:val="20"/>
+          <w:vertAlign w:val="superscript"/>
+        </w:rPr>
+        <w:t>L</w:t>
+      </w:r>
+      <w:r>
+        <w:rPr>
+          <w:rFonts w:ascii="Cambria Math" w:hAnsi="Cambria Math"/>
+          <w:b w:val="0"/>
+          <w:color w:val="0F3C73"/>
+          <w:sz w:val="20"/>
+        </w:rPr>
+        <w:t>)</w:t>
       </w:r>
       <w:r>
         <w:rPr>
@@ -379,7 +398,7 @@
       <w:r>
         <w:rPr>
           <w:rFonts w:ascii="Cambria Math" w:hAnsi="Cambria Math"/>
-          <w:i/>
+          <w:b w:val="0"/>
           <w:color w:val="0F3C73"/>
           <w:sz w:val="20"/>
         </w:rPr>
@@ -464,7 +483,7 @@
           <w:rFonts w:ascii="Calibri" w:hAnsi="Calibri"/>
           <w:b/>
           <w:color w:val="0F3C73"/>
-          <w:sz w:val="28"/>
+          <w:sz w:val="27"/>
         </w:rPr>
         <w:t>1. Theoretical Motivation &amp; The "Why" (Theory &amp; Progress)</w:t>
       </w:r>
@@ -479,7 +498,7 @@
           <w:rFonts w:ascii="Calibri" w:hAnsi="Calibri"/>
           <w:b/>
           <w:color w:val="1E5AA0"/>
-          <w:sz w:val="24"/>
+          <w:sz w:val="23"/>
         </w:rPr>
         <w:t>1.1 The Pitfalls of Connectionism and Blind Symbolism</w:t>
       </w:r>
@@ -499,7 +518,7 @@
       <w:r>
         <w:rPr>
           <w:rFonts w:ascii="Cambria Math" w:hAnsi="Cambria Math"/>
-          <w:i/>
+          <w:b w:val="0"/>
           <w:color w:val="0F3C73"/>
           <w:sz w:val="20"/>
         </w:rPr>
@@ -524,7 +543,41 @@
           <w:color w:val="24292F"/>
           <w:sz w:val="20"/>
         </w:rPr>
-        <w:t>On the other hand, addressing ARC through unguided brute-force search over a domain-specific language leads to an intractable combinatorial search space:</w:t>
+        <w:t xml:space="preserve">On the other hand, addressing ARC through unguided brute-force search over a domain-specific language leads to an intractable combinatorial search space. The total number of candidate programs </w:t>
+      </w:r>
+      <w:r>
+        <w:rPr>
+          <w:rFonts w:ascii="Cambria Math" w:hAnsi="Cambria Math"/>
+          <w:b w:val="0"/>
+          <w:color w:val="0F3C73"/>
+          <w:sz w:val="20"/>
+        </w:rPr>
+        <w:t>N(L)</w:t>
+      </w:r>
+      <w:r>
+        <w:rPr>
+          <w:rFonts w:ascii="Calibri" w:hAnsi="Calibri"/>
+          <w:color w:val="24292F"/>
+          <w:sz w:val="20"/>
+        </w:rPr>
+        <w:t xml:space="preserve"> evaluated up to compositional depth </w:t>
+      </w:r>
+      <w:r>
+        <w:rPr>
+          <w:rFonts w:ascii="Cambria Math" w:hAnsi="Cambria Math"/>
+          <w:b w:val="0"/>
+          <w:color w:val="0F3C73"/>
+          <w:sz w:val="20"/>
+        </w:rPr>
+        <w:t>L</w:t>
+      </w:r>
+      <w:r>
+        <w:rPr>
+          <w:rFonts w:ascii="Calibri" w:hAnsi="Calibri"/>
+          <w:color w:val="24292F"/>
+          <w:sz w:val="20"/>
+        </w:rPr>
+        <w:t xml:space="preserve"> is given by the geometric progression of candidate compositions:</w:t>
       </w:r>
     </w:p>
     <w:p>
@@ -535,11 +588,59 @@
       <w:r>
         <w:rPr>
           <w:rFonts w:ascii="Cambria Math" w:hAnsi="Cambria Math"/>
-          <w:i/>
+          <w:b/>
           <w:color w:val="0F3C73"/>
           <w:sz w:val="22"/>
         </w:rPr>
-        <w:t>N(L) = ∑_{d=1..L} |D|^d</w:t>
+        <w:t>N(L) = |D|</w:t>
+      </w:r>
+      <w:r>
+        <w:rPr>
+          <w:rFonts w:ascii="Cambria Math" w:hAnsi="Cambria Math"/>
+          <w:b/>
+          <w:color w:val="0F3C73"/>
+          <w:sz w:val="22"/>
+          <w:vertAlign w:val="superscript"/>
+        </w:rPr>
+        <w:t>1</w:t>
+      </w:r>
+      <w:r>
+        <w:rPr>
+          <w:rFonts w:ascii="Cambria Math" w:hAnsi="Cambria Math"/>
+          <w:b/>
+          <w:color w:val="0F3C73"/>
+          <w:sz w:val="22"/>
+        </w:rPr>
+        <w:t xml:space="preserve"> + |D|</w:t>
+      </w:r>
+      <w:r>
+        <w:rPr>
+          <w:rFonts w:ascii="Cambria Math" w:hAnsi="Cambria Math"/>
+          <w:b/>
+          <w:color w:val="0F3C73"/>
+          <w:sz w:val="22"/>
+          <w:vertAlign w:val="superscript"/>
+        </w:rPr>
+        <w:t>2</w:t>
+      </w:r>
+      <w:r>
+        <w:rPr>
+          <w:rFonts w:ascii="Cambria Math" w:hAnsi="Cambria Math"/>
+          <w:b/>
+          <w:color w:val="0F3C73"/>
+          <w:sz w:val="22"/>
+        </w:rPr>
+        <w:t xml:space="preserve"> + … + |D|</w:t>
+      </w:r>
+      <w:r>
+        <w:rPr>
+          <w:rFonts w:ascii="Cambria Math" w:hAnsi="Cambria Math"/>
+          <w:b/>
+          <w:color w:val="0F3C73"/>
+          <w:sz w:val="22"/>
+          <w:vertAlign w:val="superscript"/>
+        </w:rPr>
+        <w:t>L</w:t>
       </w:r>
     </w:p>
     <w:p>
@@ -552,16 +653,16 @@
           <w:color w:val="24292F"/>
           <w:sz w:val="20"/>
         </w:rPr>
-        <w:t xml:space="preserve">Even for a modest vocabulary of </w:t>
+        <w:t xml:space="preserve">Where </w:t>
       </w:r>
       <w:r>
         <w:rPr>
           <w:rFonts w:ascii="Cambria Math" w:hAnsi="Cambria Math"/>
-          <w:i/>
+          <w:b w:val="0"/>
           <w:color w:val="0F3C73"/>
           <w:sz w:val="20"/>
         </w:rPr>
-        <w:t>|D| = 75</w:t>
+        <w:t>|D|</w:t>
       </w:r>
       <w:r>
         <w:rPr>
@@ -569,16 +670,16 @@
           <w:color w:val="24292F"/>
           <w:sz w:val="20"/>
         </w:rPr>
-        <w:t xml:space="preserve"> primitives, evaluating compositions up to depth </w:t>
+        <w:t xml:space="preserve"> represents the vocabulary of available DSL primitives. For a modest vocabulary of </w:t>
       </w:r>
       <w:r>
         <w:rPr>
           <w:rFonts w:ascii="Cambria Math" w:hAnsi="Cambria Math"/>
-          <w:i/>
+          <w:b w:val="0"/>
           <w:color w:val="0F3C73"/>
           <w:sz w:val="20"/>
         </w:rPr>
-        <w:t>L = 3</w:t>
+        <w:t>|D| = 75</w:t>
       </w:r>
       <w:r>
         <w:rPr>
@@ -586,16 +687,16 @@
           <w:color w:val="24292F"/>
           <w:sz w:val="20"/>
         </w:rPr>
-        <w:t xml:space="preserve"> requires testing more than </w:t>
+        <w:t xml:space="preserve"> primitives, searching compositions up to depth </w:t>
       </w:r>
       <w:r>
         <w:rPr>
           <w:rFonts w:ascii="Cambria Math" w:hAnsi="Cambria Math"/>
-          <w:i/>
+          <w:b w:val="0"/>
           <w:color w:val="0F3C73"/>
           <w:sz w:val="20"/>
         </w:rPr>
-        <w:t>420,000</w:t>
+        <w:t>L = 3</w:t>
       </w:r>
       <w:r>
         <w:rPr>
@@ -603,7 +704,24 @@
           <w:color w:val="24292F"/>
           <w:sz w:val="20"/>
         </w:rPr>
-        <w:t xml:space="preserve"> candidate programs per task. In competitions such as ARC-AGI-2, where over 100 hidden tasks must be solved within strict offline CPU quotas, blind search inevitably triggers runtime timeouts and out-of-memory errors.</w:t>
+        <w:t xml:space="preserve"> requires testing no less than </w:t>
+      </w:r>
+      <w:r>
+        <w:rPr>
+          <w:rFonts w:ascii="Calibri" w:hAnsi="Calibri"/>
+          <w:b/>
+          <w:color w:val="24292F"/>
+          <w:sz w:val="20"/>
+        </w:rPr>
+        <w:t>427,575 candidate programs</w:t>
+      </w:r>
+      <w:r>
+        <w:rPr>
+          <w:rFonts w:ascii="Calibri" w:hAnsi="Calibri"/>
+          <w:color w:val="24292F"/>
+          <w:sz w:val="20"/>
+        </w:rPr>
+        <w:t xml:space="preserve"> per task (75 single-step + 5,625 two-step + 421,875 three-step programs). In competitions such as ARC-AGI-2, where over 100 hidden tasks must be solved within strict offline CPU quotas, blind search inevitably triggers runtime timeouts and out-of-memory errors.</w:t>
       </w:r>
     </w:p>
     <w:p>
@@ -616,7 +734,7 @@
           <w:rFonts w:ascii="Calibri" w:hAnsi="Calibri"/>
           <w:b/>
           <w:color w:val="1E5AA0"/>
-          <w:sz w:val="24"/>
+          <w:sz w:val="23"/>
         </w:rPr>
         <w:t>1.2 Cognitive Foundations: Core Knowledge Priors</w:t>
       </w:r>
@@ -734,16 +852,26 @@
           <w:color w:val="24292F"/>
           <w:sz w:val="20"/>
         </w:rPr>
-        <w:t>T-NSE explicitly bakes these three axioms into its representational state, shrinking the search space from raw pixel lattice configurations (</w:t>
+        <w:t xml:space="preserve">T-NSE explicitly bakes these three axioms into its representational state, shrinking the search space from raw pixel lattice configurations (an astronomical scale of </w:t>
       </w:r>
       <w:r>
         <w:rPr>
           <w:rFonts w:ascii="Cambria Math" w:hAnsi="Cambria Math"/>
-          <w:i/>
+          <w:b w:val="0"/>
           <w:color w:val="0F3C73"/>
           <w:sz w:val="20"/>
         </w:rPr>
-        <w:t>~ 10^{900}</w:t>
+        <w:t>~ 10</w:t>
+      </w:r>
+      <w:r>
+        <w:rPr>
+          <w:rFonts w:ascii="Cambria Math" w:hAnsi="Cambria Math"/>
+          <w:b w:val="0"/>
+          <w:color w:val="0F3C73"/>
+          <w:sz w:val="20"/>
+          <w:vertAlign w:val="superscript"/>
+        </w:rPr>
+        <w:t>900</w:t>
       </w:r>
       <w:r>
         <w:rPr>
@@ -751,12 +879,12 @@
           <w:color w:val="24292F"/>
           <w:sz w:val="20"/>
         </w:rPr>
-        <w:t xml:space="preserve"> states on </w:t>
+        <w:t xml:space="preserve"> possible states on </w:t>
       </w:r>
       <w:r>
         <w:rPr>
           <w:rFonts w:ascii="Cambria Math" w:hAnsi="Cambria Math"/>
-          <w:i/>
+          <w:b w:val="0"/>
           <w:color w:val="0F3C73"/>
           <w:sz w:val="20"/>
         </w:rPr>
@@ -768,16 +896,16 @@
           <w:color w:val="24292F"/>
           <w:sz w:val="20"/>
         </w:rPr>
-        <w:t xml:space="preserve"> grids) down to structured object graph morphisms (</w:t>
+        <w:t xml:space="preserve"> grids) down to structured object graph morphisms (pruned down to </w:t>
       </w:r>
       <w:r>
         <w:rPr>
           <w:rFonts w:ascii="Cambria Math" w:hAnsi="Cambria Math"/>
-          <w:i/>
+          <w:b w:val="0"/>
           <w:color w:val="0F3C73"/>
           <w:sz w:val="20"/>
         </w:rPr>
-        <w:t>~ 10^3</w:t>
+        <w:t>~ 1,000</w:t>
       </w:r>
       <w:r>
         <w:rPr>
@@ -811,7 +939,7 @@
           <w:rFonts w:ascii="Calibri" w:hAnsi="Calibri"/>
           <w:b/>
           <w:color w:val="0F3C73"/>
-          <w:sz w:val="28"/>
+          <w:sz w:val="27"/>
         </w:rPr>
         <w:t>2. Mathematical Formalization of the Architecture (Completeness &amp; Novelty)</w:t>
       </w:r>
@@ -1016,7 +1144,7 @@
             <w:r>
               <w:rPr>
                 <w:rFonts w:ascii="Cambria Math" w:hAnsi="Cambria Math"/>
-                <w:i/>
+                <w:b w:val="0"/>
                 <w:color w:val="0F3C73"/>
                 <w:sz w:val="18"/>
               </w:rPr>
@@ -1045,16 +1173,16 @@
                 <w:color w:val="24292F"/>
                 <w:sz w:val="18"/>
               </w:rPr>
-              <w:t xml:space="preserve">Parse raw task JSON into discrete 2D integer lattice </w:t>
+              <w:t xml:space="preserve">Parse raw task JSON into discrete 2D integer lattice (values 0–9) of dimension </w:t>
             </w:r>
             <w:r>
               <w:rPr>
                 <w:rFonts w:ascii="Cambria Math" w:hAnsi="Cambria Math"/>
-                <w:i/>
+                <w:b w:val="0"/>
                 <w:color w:val="0F3C73"/>
                 <w:sz w:val="18"/>
               </w:rPr>
-              <w:t>G ∈ \{0,…,9\}^{H × W}</w:t>
+              <w:t>H × W</w:t>
             </w:r>
           </w:p>
         </w:tc>
@@ -1161,7 +1289,7 @@
                 <w:color w:val="24292F"/>
                 <w:sz w:val="18"/>
               </w:rPr>
-              <w:t>Multilayer color filtering; 4- or 8-connectivity labeling (OpenCV / pure-NumPy BFS)</w:t>
+              <w:t>Multilayer color filtering; 4- or 8-connectivity component labeling (OpenCV / pure-NumPy BFS)</w:t>
             </w:r>
           </w:p>
         </w:tc>
@@ -1191,11 +1319,57 @@
             <w:r>
               <w:rPr>
                 <w:rFonts w:ascii="Cambria Math" w:hAnsi="Cambria Math"/>
-                <w:i/>
+                <w:b w:val="0"/>
                 <w:color w:val="0F3C73"/>
                 <w:sz w:val="18"/>
               </w:rPr>
-              <w:t>O = \{o_i = \langle c_i, M_i, b_i, A_i, c_i \rangle\}</w:t>
+              <w:t>O = \{o</w:t>
+            </w:r>
+            <w:r>
+              <w:rPr>
+                <w:rFonts w:ascii="Cambria Math" w:hAnsi="Cambria Math"/>
+                <w:b w:val="0"/>
+                <w:color w:val="0F3C73"/>
+                <w:sz w:val="18"/>
+                <w:vertAlign w:val="subscript"/>
+              </w:rPr>
+              <w:t>1</w:t>
+            </w:r>
+            <w:r>
+              <w:rPr>
+                <w:rFonts w:ascii="Cambria Math" w:hAnsi="Cambria Math"/>
+                <w:b w:val="0"/>
+                <w:color w:val="0F3C73"/>
+                <w:sz w:val="18"/>
+              </w:rPr>
+              <w:t>, …, o</w:t>
+            </w:r>
+            <w:r>
+              <w:rPr>
+                <w:rFonts w:ascii="Cambria Math" w:hAnsi="Cambria Math"/>
+                <w:b w:val="0"/>
+                <w:color w:val="0F3C73"/>
+                <w:sz w:val="18"/>
+                <w:vertAlign w:val="subscript"/>
+              </w:rPr>
+              <w:t>n</w:t>
+            </w:r>
+            <w:r>
+              <w:rPr>
+                <w:rFonts w:ascii="Cambria Math" w:hAnsi="Cambria Math"/>
+                <w:b w:val="0"/>
+                <w:color w:val="0F3C73"/>
+                <w:sz w:val="18"/>
+              </w:rPr>
+              <w:t>\}</w:t>
+            </w:r>
+            <w:r>
+              <w:rPr>
+                <w:rFonts w:ascii="Calibri" w:hAnsi="Calibri"/>
+                <w:color w:val="24292F"/>
+                <w:sz w:val="18"/>
+              </w:rPr>
+              <w:t xml:space="preserve"> with physical attributes</w:t>
             </w:r>
           </w:p>
         </w:tc>
@@ -1324,7 +1498,7 @@
             <w:r>
               <w:rPr>
                 <w:rFonts w:ascii="Cambria Math" w:hAnsi="Cambria Math"/>
-                <w:i/>
+                <w:b w:val="0"/>
                 <w:color w:val="0F3C73"/>
                 <w:sz w:val="18"/>
               </w:rPr>
@@ -1336,50 +1510,7 @@
                 <w:color w:val="24292F"/>
                 <w:sz w:val="18"/>
               </w:rPr>
-              <w:t xml:space="preserve"> with </w:t>
-            </w:r>
-            <w:r>
-              <w:rPr>
-                <w:rFonts w:ascii="Consolas" w:hAnsi="Consolas"/>
-                <w:b/>
-                <w:color w:val="0F3C73"/>
-                <w:sz w:val="16"/>
-              </w:rPr>
-              <w:t>contains</w:t>
-            </w:r>
-            <w:r>
-              <w:rPr>
-                <w:rFonts w:ascii="Calibri" w:hAnsi="Calibri"/>
-                <w:color w:val="24292F"/>
-                <w:sz w:val="18"/>
-              </w:rPr>
-              <w:t xml:space="preserve">, </w:t>
-            </w:r>
-            <w:r>
-              <w:rPr>
-                <w:rFonts w:ascii="Consolas" w:hAnsi="Consolas"/>
-                <w:b/>
-                <w:color w:val="0F3C73"/>
-                <w:sz w:val="16"/>
-              </w:rPr>
-              <w:t>adjacent</w:t>
-            </w:r>
-            <w:r>
-              <w:rPr>
-                <w:rFonts w:ascii="Calibri" w:hAnsi="Calibri"/>
-                <w:color w:val="24292F"/>
-                <w:sz w:val="18"/>
-              </w:rPr>
-              <w:t xml:space="preserve">, </w:t>
-            </w:r>
-            <w:r>
-              <w:rPr>
-                <w:rFonts w:ascii="Cambria Math" w:hAnsi="Cambria Math"/>
-                <w:i/>
-                <w:color w:val="0F3C73"/>
-                <w:sz w:val="18"/>
-              </w:rPr>
-              <w:t>Δ\mathbf{c}_{ij}</w:t>
+              <w:t xml:space="preserve"> with enclosure, adjacency, and offsets</w:t>
             </w:r>
           </w:p>
         </w:tc>
@@ -1491,11 +1622,21 @@
             <w:r>
               <w:rPr>
                 <w:rFonts w:ascii="Cambria Math" w:hAnsi="Cambria Math"/>
-                <w:i/>
+                <w:b w:val="0"/>
                 <w:color w:val="0F3C73"/>
                 <w:sz w:val="18"/>
               </w:rPr>
-              <w:t>D* ⊂ D</w:t>
+              <w:t>D</w:t>
+            </w:r>
+            <w:r>
+              <w:rPr>
+                <w:rFonts w:ascii="Cambria Math" w:hAnsi="Cambria Math"/>
+                <w:b w:val="0"/>
+                <w:color w:val="0F3C73"/>
+                <w:sz w:val="18"/>
+                <w:vertAlign w:val="superscript"/>
+              </w:rPr>
+              <w:t>*</w:t>
             </w:r>
             <w:r>
               <w:rPr>
@@ -1503,7 +1644,7 @@
                 <w:color w:val="24292F"/>
                 <w:sz w:val="18"/>
               </w:rPr>
-              <w:t xml:space="preserve"> (3 to 15 active primitives)</w:t>
+              <w:t xml:space="preserve"> (reduced from 75 down to 3–15 active primitives)</w:t>
             </w:r>
           </w:p>
         </w:tc>
@@ -1585,7 +1726,7 @@
                 <w:color w:val="24292F"/>
                 <w:sz w:val="18"/>
               </w:rPr>
-              <w:t>Shortest-first enumerative search (depth 1–2); verification loss $\sum \</w:t>
+              <w:t>Shortest-first enumerative search (depth 1–2); deterministic verification loss with 100% accuracy</w:t>
             </w:r>
           </w:p>
         </w:tc>
@@ -1610,7 +1751,26 @@
                 <w:color w:val="24292F"/>
                 <w:sz w:val="18"/>
               </w:rPr>
-              <w:t>P(I_k) - O_k\</w:t>
+              <w:t xml:space="preserve">Verified Deterministic Program </w:t>
+            </w:r>
+            <w:r>
+              <w:rPr>
+                <w:rFonts w:ascii="Cambria Math" w:hAnsi="Cambria Math"/>
+                <w:b w:val="0"/>
+                <w:color w:val="0F3C73"/>
+                <w:sz w:val="18"/>
+              </w:rPr>
+              <w:t>P</w:t>
+            </w:r>
+            <w:r>
+              <w:rPr>
+                <w:rFonts w:ascii="Cambria Math" w:hAnsi="Cambria Math"/>
+                <w:b w:val="0"/>
+                <w:color w:val="0F3C73"/>
+                <w:sz w:val="18"/>
+                <w:vertAlign w:val="superscript"/>
+              </w:rPr>
+              <w:t>*</w:t>
             </w:r>
           </w:p>
         </w:tc>
@@ -1696,11 +1856,49 @@
             <w:r>
               <w:rPr>
                 <w:rFonts w:ascii="Cambria Math" w:hAnsi="Cambria Math"/>
-                <w:i/>
+                <w:b w:val="0"/>
                 <w:color w:val="0F3C73"/>
                 <w:sz w:val="18"/>
               </w:rPr>
-              <w:t>P^*(I_{test})</w:t>
+              <w:t>P</w:t>
+            </w:r>
+            <w:r>
+              <w:rPr>
+                <w:rFonts w:ascii="Cambria Math" w:hAnsi="Cambria Math"/>
+                <w:b w:val="0"/>
+                <w:color w:val="0F3C73"/>
+                <w:sz w:val="18"/>
+                <w:vertAlign w:val="superscript"/>
+              </w:rPr>
+              <w:t>*</w:t>
+            </w:r>
+            <w:r>
+              <w:rPr>
+                <w:rFonts w:ascii="Cambria Math" w:hAnsi="Cambria Math"/>
+                <w:b w:val="0"/>
+                <w:color w:val="0F3C73"/>
+                <w:sz w:val="18"/>
+              </w:rPr>
+              <w:t>(I</w:t>
+            </w:r>
+            <w:r>
+              <w:rPr>
+                <w:rFonts w:ascii="Cambria Math" w:hAnsi="Cambria Math"/>
+                <w:b w:val="0"/>
+                <w:color w:val="0F3C73"/>
+                <w:sz w:val="18"/>
+                <w:vertAlign w:val="subscript"/>
+              </w:rPr>
+              <w:t>test</w:t>
+            </w:r>
+            <w:r>
+              <w:rPr>
+                <w:rFonts w:ascii="Cambria Math" w:hAnsi="Cambria Math"/>
+                <w:b w:val="0"/>
+                <w:color w:val="0F3C73"/>
+                <w:sz w:val="18"/>
+              </w:rPr>
+              <w:t>)</w:t>
             </w:r>
             <w:r>
               <w:rPr>
@@ -1797,7 +1995,7 @@
           <w:rFonts w:ascii="Calibri" w:hAnsi="Calibri"/>
           <w:b/>
           <w:color w:val="1E5AA0"/>
-          <w:sz w:val="24"/>
+          <w:sz w:val="23"/>
         </w:rPr>
         <w:t>2.1 Discrete Perception and Object Extraction</w:t>
       </w:r>
@@ -1817,11 +2015,11 @@
       <w:r>
         <w:rPr>
           <w:rFonts w:ascii="Cambria Math" w:hAnsi="Cambria Math"/>
-          <w:i/>
+          <w:b w:val="0"/>
           <w:color w:val="0F3C73"/>
           <w:sz w:val="20"/>
         </w:rPr>
-        <w:t>G ∈ \{0, …, 9\}^{H × W}</w:t>
+        <w:t>G</w:t>
       </w:r>
       <w:r>
         <w:rPr>
@@ -1829,16 +2027,16 @@
           <w:color w:val="24292F"/>
           <w:sz w:val="20"/>
         </w:rPr>
-        <w:t>, background cells (</w:t>
+        <w:t xml:space="preserve"> of dimensions </w:t>
       </w:r>
       <w:r>
         <w:rPr>
           <w:rFonts w:ascii="Cambria Math" w:hAnsi="Cambria Math"/>
-          <w:i/>
+          <w:b w:val="0"/>
           <w:color w:val="0F3C73"/>
           <w:sz w:val="20"/>
         </w:rPr>
-        <w:t>c = 0</w:t>
+        <w:t>H × W</w:t>
       </w:r>
       <w:r>
         <w:rPr>
@@ -1846,16 +2044,16 @@
           <w:color w:val="24292F"/>
           <w:sz w:val="20"/>
         </w:rPr>
-        <w:t xml:space="preserve">) are segregated, and each foreground color </w:t>
+        <w:t>, background cells (</w:t>
       </w:r>
       <w:r>
         <w:rPr>
           <w:rFonts w:ascii="Cambria Math" w:hAnsi="Cambria Math"/>
-          <w:i/>
+          <w:b w:val="0"/>
           <w:color w:val="0F3C73"/>
           <w:sz w:val="20"/>
         </w:rPr>
-        <w:t>c ∈ \{1, …, 9\}</w:t>
+        <w:t>c = 0</w:t>
       </w:r>
       <w:r>
         <w:rPr>
@@ -1863,16 +2061,43 @@
           <w:color w:val="24292F"/>
           <w:sz w:val="20"/>
         </w:rPr>
-        <w:t xml:space="preserve"> is segmented into connected components. Every detected object </w:t>
+        <w:t xml:space="preserve">) are segregated, and each foreground color </w:t>
       </w:r>
       <w:r>
         <w:rPr>
           <w:rFonts w:ascii="Cambria Math" w:hAnsi="Cambria Math"/>
-          <w:i/>
+          <w:b w:val="0"/>
           <w:color w:val="0F3C73"/>
           <w:sz w:val="20"/>
         </w:rPr>
-        <w:t>o_i</w:t>
+        <w:t>c ∈ \{1, …, 9\}</w:t>
+      </w:r>
+      <w:r>
+        <w:rPr>
+          <w:rFonts w:ascii="Calibri" w:hAnsi="Calibri"/>
+          <w:color w:val="24292F"/>
+          <w:sz w:val="20"/>
+        </w:rPr>
+        <w:t xml:space="preserve"> is segmented into connected components. Every detected object </w:t>
+      </w:r>
+      <w:r>
+        <w:rPr>
+          <w:rFonts w:ascii="Cambria Math" w:hAnsi="Cambria Math"/>
+          <w:b w:val="0"/>
+          <w:color w:val="0F3C73"/>
+          <w:sz w:val="20"/>
+        </w:rPr>
+        <w:t>o</w:t>
+      </w:r>
+      <w:r>
+        <w:rPr>
+          <w:rFonts w:ascii="Cambria Math" w:hAnsi="Cambria Math"/>
+          <w:b w:val="0"/>
+          <w:color w:val="0F3C73"/>
+          <w:sz w:val="20"/>
+          <w:vertAlign w:val="subscript"/>
+        </w:rPr>
+        <w:t>i</w:t>
       </w:r>
       <w:r>
         <w:rPr>
@@ -1891,11 +2116,135 @@
       <w:r>
         <w:rPr>
           <w:rFonts w:ascii="Cambria Math" w:hAnsi="Cambria Math"/>
-          <w:i/>
+          <w:b/>
           <w:color w:val="0F3C73"/>
           <w:sz w:val="22"/>
         </w:rPr>
-        <w:t>o_i = ⟨ c_i, M_i, b_i, A_i, c_i ⟩</w:t>
+        <w:t>o</w:t>
+      </w:r>
+      <w:r>
+        <w:rPr>
+          <w:rFonts w:ascii="Cambria Math" w:hAnsi="Cambria Math"/>
+          <w:b/>
+          <w:color w:val="0F3C73"/>
+          <w:sz w:val="22"/>
+          <w:vertAlign w:val="subscript"/>
+        </w:rPr>
+        <w:t>i</w:t>
+      </w:r>
+      <w:r>
+        <w:rPr>
+          <w:rFonts w:ascii="Cambria Math" w:hAnsi="Cambria Math"/>
+          <w:b/>
+          <w:color w:val="0F3C73"/>
+          <w:sz w:val="22"/>
+        </w:rPr>
+        <w:t xml:space="preserve"> = ⟨ c</w:t>
+      </w:r>
+      <w:r>
+        <w:rPr>
+          <w:rFonts w:ascii="Cambria Math" w:hAnsi="Cambria Math"/>
+          <w:b/>
+          <w:color w:val="0F3C73"/>
+          <w:sz w:val="22"/>
+          <w:vertAlign w:val="subscript"/>
+        </w:rPr>
+        <w:t>i</w:t>
+      </w:r>
+      <w:r>
+        <w:rPr>
+          <w:rFonts w:ascii="Cambria Math" w:hAnsi="Cambria Math"/>
+          <w:b/>
+          <w:color w:val="0F3C73"/>
+          <w:sz w:val="22"/>
+        </w:rPr>
+        <w:t>, M</w:t>
+      </w:r>
+      <w:r>
+        <w:rPr>
+          <w:rFonts w:ascii="Cambria Math" w:hAnsi="Cambria Math"/>
+          <w:b/>
+          <w:color w:val="0F3C73"/>
+          <w:sz w:val="22"/>
+          <w:vertAlign w:val="subscript"/>
+        </w:rPr>
+        <w:t>i</w:t>
+      </w:r>
+      <w:r>
+        <w:rPr>
+          <w:rFonts w:ascii="Cambria Math" w:hAnsi="Cambria Math"/>
+          <w:b/>
+          <w:color w:val="0F3C73"/>
+          <w:sz w:val="22"/>
+        </w:rPr>
+        <w:t>, b</w:t>
+      </w:r>
+      <w:r>
+        <w:rPr>
+          <w:rFonts w:ascii="Cambria Math" w:hAnsi="Cambria Math"/>
+          <w:b/>
+          <w:color w:val="0F3C73"/>
+          <w:sz w:val="22"/>
+          <w:vertAlign w:val="subscript"/>
+        </w:rPr>
+        <w:t>i</w:t>
+      </w:r>
+      <w:r>
+        <w:rPr>
+          <w:rFonts w:ascii="Cambria Math" w:hAnsi="Cambria Math"/>
+          <w:b/>
+          <w:color w:val="0F3C73"/>
+          <w:sz w:val="22"/>
+        </w:rPr>
+        <w:t>, A</w:t>
+      </w:r>
+      <w:r>
+        <w:rPr>
+          <w:rFonts w:ascii="Cambria Math" w:hAnsi="Cambria Math"/>
+          <w:b/>
+          <w:color w:val="0F3C73"/>
+          <w:sz w:val="22"/>
+          <w:vertAlign w:val="subscript"/>
+        </w:rPr>
+        <w:t>i</w:t>
+      </w:r>
+      <w:r>
+        <w:rPr>
+          <w:rFonts w:ascii="Cambria Math" w:hAnsi="Cambria Math"/>
+          <w:b/>
+          <w:color w:val="0F3C73"/>
+          <w:sz w:val="22"/>
+        </w:rPr>
+        <w:t>, c</w:t>
+      </w:r>
+      <w:r>
+        <w:rPr>
+          <w:rFonts w:ascii="Cambria Math" w:hAnsi="Cambria Math"/>
+          <w:b/>
+          <w:color w:val="0F3C73"/>
+          <w:sz w:val="22"/>
+          <w:vertAlign w:val="subscript"/>
+        </w:rPr>
+        <w:t>i</w:t>
+      </w:r>
+      <w:r>
+        <w:rPr>
+          <w:rFonts w:ascii="Cambria Math" w:hAnsi="Cambria Math"/>
+          <w:b/>
+          <w:color w:val="0F3C73"/>
+          <w:sz w:val="22"/>
+          <w:vertAlign w:val="superscript"/>
+        </w:rPr>
+        <w:t>*</w:t>
+      </w:r>
+      <w:r>
+        <w:rPr>
+          <w:rFonts w:ascii="Cambria Math" w:hAnsi="Cambria Math"/>
+          <w:b/>
+          <w:color w:val="0F3C73"/>
+          <w:sz w:val="22"/>
+        </w:rPr>
+        <w:t xml:space="preserve"> ⟩</w:t>
       </w:r>
     </w:p>
     <w:p>
@@ -1908,7 +2257,7 @@
           <w:color w:val="24292F"/>
           <w:sz w:val="20"/>
         </w:rPr>
-        <w:t>Where:</w:t>
+        <w:t>Where each component describes a concrete physical property:</w:t>
       </w:r>
     </w:p>
     <w:p>
@@ -1925,12 +2274,40 @@
       </w:r>
       <w:r>
         <w:rPr>
+          <w:rFonts w:ascii="Calibri" w:hAnsi="Calibri"/>
+          <w:b/>
+          <w:color w:val="24292F"/>
+          <w:sz w:val="20"/>
+        </w:rPr>
+        <w:t>Color (</w:t>
+      </w:r>
+      <w:r>
+        <w:rPr>
           <w:rFonts w:ascii="Cambria Math" w:hAnsi="Cambria Math"/>
-          <w:i/>
+          <w:b/>
           <w:color w:val="0F3C73"/>
           <w:sz w:val="20"/>
         </w:rPr>
-        <w:t>c_i ∈ \{1, …, 9\}</w:t>
+        <w:t>c</w:t>
+      </w:r>
+      <w:r>
+        <w:rPr>
+          <w:rFonts w:ascii="Cambria Math" w:hAnsi="Cambria Math"/>
+          <w:b/>
+          <w:color w:val="0F3C73"/>
+          <w:sz w:val="20"/>
+          <w:vertAlign w:val="subscript"/>
+        </w:rPr>
+        <w:t>i</w:t>
+      </w:r>
+      <w:r>
+        <w:rPr>
+          <w:rFonts w:ascii="Calibri" w:hAnsi="Calibri"/>
+          <w:b/>
+          <w:color w:val="24292F"/>
+          <w:sz w:val="20"/>
+        </w:rPr>
+        <w:t>):</w:t>
       </w:r>
       <w:r>
         <w:rPr>
@@ -1938,7 +2315,43 @@
           <w:color w:val="24292F"/>
           <w:sz w:val="20"/>
         </w:rPr>
-        <w:t xml:space="preserve"> is the categorical color label;</w:t>
+        <w:t xml:space="preserve"> Categorical color label (integer </w:t>
+      </w:r>
+      <w:r>
+        <w:rPr>
+          <w:rFonts w:ascii="Cambria Math" w:hAnsi="Cambria Math"/>
+          <w:b w:val="0"/>
+          <w:color w:val="0F3C73"/>
+          <w:sz w:val="20"/>
+        </w:rPr>
+        <w:t>1 ≤ c</w:t>
+      </w:r>
+      <w:r>
+        <w:rPr>
+          <w:rFonts w:ascii="Cambria Math" w:hAnsi="Cambria Math"/>
+          <w:b w:val="0"/>
+          <w:color w:val="0F3C73"/>
+          <w:sz w:val="20"/>
+          <w:vertAlign w:val="subscript"/>
+        </w:rPr>
+        <w:t>i</w:t>
+      </w:r>
+      <w:r>
+        <w:rPr>
+          <w:rFonts w:ascii="Cambria Math" w:hAnsi="Cambria Math"/>
+          <w:b w:val="0"/>
+          <w:color w:val="0F3C73"/>
+          <w:sz w:val="20"/>
+        </w:rPr>
+        <w:t xml:space="preserve"> ≤ 9</w:t>
+      </w:r>
+      <w:r>
+        <w:rPr>
+          <w:rFonts w:ascii="Calibri" w:hAnsi="Calibri"/>
+          <w:color w:val="24292F"/>
+          <w:sz w:val="20"/>
+        </w:rPr>
+        <w:t>);</w:t>
       </w:r>
     </w:p>
     <w:p>
@@ -1955,12 +2368,40 @@
       </w:r>
       <w:r>
         <w:rPr>
+          <w:rFonts w:ascii="Calibri" w:hAnsi="Calibri"/>
+          <w:b/>
+          <w:color w:val="24292F"/>
+          <w:sz w:val="20"/>
+        </w:rPr>
+        <w:t>Spatial Mask (</w:t>
+      </w:r>
+      <w:r>
+        <w:rPr>
           <w:rFonts w:ascii="Cambria Math" w:hAnsi="Cambria Math"/>
-          <w:i/>
+          <w:b/>
           <w:color w:val="0F3C73"/>
           <w:sz w:val="20"/>
         </w:rPr>
-        <w:t>M_i ∈ \{0, 1\}^{H × W}</w:t>
+        <w:t>M</w:t>
+      </w:r>
+      <w:r>
+        <w:rPr>
+          <w:rFonts w:ascii="Cambria Math" w:hAnsi="Cambria Math"/>
+          <w:b/>
+          <w:color w:val="0F3C73"/>
+          <w:sz w:val="20"/>
+          <w:vertAlign w:val="subscript"/>
+        </w:rPr>
+        <w:t>i</w:t>
+      </w:r>
+      <w:r>
+        <w:rPr>
+          <w:rFonts w:ascii="Calibri" w:hAnsi="Calibri"/>
+          <w:b/>
+          <w:color w:val="24292F"/>
+          <w:sz w:val="20"/>
+        </w:rPr>
+        <w:t>):</w:t>
       </w:r>
       <w:r>
         <w:rPr>
@@ -1968,7 +2409,34 @@
           <w:color w:val="24292F"/>
           <w:sz w:val="20"/>
         </w:rPr>
-        <w:t xml:space="preserve"> is the binary spatial support mask;</w:t>
+        <w:t xml:space="preserve"> Binary support matrix in </w:t>
+      </w:r>
+      <w:r>
+        <w:rPr>
+          <w:rFonts w:ascii="Cambria Math" w:hAnsi="Cambria Math"/>
+          <w:b w:val="0"/>
+          <w:color w:val="0F3C73"/>
+          <w:sz w:val="20"/>
+        </w:rPr>
+        <w:t>\{0, 1\}</w:t>
+      </w:r>
+      <w:r>
+        <w:rPr>
+          <w:rFonts w:ascii="Cambria Math" w:hAnsi="Cambria Math"/>
+          <w:b w:val="0"/>
+          <w:color w:val="0F3C73"/>
+          <w:sz w:val="20"/>
+          <w:vertAlign w:val="superscript"/>
+        </w:rPr>
+        <w:t>H × W</w:t>
+      </w:r>
+      <w:r>
+        <w:rPr>
+          <w:rFonts w:ascii="Calibri" w:hAnsi="Calibri"/>
+          <w:color w:val="24292F"/>
+          <w:sz w:val="20"/>
+        </w:rPr>
+        <w:t xml:space="preserve"> denoting the exact pixel occupancy;</w:t>
       </w:r>
     </w:p>
     <w:p>
@@ -1985,12 +2453,40 @@
       </w:r>
       <w:r>
         <w:rPr>
+          <w:rFonts w:ascii="Calibri" w:hAnsi="Calibri"/>
+          <w:b/>
+          <w:color w:val="24292F"/>
+          <w:sz w:val="20"/>
+        </w:rPr>
+        <w:t>Bounding Box (</w:t>
+      </w:r>
+      <w:r>
+        <w:rPr>
           <w:rFonts w:ascii="Cambria Math" w:hAnsi="Cambria Math"/>
-          <w:i/>
+          <w:b/>
           <w:color w:val="0F3C73"/>
           <w:sz w:val="20"/>
         </w:rPr>
-        <w:t>b_i = (x_i, y_i, w_i, h_i)</w:t>
+        <w:t>b</w:t>
+      </w:r>
+      <w:r>
+        <w:rPr>
+          <w:rFonts w:ascii="Cambria Math" w:hAnsi="Cambria Math"/>
+          <w:b/>
+          <w:color w:val="0F3C73"/>
+          <w:sz w:val="20"/>
+          <w:vertAlign w:val="subscript"/>
+        </w:rPr>
+        <w:t>i</w:t>
+      </w:r>
+      <w:r>
+        <w:rPr>
+          <w:rFonts w:ascii="Calibri" w:hAnsi="Calibri"/>
+          <w:b/>
+          <w:color w:val="24292F"/>
+          <w:sz w:val="20"/>
+        </w:rPr>
+        <w:t>):</w:t>
       </w:r>
       <w:r>
         <w:rPr>
@@ -1998,7 +2494,100 @@
           <w:color w:val="24292F"/>
           <w:sz w:val="20"/>
         </w:rPr>
-        <w:t xml:space="preserve"> is the minimal axis-aligned bounding box;</w:t>
+        <w:t xml:space="preserve"> Minimal bounding box </w:t>
+      </w:r>
+      <w:r>
+        <w:rPr>
+          <w:rFonts w:ascii="Cambria Math" w:hAnsi="Cambria Math"/>
+          <w:b w:val="0"/>
+          <w:color w:val="0F3C73"/>
+          <w:sz w:val="20"/>
+        </w:rPr>
+        <w:t>(x</w:t>
+      </w:r>
+      <w:r>
+        <w:rPr>
+          <w:rFonts w:ascii="Cambria Math" w:hAnsi="Cambria Math"/>
+          <w:b w:val="0"/>
+          <w:color w:val="0F3C73"/>
+          <w:sz w:val="20"/>
+          <w:vertAlign w:val="subscript"/>
+        </w:rPr>
+        <w:t>i</w:t>
+      </w:r>
+      <w:r>
+        <w:rPr>
+          <w:rFonts w:ascii="Cambria Math" w:hAnsi="Cambria Math"/>
+          <w:b w:val="0"/>
+          <w:color w:val="0F3C73"/>
+          <w:sz w:val="20"/>
+        </w:rPr>
+        <w:t>, y</w:t>
+      </w:r>
+      <w:r>
+        <w:rPr>
+          <w:rFonts w:ascii="Cambria Math" w:hAnsi="Cambria Math"/>
+          <w:b w:val="0"/>
+          <w:color w:val="0F3C73"/>
+          <w:sz w:val="20"/>
+          <w:vertAlign w:val="subscript"/>
+        </w:rPr>
+        <w:t>i</w:t>
+      </w:r>
+      <w:r>
+        <w:rPr>
+          <w:rFonts w:ascii="Cambria Math" w:hAnsi="Cambria Math"/>
+          <w:b w:val="0"/>
+          <w:color w:val="0F3C73"/>
+          <w:sz w:val="20"/>
+        </w:rPr>
+        <w:t>, w</w:t>
+      </w:r>
+      <w:r>
+        <w:rPr>
+          <w:rFonts w:ascii="Cambria Math" w:hAnsi="Cambria Math"/>
+          <w:b w:val="0"/>
+          <w:color w:val="0F3C73"/>
+          <w:sz w:val="20"/>
+          <w:vertAlign w:val="subscript"/>
+        </w:rPr>
+        <w:t>i</w:t>
+      </w:r>
+      <w:r>
+        <w:rPr>
+          <w:rFonts w:ascii="Cambria Math" w:hAnsi="Cambria Math"/>
+          <w:b w:val="0"/>
+          <w:color w:val="0F3C73"/>
+          <w:sz w:val="20"/>
+        </w:rPr>
+        <w:t>, h</w:t>
+      </w:r>
+      <w:r>
+        <w:rPr>
+          <w:rFonts w:ascii="Cambria Math" w:hAnsi="Cambria Math"/>
+          <w:b w:val="0"/>
+          <w:color w:val="0F3C73"/>
+          <w:sz w:val="20"/>
+          <w:vertAlign w:val="subscript"/>
+        </w:rPr>
+        <w:t>i</w:t>
+      </w:r>
+      <w:r>
+        <w:rPr>
+          <w:rFonts w:ascii="Cambria Math" w:hAnsi="Cambria Math"/>
+          <w:b w:val="0"/>
+          <w:color w:val="0F3C73"/>
+          <w:sz w:val="20"/>
+        </w:rPr>
+        <w:t>)</w:t>
+      </w:r>
+      <w:r>
+        <w:rPr>
+          <w:rFonts w:ascii="Calibri" w:hAnsi="Calibri"/>
+          <w:color w:val="24292F"/>
+          <w:sz w:val="20"/>
+        </w:rPr>
+        <w:t>;</w:t>
       </w:r>
     </w:p>
     <w:p>
@@ -2015,12 +2604,40 @@
       </w:r>
       <w:r>
         <w:rPr>
+          <w:rFonts w:ascii="Calibri" w:hAnsi="Calibri"/>
+          <w:b/>
+          <w:color w:val="24292F"/>
+          <w:sz w:val="20"/>
+        </w:rPr>
+        <w:t>Area or Mass (</w:t>
+      </w:r>
+      <w:r>
+        <w:rPr>
           <w:rFonts w:ascii="Cambria Math" w:hAnsi="Cambria Math"/>
-          <w:i/>
+          <w:b/>
           <w:color w:val="0F3C73"/>
           <w:sz w:val="20"/>
         </w:rPr>
-        <w:t>A_i = ∑_{x,y} M_i(x,y)</w:t>
+        <w:t>A</w:t>
+      </w:r>
+      <w:r>
+        <w:rPr>
+          <w:rFonts w:ascii="Cambria Math" w:hAnsi="Cambria Math"/>
+          <w:b/>
+          <w:color w:val="0F3C73"/>
+          <w:sz w:val="20"/>
+          <w:vertAlign w:val="subscript"/>
+        </w:rPr>
+        <w:t>i</w:t>
+      </w:r>
+      <w:r>
+        <w:rPr>
+          <w:rFonts w:ascii="Calibri" w:hAnsi="Calibri"/>
+          <w:b/>
+          <w:color w:val="24292F"/>
+          <w:sz w:val="20"/>
+        </w:rPr>
+        <w:t>):</w:t>
       </w:r>
       <w:r>
         <w:rPr>
@@ -2028,7 +2645,7 @@
           <w:color w:val="24292F"/>
           <w:sz w:val="20"/>
         </w:rPr>
-        <w:t xml:space="preserve"> is the discrete pixel mass;</w:t>
+        <w:t xml:space="preserve"> Discrete pixel mass (total count of foreground cells);</w:t>
       </w:r>
     </w:p>
     <w:p>
@@ -2045,20 +2662,103 @@
       </w:r>
       <w:r>
         <w:rPr>
-          <w:rFonts w:ascii="Cambria Math" w:hAnsi="Cambria Math"/>
-          <w:i/>
-          <w:color w:val="0F3C73"/>
-          <w:sz w:val="20"/>
-        </w:rPr>
-        <w:t>c_i = (\bar{x}_i, \bar{y}_i)</w:t>
-      </w:r>
-      <w:r>
-        <w:rPr>
           <w:rFonts w:ascii="Calibri" w:hAnsi="Calibri"/>
           <w:color w:val="24292F"/>
           <w:sz w:val="20"/>
         </w:rPr>
-        <w:t xml:space="preserve"> is the spatial centroid.</w:t>
+        <w:t>**Centroid (</w:t>
+      </w:r>
+      <w:r>
+        <w:rPr>
+          <w:rFonts w:ascii="Cambria Math" w:hAnsi="Cambria Math"/>
+          <w:b w:val="0"/>
+          <w:color w:val="0F3C73"/>
+          <w:sz w:val="20"/>
+        </w:rPr>
+        <w:t>c</w:t>
+      </w:r>
+      <w:r>
+        <w:rPr>
+          <w:rFonts w:ascii="Cambria Math" w:hAnsi="Cambria Math"/>
+          <w:b w:val="0"/>
+          <w:color w:val="0F3C73"/>
+          <w:sz w:val="20"/>
+          <w:vertAlign w:val="subscript"/>
+        </w:rPr>
+        <w:t>i</w:t>
+      </w:r>
+      <w:r>
+        <w:rPr>
+          <w:rFonts w:ascii="Cambria Math" w:hAnsi="Cambria Math"/>
+          <w:b w:val="0"/>
+          <w:color w:val="0F3C73"/>
+          <w:sz w:val="20"/>
+          <w:vertAlign w:val="superscript"/>
+        </w:rPr>
+        <w:t>*</w:t>
+      </w:r>
+      <w:r>
+        <w:rPr>
+          <w:rFonts w:ascii="Calibri" w:hAnsi="Calibri"/>
+          <w:color w:val="24292F"/>
+          <w:sz w:val="20"/>
+        </w:rPr>
+        <w:t xml:space="preserve">):** Continuous spatial center of mass </w:t>
+      </w:r>
+      <w:r>
+        <w:rPr>
+          <w:rFonts w:ascii="Cambria Math" w:hAnsi="Cambria Math"/>
+          <w:b w:val="0"/>
+          <w:color w:val="0F3C73"/>
+          <w:sz w:val="20"/>
+        </w:rPr>
+        <w:t>(\bar{x}</w:t>
+      </w:r>
+      <w:r>
+        <w:rPr>
+          <w:rFonts w:ascii="Cambria Math" w:hAnsi="Cambria Math"/>
+          <w:b w:val="0"/>
+          <w:color w:val="0F3C73"/>
+          <w:sz w:val="20"/>
+          <w:vertAlign w:val="subscript"/>
+        </w:rPr>
+        <w:t>i</w:t>
+      </w:r>
+      <w:r>
+        <w:rPr>
+          <w:rFonts w:ascii="Cambria Math" w:hAnsi="Cambria Math"/>
+          <w:b w:val="0"/>
+          <w:color w:val="0F3C73"/>
+          <w:sz w:val="20"/>
+        </w:rPr>
+        <w:t>, \bar{y}</w:t>
+      </w:r>
+      <w:r>
+        <w:rPr>
+          <w:rFonts w:ascii="Cambria Math" w:hAnsi="Cambria Math"/>
+          <w:b w:val="0"/>
+          <w:color w:val="0F3C73"/>
+          <w:sz w:val="20"/>
+          <w:vertAlign w:val="subscript"/>
+        </w:rPr>
+        <w:t>i</w:t>
+      </w:r>
+      <w:r>
+        <w:rPr>
+          <w:rFonts w:ascii="Cambria Math" w:hAnsi="Cambria Math"/>
+          <w:b w:val="0"/>
+          <w:color w:val="0F3C73"/>
+          <w:sz w:val="20"/>
+        </w:rPr>
+        <w:t>)</w:t>
+      </w:r>
+      <w:r>
+        <w:rPr>
+          <w:rFonts w:ascii="Calibri" w:hAnsi="Calibri"/>
+          <w:color w:val="24292F"/>
+          <w:sz w:val="20"/>
+        </w:rPr>
+        <w:t>.</w:t>
       </w:r>
     </w:p>
     <w:p>
@@ -2144,7 +2844,7 @@
           <w:rFonts w:ascii="Calibri" w:hAnsi="Calibri"/>
           <w:b/>
           <w:color w:val="1E5AA0"/>
-          <w:sz w:val="24"/>
+          <w:sz w:val="23"/>
         </w:rPr>
         <w:t>2.2 The Topological Scene Graph (TSG)</w:t>
       </w:r>
@@ -2164,7 +2864,7 @@
       <w:r>
         <w:rPr>
           <w:rFonts w:ascii="Cambria Math" w:hAnsi="Cambria Math"/>
-          <w:i/>
+          <w:b w:val="0"/>
           <w:color w:val="0F3C73"/>
           <w:sz w:val="20"/>
         </w:rPr>
@@ -2181,11 +2881,49 @@
       <w:r>
         <w:rPr>
           <w:rFonts w:ascii="Cambria Math" w:hAnsi="Cambria Math"/>
-          <w:i/>
+          <w:b w:val="0"/>
           <w:color w:val="0F3C73"/>
           <w:sz w:val="20"/>
         </w:rPr>
-        <w:t>V = \{o_1, …, o_n\}</w:t>
+        <w:t>V = \{o</w:t>
+      </w:r>
+      <w:r>
+        <w:rPr>
+          <w:rFonts w:ascii="Cambria Math" w:hAnsi="Cambria Math"/>
+          <w:b w:val="0"/>
+          <w:color w:val="0F3C73"/>
+          <w:sz w:val="20"/>
+          <w:vertAlign w:val="subscript"/>
+        </w:rPr>
+        <w:t>1</w:t>
+      </w:r>
+      <w:r>
+        <w:rPr>
+          <w:rFonts w:ascii="Cambria Math" w:hAnsi="Cambria Math"/>
+          <w:b w:val="0"/>
+          <w:color w:val="0F3C73"/>
+          <w:sz w:val="20"/>
+        </w:rPr>
+        <w:t>, …, o</w:t>
+      </w:r>
+      <w:r>
+        <w:rPr>
+          <w:rFonts w:ascii="Cambria Math" w:hAnsi="Cambria Math"/>
+          <w:b w:val="0"/>
+          <w:color w:val="0F3C73"/>
+          <w:sz w:val="20"/>
+          <w:vertAlign w:val="subscript"/>
+        </w:rPr>
+        <w:t>n</w:t>
+      </w:r>
+      <w:r>
+        <w:rPr>
+          <w:rFonts w:ascii="Cambria Math" w:hAnsi="Cambria Math"/>
+          <w:b w:val="0"/>
+          <w:color w:val="0F3C73"/>
+          <w:sz w:val="20"/>
+        </w:rPr>
+        <w:t>\}</w:t>
       </w:r>
       <w:r>
         <w:rPr>
@@ -2198,11 +2936,87 @@
       <w:r>
         <w:rPr>
           <w:rFonts w:ascii="Cambria Math" w:hAnsi="Cambria Math"/>
-          <w:i/>
+          <w:b w:val="0"/>
           <w:color w:val="0F3C73"/>
           <w:sz w:val="20"/>
         </w:rPr>
-        <w:t>e_{ij} = (o_i, o_j, r, Δ \mathbf{c}_{ij}) ∈ E</w:t>
+        <w:t>e</w:t>
+      </w:r>
+      <w:r>
+        <w:rPr>
+          <w:rFonts w:ascii="Cambria Math" w:hAnsi="Cambria Math"/>
+          <w:b w:val="0"/>
+          <w:color w:val="0F3C73"/>
+          <w:sz w:val="20"/>
+          <w:vertAlign w:val="subscript"/>
+        </w:rPr>
+        <w:t>ij</w:t>
+      </w:r>
+      <w:r>
+        <w:rPr>
+          <w:rFonts w:ascii="Cambria Math" w:hAnsi="Cambria Math"/>
+          <w:b w:val="0"/>
+          <w:color w:val="0F3C73"/>
+          <w:sz w:val="20"/>
+        </w:rPr>
+        <w:t xml:space="preserve"> = (o</w:t>
+      </w:r>
+      <w:r>
+        <w:rPr>
+          <w:rFonts w:ascii="Cambria Math" w:hAnsi="Cambria Math"/>
+          <w:b w:val="0"/>
+          <w:color w:val="0F3C73"/>
+          <w:sz w:val="20"/>
+          <w:vertAlign w:val="subscript"/>
+        </w:rPr>
+        <w:t>i</w:t>
+      </w:r>
+      <w:r>
+        <w:rPr>
+          <w:rFonts w:ascii="Cambria Math" w:hAnsi="Cambria Math"/>
+          <w:b w:val="0"/>
+          <w:color w:val="0F3C73"/>
+          <w:sz w:val="20"/>
+        </w:rPr>
+        <w:t>, o</w:t>
+      </w:r>
+      <w:r>
+        <w:rPr>
+          <w:rFonts w:ascii="Cambria Math" w:hAnsi="Cambria Math"/>
+          <w:b w:val="0"/>
+          <w:color w:val="0F3C73"/>
+          <w:sz w:val="20"/>
+          <w:vertAlign w:val="subscript"/>
+        </w:rPr>
+        <w:t>j</w:t>
+      </w:r>
+      <w:r>
+        <w:rPr>
+          <w:rFonts w:ascii="Cambria Math" w:hAnsi="Cambria Math"/>
+          <w:b w:val="0"/>
+          <w:color w:val="0F3C73"/>
+          <w:sz w:val="20"/>
+        </w:rPr>
+        <w:t>, r, Δ c</w:t>
+      </w:r>
+      <w:r>
+        <w:rPr>
+          <w:rFonts w:ascii="Cambria Math" w:hAnsi="Cambria Math"/>
+          <w:b w:val="0"/>
+          <w:color w:val="0F3C73"/>
+          <w:sz w:val="20"/>
+          <w:vertAlign w:val="subscript"/>
+        </w:rPr>
+        <w:t>ij</w:t>
+      </w:r>
+      <w:r>
+        <w:rPr>
+          <w:rFonts w:ascii="Cambria Math" w:hAnsi="Cambria Math"/>
+          <w:b w:val="0"/>
+          <w:color w:val="0F3C73"/>
+          <w:sz w:val="20"/>
+        </w:rPr>
+        <w:t>) ∈ E</w:t>
       </w:r>
       <w:r>
         <w:rPr>
@@ -2245,11 +3059,21 @@
       <w:r>
         <w:rPr>
           <w:rFonts w:ascii="Cambria Math" w:hAnsi="Cambria Math"/>
-          <w:i/>
+          <w:b w:val="0"/>
           <w:color w:val="0F3C73"/>
           <w:sz w:val="20"/>
         </w:rPr>
-        <w:t>o_j</w:t>
+        <w:t>o</w:t>
+      </w:r>
+      <w:r>
+        <w:rPr>
+          <w:rFonts w:ascii="Cambria Math" w:hAnsi="Cambria Math"/>
+          <w:b w:val="0"/>
+          <w:color w:val="0F3C73"/>
+          <w:sz w:val="20"/>
+          <w:vertAlign w:val="subscript"/>
+        </w:rPr>
+        <w:t>j</w:t>
       </w:r>
       <w:r>
         <w:rPr>
@@ -2262,11 +3086,21 @@
       <w:r>
         <w:rPr>
           <w:rFonts w:ascii="Cambria Math" w:hAnsi="Cambria Math"/>
-          <w:i/>
+          <w:b w:val="0"/>
           <w:color w:val="0F3C73"/>
           <w:sz w:val="20"/>
         </w:rPr>
-        <w:t>o_i</w:t>
+        <w:t>o</w:t>
+      </w:r>
+      <w:r>
+        <w:rPr>
+          <w:rFonts w:ascii="Cambria Math" w:hAnsi="Cambria Math"/>
+          <w:b w:val="0"/>
+          <w:color w:val="0F3C73"/>
+          <w:sz w:val="20"/>
+          <w:vertAlign w:val="subscript"/>
+        </w:rPr>
+        <w:t>i</w:t>
       </w:r>
       <w:r>
         <w:rPr>
@@ -2296,11 +3130,21 @@
       <w:r>
         <w:rPr>
           <w:rFonts w:ascii="Cambria Math" w:hAnsi="Cambria Math"/>
-          <w:i/>
+          <w:b w:val="0"/>
           <w:color w:val="0F3C73"/>
           <w:sz w:val="20"/>
         </w:rPr>
-        <w:t>n_{\text{hole}}</w:t>
+        <w:t>n</w:t>
+      </w:r>
+      <w:r>
+        <w:rPr>
+          <w:rFonts w:ascii="Cambria Math" w:hAnsi="Cambria Math"/>
+          <w:b w:val="0"/>
+          <w:color w:val="0F3C73"/>
+          <w:sz w:val="20"/>
+          <w:vertAlign w:val="subscript"/>
+        </w:rPr>
+        <w:t>hole</w:t>
       </w:r>
       <w:r>
         <w:rPr>
@@ -2343,11 +3187,21 @@
       <w:r>
         <w:rPr>
           <w:rFonts w:ascii="Cambria Math" w:hAnsi="Cambria Math"/>
-          <w:i/>
+          <w:b w:val="0"/>
           <w:color w:val="0F3C73"/>
           <w:sz w:val="20"/>
         </w:rPr>
-        <w:t>o_i</w:t>
+        <w:t>o</w:t>
+      </w:r>
+      <w:r>
+        <w:rPr>
+          <w:rFonts w:ascii="Cambria Math" w:hAnsi="Cambria Math"/>
+          <w:b w:val="0"/>
+          <w:color w:val="0F3C73"/>
+          <w:sz w:val="20"/>
+          <w:vertAlign w:val="subscript"/>
+        </w:rPr>
+        <w:t>i</w:t>
       </w:r>
       <w:r>
         <w:rPr>
@@ -2360,11 +3214,21 @@
       <w:r>
         <w:rPr>
           <w:rFonts w:ascii="Cambria Math" w:hAnsi="Cambria Math"/>
-          <w:i/>
+          <w:b w:val="0"/>
           <w:color w:val="0F3C73"/>
           <w:sz w:val="20"/>
         </w:rPr>
-        <w:t>o_j</w:t>
+        <w:t>o</w:t>
+      </w:r>
+      <w:r>
+        <w:rPr>
+          <w:rFonts w:ascii="Cambria Math" w:hAnsi="Cambria Math"/>
+          <w:b w:val="0"/>
+          <w:color w:val="0F3C73"/>
+          <w:sz w:val="20"/>
+          <w:vertAlign w:val="subscript"/>
+        </w:rPr>
+        <w:t>j</w:t>
       </w:r>
       <w:r>
         <w:rPr>
@@ -2377,7 +3241,7 @@
       <w:r>
         <w:rPr>
           <w:rFonts w:ascii="Cambria Math" w:hAnsi="Cambria Math"/>
-          <w:i/>
+          <w:b w:val="0"/>
           <w:color w:val="0F3C73"/>
           <w:sz w:val="20"/>
         </w:rPr>
@@ -2394,11 +3258,49 @@
       <w:r>
         <w:rPr>
           <w:rFonts w:ascii="Cambria Math" w:hAnsi="Cambria Math"/>
-          <w:i/>
+          <w:b w:val="0"/>
           <w:color w:val="0F3C73"/>
           <w:sz w:val="20"/>
         </w:rPr>
-        <w:t>\text{dist}(M_i, M_j) ≤ 1</w:t>
+        <w:t>dist(M</w:t>
+      </w:r>
+      <w:r>
+        <w:rPr>
+          <w:rFonts w:ascii="Cambria Math" w:hAnsi="Cambria Math"/>
+          <w:b w:val="0"/>
+          <w:color w:val="0F3C73"/>
+          <w:sz w:val="20"/>
+          <w:vertAlign w:val="subscript"/>
+        </w:rPr>
+        <w:t>i</w:t>
+      </w:r>
+      <w:r>
+        <w:rPr>
+          <w:rFonts w:ascii="Cambria Math" w:hAnsi="Cambria Math"/>
+          <w:b w:val="0"/>
+          <w:color w:val="0F3C73"/>
+          <w:sz w:val="20"/>
+        </w:rPr>
+        <w:t>, M</w:t>
+      </w:r>
+      <w:r>
+        <w:rPr>
+          <w:rFonts w:ascii="Cambria Math" w:hAnsi="Cambria Math"/>
+          <w:b w:val="0"/>
+          <w:color w:val="0F3C73"/>
+          <w:sz w:val="20"/>
+          <w:vertAlign w:val="subscript"/>
+        </w:rPr>
+        <w:t>j</w:t>
+      </w:r>
+      <w:r>
+        <w:rPr>
+          <w:rFonts w:ascii="Cambria Math" w:hAnsi="Cambria Math"/>
+          <w:b w:val="0"/>
+          <w:color w:val="0F3C73"/>
+          <w:sz w:val="20"/>
+        </w:rPr>
+        <w:t>) ≤ 1</w:t>
       </w:r>
       <w:r>
         <w:rPr>
@@ -2441,11 +3343,59 @@
       <w:r>
         <w:rPr>
           <w:rFonts w:ascii="Cambria Math" w:hAnsi="Cambria Math"/>
-          <w:i/>
+          <w:b w:val="0"/>
           <w:color w:val="0F3C73"/>
           <w:sz w:val="20"/>
         </w:rPr>
-        <w:t>Δ \mathbf{c}_{ij} = \mathbf{c}_j - c_i</w:t>
+        <w:t>Δ c</w:t>
+      </w:r>
+      <w:r>
+        <w:rPr>
+          <w:rFonts w:ascii="Cambria Math" w:hAnsi="Cambria Math"/>
+          <w:b w:val="0"/>
+          <w:color w:val="0F3C73"/>
+          <w:sz w:val="20"/>
+          <w:vertAlign w:val="subscript"/>
+        </w:rPr>
+        <w:t>ij</w:t>
+      </w:r>
+      <w:r>
+        <w:rPr>
+          <w:rFonts w:ascii="Cambria Math" w:hAnsi="Cambria Math"/>
+          <w:b w:val="0"/>
+          <w:color w:val="0F3C73"/>
+          <w:sz w:val="20"/>
+        </w:rPr>
+        <w:t xml:space="preserve"> = c</w:t>
+      </w:r>
+      <w:r>
+        <w:rPr>
+          <w:rFonts w:ascii="Cambria Math" w:hAnsi="Cambria Math"/>
+          <w:b w:val="0"/>
+          <w:color w:val="0F3C73"/>
+          <w:sz w:val="20"/>
+          <w:vertAlign w:val="subscript"/>
+        </w:rPr>
+        <w:t>j</w:t>
+      </w:r>
+      <w:r>
+        <w:rPr>
+          <w:rFonts w:ascii="Cambria Math" w:hAnsi="Cambria Math"/>
+          <w:b w:val="0"/>
+          <w:color w:val="0F3C73"/>
+          <w:sz w:val="20"/>
+        </w:rPr>
+        <w:t xml:space="preserve"> - c</w:t>
+      </w:r>
+      <w:r>
+        <w:rPr>
+          <w:rFonts w:ascii="Cambria Math" w:hAnsi="Cambria Math"/>
+          <w:b w:val="0"/>
+          <w:color w:val="0F3C73"/>
+          <w:sz w:val="20"/>
+          <w:vertAlign w:val="subscript"/>
+        </w:rPr>
+        <w:t>i</w:t>
       </w:r>
       <w:r>
         <w:rPr>
@@ -2466,7 +3416,7 @@
           <w:rFonts w:ascii="Calibri" w:hAnsi="Calibri"/>
           <w:b/>
           <w:color w:val="1E5AA0"/>
-          <w:sz w:val="24"/>
+          <w:sz w:val="23"/>
         </w:rPr>
         <w:t>2.3 Strongly-Typed Domain-Specific Language (DSL)</w:t>
       </w:r>
@@ -2614,7 +3564,35 @@
                 <w:color w:val="24292F"/>
                 <w:sz w:val="18"/>
               </w:rPr>
-              <w:t>Affine (Dihedral Group $\mathcal{D}_4$)</w:t>
+              <w:t xml:space="preserve">Affine (Dihedral Group </w:t>
+            </w:r>
+            <w:r>
+              <w:rPr>
+                <w:rFonts w:ascii="Cambria Math" w:hAnsi="Cambria Math"/>
+                <w:b/>
+                <w:color w:val="0F3C73"/>
+                <w:sz w:val="18"/>
+              </w:rPr>
+              <w:t>D</w:t>
+            </w:r>
+            <w:r>
+              <w:rPr>
+                <w:rFonts w:ascii="Cambria Math" w:hAnsi="Cambria Math"/>
+                <w:b/>
+                <w:color w:val="0F3C73"/>
+                <w:sz w:val="18"/>
+                <w:vertAlign w:val="subscript"/>
+              </w:rPr>
+              <w:t>4</w:t>
+            </w:r>
+            <w:r>
+              <w:rPr>
+                <w:rFonts w:ascii="Calibri" w:hAnsi="Calibri"/>
+                <w:b/>
+                <w:color w:val="24292F"/>
+                <w:sz w:val="18"/>
+              </w:rPr>
+              <w:t>)</w:t>
             </w:r>
           </w:p>
         </w:tc>
@@ -2820,7 +3798,7 @@
             <w:r>
               <w:rPr>
                 <w:rFonts w:ascii="Cambria Math" w:hAnsi="Cambria Math"/>
-                <w:i/>
+                <w:b w:val="0"/>
                 <w:color w:val="0F3C73"/>
                 <w:sz w:val="18"/>
               </w:rPr>
@@ -2919,7 +3897,7 @@
             <w:r>
               <w:rPr>
                 <w:rFonts w:ascii="Cambria Math" w:hAnsi="Cambria Math"/>
-                <w:i/>
+                <w:b w:val="0"/>
                 <w:color w:val="0F3C73"/>
                 <w:sz w:val="18"/>
               </w:rPr>
@@ -3018,7 +3996,7 @@
             <w:r>
               <w:rPr>
                 <w:rFonts w:ascii="Cambria Math" w:hAnsi="Cambria Math"/>
-                <w:i/>
+                <w:b w:val="0"/>
                 <w:color w:val="0F3C73"/>
                 <w:sz w:val="18"/>
               </w:rPr>
@@ -3134,7 +4112,7 @@
             <w:r>
               <w:rPr>
                 <w:rFonts w:ascii="Cambria Math" w:hAnsi="Cambria Math"/>
-                <w:i/>
+                <w:b w:val="0"/>
                 <w:color w:val="0F3C73"/>
                 <w:sz w:val="18"/>
               </w:rPr>
@@ -3340,12 +4318,12 @@
           <w:color w:val="24292F"/>
           <w:sz w:val="20"/>
         </w:rPr>
-        <w:t>Two structural primitives leverage linear algebra via Kronecker products (</w:t>
+        <w:t>Two structural primitives leverage matrix algebra via Kronecker products (</w:t>
       </w:r>
       <w:r>
         <w:rPr>
           <w:rFonts w:ascii="Cambria Math" w:hAnsi="Cambria Math"/>
-          <w:i/>
+          <w:b w:val="0"/>
           <w:color w:val="0F3C73"/>
           <w:sz w:val="20"/>
         </w:rPr>
@@ -3357,7 +4335,7 @@
           <w:color w:val="24292F"/>
           <w:sz w:val="20"/>
         </w:rPr>
-        <w:t>), formalizing self-similarity and discrete magnification:</w:t>
+        <w:t>), capturing fractal self-similarity and discrete resolution scaling:</w:t>
       </w:r>
     </w:p>
     <w:tbl>
@@ -3433,7 +4411,7 @@
                 <w:color w:val="FFFFFF"/>
                 <w:sz w:val="19"/>
               </w:rPr>
-              <w:t>Mathematical Definition</w:t>
+              <w:t>Transformation Description</w:t>
             </w:r>
           </w:p>
         </w:tc>
@@ -3459,7 +4437,7 @@
                 <w:color w:val="FFFFFF"/>
                 <w:sz w:val="19"/>
               </w:rPr>
-              <w:t>Linear Algebra Formulation</w:t>
+              <w:t>Exact Matrix Formulation</w:t>
             </w:r>
           </w:p>
         </w:tc>
@@ -3515,7 +4493,24 @@
                 <w:color w:val="24292F"/>
                 <w:sz w:val="18"/>
               </w:rPr>
-              <w:t>Replaces each active foreground cell with a full replica of the grid</w:t>
+              <w:t xml:space="preserve">Replaces each active foreground cell with a full replica of grid </w:t>
+            </w:r>
+            <w:r>
+              <w:rPr>
+                <w:rFonts w:ascii="Cambria Math" w:hAnsi="Cambria Math"/>
+                <w:b w:val="0"/>
+                <w:color w:val="0F3C73"/>
+                <w:sz w:val="18"/>
+              </w:rPr>
+              <w:t>G</w:t>
+            </w:r>
+            <w:r>
+              <w:rPr>
+                <w:rFonts w:ascii="Calibri" w:hAnsi="Calibri"/>
+                <w:color w:val="24292F"/>
+                <w:sz w:val="18"/>
+              </w:rPr>
+              <w:t>, creating fractal self-similarity</w:t>
             </w:r>
           </w:p>
         </w:tc>
@@ -3537,11 +4532,49 @@
             <w:r>
               <w:rPr>
                 <w:rFonts w:ascii="Cambria Math" w:hAnsi="Cambria Math"/>
-                <w:i/>
+                <w:b w:val="0"/>
                 <w:color w:val="0F3C73"/>
                 <w:sz w:val="18"/>
               </w:rPr>
-              <w:t>G_out = 𝕀(G &gt; 0) ⊗ G</w:t>
+              <w:t>G</w:t>
+            </w:r>
+            <w:r>
+              <w:rPr>
+                <w:rFonts w:ascii="Cambria Math" w:hAnsi="Cambria Math"/>
+                <w:b w:val="0"/>
+                <w:color w:val="0F3C73"/>
+                <w:sz w:val="18"/>
+                <w:vertAlign w:val="subscript"/>
+              </w:rPr>
+              <w:t>out</w:t>
+            </w:r>
+            <w:r>
+              <w:rPr>
+                <w:rFonts w:ascii="Cambria Math" w:hAnsi="Cambria Math"/>
+                <w:b w:val="0"/>
+                <w:color w:val="0F3C73"/>
+                <w:sz w:val="18"/>
+              </w:rPr>
+              <w:t xml:space="preserve"> = (G &gt; 0) ⊗ G</w:t>
+            </w:r>
+            <w:r>
+              <w:rPr>
+                <w:rFonts w:ascii="Calibri" w:hAnsi="Calibri"/>
+                <w:color w:val="24292F"/>
+                <w:sz w:val="18"/>
+              </w:rPr>
+              <w:t xml:space="preserve"> </w:t>
+            </w:r>
+            <w:r>
+              <w:br/>
+            </w:r>
+            <w:r>
+              <w:rPr>
+                <w:rFonts w:ascii="Calibri" w:hAnsi="Calibri"/>
+                <w:color w:val="24292F"/>
+                <w:sz w:val="18"/>
+              </w:rPr>
+              <w:t>*(Kronecker product of the binary active mask by the original grid)*</w:t>
             </w:r>
           </w:p>
         </w:tc>
@@ -3597,12 +4630,12 @@
                 <w:color w:val="24292F"/>
                 <w:sz w:val="18"/>
               </w:rPr>
-              <w:t xml:space="preserve">Uniform nearest-neighbor magnification by integer factor </w:t>
+              <w:t xml:space="preserve">Uniform nearest-neighbor magnification by integer scale factor </w:t>
             </w:r>
             <w:r>
               <w:rPr>
                 <w:rFonts w:ascii="Cambria Math" w:hAnsi="Cambria Math"/>
-                <w:i/>
+                <w:b w:val="0"/>
                 <w:color w:val="0F3C73"/>
                 <w:sz w:val="18"/>
               </w:rPr>
@@ -3628,11 +4661,76 @@
             <w:r>
               <w:rPr>
                 <w:rFonts w:ascii="Cambria Math" w:hAnsi="Cambria Math"/>
-                <w:i/>
+                <w:b w:val="0"/>
                 <w:color w:val="0F3C73"/>
                 <w:sz w:val="18"/>
               </w:rPr>
-              <w:t>G_out = G ⊗ J_{k×k}</w:t>
+              <w:t>G</w:t>
+            </w:r>
+            <w:r>
+              <w:rPr>
+                <w:rFonts w:ascii="Cambria Math" w:hAnsi="Cambria Math"/>
+                <w:b w:val="0"/>
+                <w:color w:val="0F3C73"/>
+                <w:sz w:val="18"/>
+                <w:vertAlign w:val="subscript"/>
+              </w:rPr>
+              <w:t>out</w:t>
+            </w:r>
+            <w:r>
+              <w:rPr>
+                <w:rFonts w:ascii="Cambria Math" w:hAnsi="Cambria Math"/>
+                <w:b w:val="0"/>
+                <w:color w:val="0F3C73"/>
+                <w:sz w:val="18"/>
+              </w:rPr>
+              <w:t xml:space="preserve"> = G ⊗ 1</w:t>
+            </w:r>
+            <w:r>
+              <w:rPr>
+                <w:rFonts w:ascii="Cambria Math" w:hAnsi="Cambria Math"/>
+                <w:b w:val="0"/>
+                <w:color w:val="0F3C73"/>
+                <w:sz w:val="18"/>
+                <w:vertAlign w:val="subscript"/>
+              </w:rPr>
+              <w:t>k × k</w:t>
+            </w:r>
+            <w:r>
+              <w:rPr>
+                <w:rFonts w:ascii="Calibri" w:hAnsi="Calibri"/>
+                <w:color w:val="24292F"/>
+                <w:sz w:val="18"/>
+              </w:rPr>
+              <w:t xml:space="preserve"> </w:t>
+            </w:r>
+            <w:r>
+              <w:br/>
+            </w:r>
+            <w:r>
+              <w:rPr>
+                <w:rFonts w:ascii="Calibri" w:hAnsi="Calibri"/>
+                <w:color w:val="24292F"/>
+                <w:sz w:val="18"/>
+              </w:rPr>
+              <w:t xml:space="preserve">*(Kronecker product of the grid by a unit block of size </w:t>
+            </w:r>
+            <w:r>
+              <w:rPr>
+                <w:rFonts w:ascii="Cambria Math" w:hAnsi="Cambria Math"/>
+                <w:b w:val="0"/>
+                <w:color w:val="0F3C73"/>
+                <w:sz w:val="18"/>
+              </w:rPr>
+              <w:t>k × k</w:t>
+            </w:r>
+            <w:r>
+              <w:rPr>
+                <w:rFonts w:ascii="Calibri" w:hAnsi="Calibri"/>
+                <w:color w:val="24292F"/>
+                <w:sz w:val="18"/>
+              </w:rPr>
+              <w:t>)*</w:t>
             </w:r>
           </w:p>
         </w:tc>
@@ -3653,7 +4751,7 @@
           <w:rFonts w:ascii="Calibri" w:hAnsi="Calibri"/>
           <w:b/>
           <w:color w:val="1E5AA0"/>
-          <w:sz w:val="24"/>
+          <w:sz w:val="23"/>
         </w:rPr>
         <w:t>2.4 Heuristic Hypothesis Pruning (TSG / Delta Pruning)</w:t>
       </w:r>
@@ -3750,11 +4848,40 @@
       <w:r>
         <w:rPr>
           <w:rFonts w:ascii="Cambria Math" w:hAnsi="Cambria Math"/>
-          <w:i/>
+          <w:b w:val="0"/>
           <w:color w:val="0F3C73"/>
           <w:sz w:val="20"/>
         </w:rPr>
-        <w:t>H_{out} = W_{in}</w:t>
+        <w:t>H</w:t>
+      </w:r>
+      <w:r>
+        <w:rPr>
+          <w:rFonts w:ascii="Cambria Math" w:hAnsi="Cambria Math"/>
+          <w:b w:val="0"/>
+          <w:color w:val="0F3C73"/>
+          <w:sz w:val="20"/>
+          <w:vertAlign w:val="subscript"/>
+        </w:rPr>
+        <w:t>out</w:t>
+      </w:r>
+      <w:r>
+        <w:rPr>
+          <w:rFonts w:ascii="Cambria Math" w:hAnsi="Cambria Math"/>
+          <w:b w:val="0"/>
+          <w:color w:val="0F3C73"/>
+          <w:sz w:val="20"/>
+        </w:rPr>
+        <w:t xml:space="preserve"> = W</w:t>
+      </w:r>
+      <w:r>
+        <w:rPr>
+          <w:rFonts w:ascii="Cambria Math" w:hAnsi="Cambria Math"/>
+          <w:b w:val="0"/>
+          <w:color w:val="0F3C73"/>
+          <w:sz w:val="20"/>
+          <w:vertAlign w:val="subscript"/>
+        </w:rPr>
+        <w:t>in</w:t>
       </w:r>
       <w:r>
         <w:rPr>
@@ -3767,11 +4894,40 @@
       <w:r>
         <w:rPr>
           <w:rFonts w:ascii="Cambria Math" w:hAnsi="Cambria Math"/>
-          <w:i/>
+          <w:b w:val="0"/>
           <w:color w:val="0F3C73"/>
           <w:sz w:val="20"/>
         </w:rPr>
-        <w:t>W_{out} = H_{in}</w:t>
+        <w:t>W</w:t>
+      </w:r>
+      <w:r>
+        <w:rPr>
+          <w:rFonts w:ascii="Cambria Math" w:hAnsi="Cambria Math"/>
+          <w:b w:val="0"/>
+          <w:color w:val="0F3C73"/>
+          <w:sz w:val="20"/>
+          <w:vertAlign w:val="subscript"/>
+        </w:rPr>
+        <w:t>out</w:t>
+      </w:r>
+      <w:r>
+        <w:rPr>
+          <w:rFonts w:ascii="Cambria Math" w:hAnsi="Cambria Math"/>
+          <w:b w:val="0"/>
+          <w:color w:val="0F3C73"/>
+          <w:sz w:val="20"/>
+        </w:rPr>
+        <w:t xml:space="preserve"> = H</w:t>
+      </w:r>
+      <w:r>
+        <w:rPr>
+          <w:rFonts w:ascii="Cambria Math" w:hAnsi="Cambria Math"/>
+          <w:b w:val="0"/>
+          <w:color w:val="0F3C73"/>
+          <w:sz w:val="20"/>
+          <w:vertAlign w:val="subscript"/>
+        </w:rPr>
+        <w:t>in</w:t>
       </w:r>
       <w:r>
         <w:rPr>
@@ -3814,7 +4970,7 @@
       <w:r>
         <w:rPr>
           <w:rFonts w:ascii="Cambria Math" w:hAnsi="Cambria Math"/>
-          <w:i/>
+          <w:b w:val="0"/>
           <w:color w:val="0F3C73"/>
           <w:sz w:val="20"/>
         </w:rPr>
@@ -3878,11 +5034,50 @@
       <w:r>
         <w:rPr>
           <w:rFonts w:ascii="Cambria Math" w:hAnsi="Cambria Math"/>
-          <w:i/>
+          <w:b w:val="0"/>
           <w:color w:val="0F3C73"/>
           <w:sz w:val="20"/>
         </w:rPr>
-        <w:t>H_{out} = H_{in}^2</w:t>
+        <w:t>H</w:t>
+      </w:r>
+      <w:r>
+        <w:rPr>
+          <w:rFonts w:ascii="Cambria Math" w:hAnsi="Cambria Math"/>
+          <w:b w:val="0"/>
+          <w:color w:val="0F3C73"/>
+          <w:sz w:val="20"/>
+          <w:vertAlign w:val="subscript"/>
+        </w:rPr>
+        <w:t>out</w:t>
+      </w:r>
+      <w:r>
+        <w:rPr>
+          <w:rFonts w:ascii="Cambria Math" w:hAnsi="Cambria Math"/>
+          <w:b w:val="0"/>
+          <w:color w:val="0F3C73"/>
+          <w:sz w:val="20"/>
+        </w:rPr>
+        <w:t xml:space="preserve"> = H</w:t>
+      </w:r>
+      <w:r>
+        <w:rPr>
+          <w:rFonts w:ascii="Cambria Math" w:hAnsi="Cambria Math"/>
+          <w:b w:val="0"/>
+          <w:color w:val="0F3C73"/>
+          <w:sz w:val="20"/>
+          <w:vertAlign w:val="subscript"/>
+        </w:rPr>
+        <w:t>in</w:t>
+      </w:r>
+      <w:r>
+        <w:rPr>
+          <w:rFonts w:ascii="Cambria Math" w:hAnsi="Cambria Math"/>
+          <w:b w:val="0"/>
+          <w:color w:val="0F3C73"/>
+          <w:sz w:val="20"/>
+          <w:vertAlign w:val="superscript"/>
+        </w:rPr>
+        <w:t>2</w:t>
       </w:r>
       <w:r>
         <w:rPr>
@@ -3895,11 +5090,50 @@
       <w:r>
         <w:rPr>
           <w:rFonts w:ascii="Cambria Math" w:hAnsi="Cambria Math"/>
-          <w:i/>
+          <w:b w:val="0"/>
           <w:color w:val="0F3C73"/>
           <w:sz w:val="20"/>
         </w:rPr>
-        <w:t>W_{out} = W_{in}^2</w:t>
+        <w:t>W</w:t>
+      </w:r>
+      <w:r>
+        <w:rPr>
+          <w:rFonts w:ascii="Cambria Math" w:hAnsi="Cambria Math"/>
+          <w:b w:val="0"/>
+          <w:color w:val="0F3C73"/>
+          <w:sz w:val="20"/>
+          <w:vertAlign w:val="subscript"/>
+        </w:rPr>
+        <w:t>out</w:t>
+      </w:r>
+      <w:r>
+        <w:rPr>
+          <w:rFonts w:ascii="Cambria Math" w:hAnsi="Cambria Math"/>
+          <w:b w:val="0"/>
+          <w:color w:val="0F3C73"/>
+          <w:sz w:val="20"/>
+        </w:rPr>
+        <w:t xml:space="preserve"> = W</w:t>
+      </w:r>
+      <w:r>
+        <w:rPr>
+          <w:rFonts w:ascii="Cambria Math" w:hAnsi="Cambria Math"/>
+          <w:b w:val="0"/>
+          <w:color w:val="0F3C73"/>
+          <w:sz w:val="20"/>
+          <w:vertAlign w:val="subscript"/>
+        </w:rPr>
+        <w:t>in</w:t>
+      </w:r>
+      <w:r>
+        <w:rPr>
+          <w:rFonts w:ascii="Cambria Math" w:hAnsi="Cambria Math"/>
+          <w:b w:val="0"/>
+          <w:color w:val="0F3C73"/>
+          <w:sz w:val="20"/>
+          <w:vertAlign w:val="superscript"/>
+        </w:rPr>
+        <w:t>2</w:t>
       </w:r>
       <w:r>
         <w:rPr>
@@ -3993,11 +5227,30 @@
       <w:r>
         <w:rPr>
           <w:rFonts w:ascii="Cambria Math" w:hAnsi="Cambria Math"/>
-          <w:i/>
+          <w:b w:val="0"/>
           <w:color w:val="0F3C73"/>
           <w:sz w:val="20"/>
         </w:rPr>
-        <w:t>c ∈ Colors(G_out)</w:t>
+        <w:t>c ∈ Colors(G</w:t>
+      </w:r>
+      <w:r>
+        <w:rPr>
+          <w:rFonts w:ascii="Cambria Math" w:hAnsi="Cambria Math"/>
+          <w:b w:val="0"/>
+          <w:color w:val="0F3C73"/>
+          <w:sz w:val="20"/>
+          <w:vertAlign w:val="subscript"/>
+        </w:rPr>
+        <w:t>out</w:t>
+      </w:r>
+      <w:r>
+        <w:rPr>
+          <w:rFonts w:ascii="Cambria Math" w:hAnsi="Cambria Math"/>
+          <w:b w:val="0"/>
+          <w:color w:val="0F3C73"/>
+          <w:sz w:val="20"/>
+        </w:rPr>
+        <w:t>)</w:t>
       </w:r>
       <w:r>
         <w:rPr>
@@ -4048,7 +5301,7 @@
           <w:rFonts w:ascii="Calibri" w:hAnsi="Calibri"/>
           <w:b/>
           <w:color w:val="1E5AA0"/>
-          <w:sz w:val="24"/>
+          <w:sz w:val="23"/>
         </w:rPr>
         <w:t>2.5 Deterministic Verification &amp; Loss Function</w:t>
       </w:r>
@@ -4068,11 +5321,68 @@
       <w:r>
         <w:rPr>
           <w:rFonts w:ascii="Cambria Math" w:hAnsi="Cambria Math"/>
-          <w:i/>
+          <w:b w:val="0"/>
           <w:color w:val="0F3C73"/>
           <w:sz w:val="20"/>
         </w:rPr>
-        <w:t>P = (f_1, f_2, …, f_d)</w:t>
+        <w:t>P = (f</w:t>
+      </w:r>
+      <w:r>
+        <w:rPr>
+          <w:rFonts w:ascii="Cambria Math" w:hAnsi="Cambria Math"/>
+          <w:b w:val="0"/>
+          <w:color w:val="0F3C73"/>
+          <w:sz w:val="20"/>
+          <w:vertAlign w:val="subscript"/>
+        </w:rPr>
+        <w:t>1</w:t>
+      </w:r>
+      <w:r>
+        <w:rPr>
+          <w:rFonts w:ascii="Cambria Math" w:hAnsi="Cambria Math"/>
+          <w:b w:val="0"/>
+          <w:color w:val="0F3C73"/>
+          <w:sz w:val="20"/>
+        </w:rPr>
+        <w:t>, f</w:t>
+      </w:r>
+      <w:r>
+        <w:rPr>
+          <w:rFonts w:ascii="Cambria Math" w:hAnsi="Cambria Math"/>
+          <w:b w:val="0"/>
+          <w:color w:val="0F3C73"/>
+          <w:sz w:val="20"/>
+          <w:vertAlign w:val="subscript"/>
+        </w:rPr>
+        <w:t>2</w:t>
+      </w:r>
+      <w:r>
+        <w:rPr>
+          <w:rFonts w:ascii="Cambria Math" w:hAnsi="Cambria Math"/>
+          <w:b w:val="0"/>
+          <w:color w:val="0F3C73"/>
+          <w:sz w:val="20"/>
+        </w:rPr>
+        <w:t>, …, f</w:t>
+      </w:r>
+      <w:r>
+        <w:rPr>
+          <w:rFonts w:ascii="Cambria Math" w:hAnsi="Cambria Math"/>
+          <w:b w:val="0"/>
+          <w:color w:val="0F3C73"/>
+          <w:sz w:val="20"/>
+          <w:vertAlign w:val="subscript"/>
+        </w:rPr>
+        <w:t>d</w:t>
+      </w:r>
+      <w:r>
+        <w:rPr>
+          <w:rFonts w:ascii="Cambria Math" w:hAnsi="Cambria Math"/>
+          <w:b w:val="0"/>
+          <w:color w:val="0F3C73"/>
+          <w:sz w:val="20"/>
+        </w:rPr>
+        <w:t>)</w:t>
       </w:r>
       <w:r>
         <w:rPr>
@@ -4080,16 +5390,16 @@
           <w:color w:val="24292F"/>
           <w:sz w:val="20"/>
         </w:rPr>
-        <w:t xml:space="preserve">, the program is executed deterministically across all demonstration pairs </w:t>
+        <w:t xml:space="preserve">, the candidate program is deterministically verified across all </w:t>
       </w:r>
       <w:r>
         <w:rPr>
           <w:rFonts w:ascii="Cambria Math" w:hAnsi="Cambria Math"/>
-          <w:i/>
+          <w:b w:val="0"/>
           <w:color w:val="0F3C73"/>
           <w:sz w:val="20"/>
         </w:rPr>
-        <w:t>\{(I_k, O_k)\}_{k=1}^{K}</w:t>
+        <w:t>K</w:t>
       </w:r>
       <w:r>
         <w:rPr>
@@ -4097,7 +5407,100 @@
           <w:color w:val="24292F"/>
           <w:sz w:val="20"/>
         </w:rPr>
-        <w:t>. The verification loss is defined as:</w:t>
+        <w:t xml:space="preserve"> training demonstration pairs </w:t>
+      </w:r>
+      <w:r>
+        <w:rPr>
+          <w:rFonts w:ascii="Cambria Math" w:hAnsi="Cambria Math"/>
+          <w:b w:val="0"/>
+          <w:color w:val="0F3C73"/>
+          <w:sz w:val="20"/>
+        </w:rPr>
+        <w:t>\{(I</w:t>
+      </w:r>
+      <w:r>
+        <w:rPr>
+          <w:rFonts w:ascii="Cambria Math" w:hAnsi="Cambria Math"/>
+          <w:b w:val="0"/>
+          <w:color w:val="0F3C73"/>
+          <w:sz w:val="20"/>
+          <w:vertAlign w:val="subscript"/>
+        </w:rPr>
+        <w:t>1</w:t>
+      </w:r>
+      <w:r>
+        <w:rPr>
+          <w:rFonts w:ascii="Cambria Math" w:hAnsi="Cambria Math"/>
+          <w:b w:val="0"/>
+          <w:color w:val="0F3C73"/>
+          <w:sz w:val="20"/>
+        </w:rPr>
+        <w:t>, O</w:t>
+      </w:r>
+      <w:r>
+        <w:rPr>
+          <w:rFonts w:ascii="Cambria Math" w:hAnsi="Cambria Math"/>
+          <w:b w:val="0"/>
+          <w:color w:val="0F3C73"/>
+          <w:sz w:val="20"/>
+          <w:vertAlign w:val="subscript"/>
+        </w:rPr>
+        <w:t>1</w:t>
+      </w:r>
+      <w:r>
+        <w:rPr>
+          <w:rFonts w:ascii="Cambria Math" w:hAnsi="Cambria Math"/>
+          <w:b w:val="0"/>
+          <w:color w:val="0F3C73"/>
+          <w:sz w:val="20"/>
+        </w:rPr>
+        <w:t>), …, (I</w:t>
+      </w:r>
+      <w:r>
+        <w:rPr>
+          <w:rFonts w:ascii="Cambria Math" w:hAnsi="Cambria Math"/>
+          <w:b w:val="0"/>
+          <w:color w:val="0F3C73"/>
+          <w:sz w:val="20"/>
+          <w:vertAlign w:val="subscript"/>
+        </w:rPr>
+        <w:t>K</w:t>
+      </w:r>
+      <w:r>
+        <w:rPr>
+          <w:rFonts w:ascii="Cambria Math" w:hAnsi="Cambria Math"/>
+          <w:b w:val="0"/>
+          <w:color w:val="0F3C73"/>
+          <w:sz w:val="20"/>
+        </w:rPr>
+        <w:t>, O</w:t>
+      </w:r>
+      <w:r>
+        <w:rPr>
+          <w:rFonts w:ascii="Cambria Math" w:hAnsi="Cambria Math"/>
+          <w:b w:val="0"/>
+          <w:color w:val="0F3C73"/>
+          <w:sz w:val="20"/>
+          <w:vertAlign w:val="subscript"/>
+        </w:rPr>
+        <w:t>K</w:t>
+      </w:r>
+      <w:r>
+        <w:rPr>
+          <w:rFonts w:ascii="Cambria Math" w:hAnsi="Cambria Math"/>
+          <w:b w:val="0"/>
+          <w:color w:val="0F3C73"/>
+          <w:sz w:val="20"/>
+        </w:rPr>
+        <w:t>)\}</w:t>
+      </w:r>
+      <w:r>
+        <w:rPr>
+          <w:rFonts w:ascii="Calibri" w:hAnsi="Calibri"/>
+          <w:color w:val="24292F"/>
+          <w:sz w:val="20"/>
+        </w:rPr>
+        <w:t>. The evaluation function measures exact pixel divergence:</w:t>
       </w:r>
     </w:p>
     <w:p>
@@ -4108,11 +5511,108 @@
       <w:r>
         <w:rPr>
           <w:rFonts w:ascii="Cambria Math" w:hAnsi="Cambria Math"/>
-          <w:i/>
+          <w:b/>
           <w:color w:val="0F3C73"/>
           <w:sz w:val="22"/>
         </w:rPr>
-        <w:t>Loss(P) = ∑_{k=1..K} ‖ P(I_k) - O_k ‖₀     (\text{with } Loss = ∞ \text{ if } shape(P(I_k)) ≠ shape(O_k))</w:t>
+        <w:t>Loss(P) = ∑ (k=1..K) Divergence(P(I</w:t>
+      </w:r>
+      <w:r>
+        <w:rPr>
+          <w:rFonts w:ascii="Cambria Math" w:hAnsi="Cambria Math"/>
+          <w:b/>
+          <w:color w:val="0F3C73"/>
+          <w:sz w:val="22"/>
+          <w:vertAlign w:val="subscript"/>
+        </w:rPr>
+        <w:t>k</w:t>
+      </w:r>
+      <w:r>
+        <w:rPr>
+          <w:rFonts w:ascii="Cambria Math" w:hAnsi="Cambria Math"/>
+          <w:b/>
+          <w:color w:val="0F3C73"/>
+          <w:sz w:val="22"/>
+        </w:rPr>
+        <w:t>), O</w:t>
+      </w:r>
+      <w:r>
+        <w:rPr>
+          <w:rFonts w:ascii="Cambria Math" w:hAnsi="Cambria Math"/>
+          <w:b/>
+          <w:color w:val="0F3C73"/>
+          <w:sz w:val="22"/>
+          <w:vertAlign w:val="subscript"/>
+        </w:rPr>
+        <w:t>k</w:t>
+      </w:r>
+      <w:r>
+        <w:rPr>
+          <w:rFonts w:ascii="Cambria Math" w:hAnsi="Cambria Math"/>
+          <w:b/>
+          <w:color w:val="0F3C73"/>
+          <w:sz w:val="22"/>
+        </w:rPr>
+        <w:t>)</w:t>
+      </w:r>
+    </w:p>
+    <w:p>
+      <w:pPr>
+        <w:spacing w:before="20" w:after="40" w:line="276" w:lineRule="auto"/>
+        <w:ind w:left="360"/>
+      </w:pPr>
+      <w:r>
+        <w:rPr>
+          <w:b/>
+          <w:color w:val="0F3C73"/>
+        </w:rPr>
+        <w:t xml:space="preserve">•  </w:t>
+      </w:r>
+      <w:r>
+        <w:rPr>
+          <w:rFonts w:ascii="Calibri" w:hAnsi="Calibri"/>
+          <w:color w:val="24292F"/>
+          <w:sz w:val="20"/>
+        </w:rPr>
+        <w:t>If the shape of the generated grid differs from the expected output shape, the loss is assigned as infinity (</w:t>
+      </w:r>
+      <w:r>
+        <w:rPr>
+          <w:rFonts w:ascii="Cambria Math" w:hAnsi="Cambria Math"/>
+          <w:b w:val="0"/>
+          <w:color w:val="0F3C73"/>
+          <w:sz w:val="20"/>
+        </w:rPr>
+        <w:t>Loss = ∞</w:t>
+      </w:r>
+      <w:r>
+        <w:rPr>
+          <w:rFonts w:ascii="Calibri" w:hAnsi="Calibri"/>
+          <w:color w:val="24292F"/>
+          <w:sz w:val="20"/>
+        </w:rPr>
+        <w:t>).</w:t>
+      </w:r>
+    </w:p>
+    <w:p>
+      <w:pPr>
+        <w:spacing w:before="20" w:after="40" w:line="276" w:lineRule="auto"/>
+        <w:ind w:left="360"/>
+      </w:pPr>
+      <w:r>
+        <w:rPr>
+          <w:b/>
+          <w:color w:val="0F3C73"/>
+        </w:rPr>
+        <w:t xml:space="preserve">•  </w:t>
+      </w:r>
+      <w:r>
+        <w:rPr>
+          <w:rFonts w:ascii="Calibri" w:hAnsi="Calibri"/>
+          <w:color w:val="24292F"/>
+          <w:sz w:val="20"/>
+        </w:rPr>
+        <w:t>Otherwise, the loss corresponds to the exact count of mismatching pixels between prediction and target.</w:t>
       </w:r>
     </w:p>
     <w:p>
@@ -4122,44 +5622,11 @@
       <w:r>
         <w:rPr>
           <w:rFonts w:ascii="Calibri" w:hAnsi="Calibri"/>
+          <w:b/>
           <w:color w:val="24292F"/>
           <w:sz w:val="20"/>
         </w:rPr>
-        <w:t xml:space="preserve">A program </w:t>
-      </w:r>
-      <w:r>
-        <w:rPr>
-          <w:rFonts w:ascii="Cambria Math" w:hAnsi="Cambria Math"/>
-          <w:i/>
-          <w:color w:val="0F3C73"/>
-          <w:sz w:val="20"/>
-        </w:rPr>
-        <w:t>P^*</w:t>
-      </w:r>
-      <w:r>
-        <w:rPr>
-          <w:rFonts w:ascii="Calibri" w:hAnsi="Calibri"/>
-          <w:color w:val="24292F"/>
-          <w:sz w:val="20"/>
-        </w:rPr>
-        <w:t xml:space="preserve"> is accepted **if and only if </w:t>
-      </w:r>
-      <w:r>
-        <w:rPr>
-          <w:rFonts w:ascii="Cambria Math" w:hAnsi="Cambria Math"/>
-          <w:i/>
-          <w:color w:val="0F3C73"/>
-          <w:sz w:val="20"/>
-        </w:rPr>
-        <w:t>Loss(P^*) = 0</w:t>
-      </w:r>
-      <w:r>
-        <w:rPr>
-          <w:rFonts w:ascii="Calibri" w:hAnsi="Calibri"/>
-          <w:color w:val="24292F"/>
-          <w:sz w:val="20"/>
-        </w:rPr>
-        <w:t xml:space="preserve"> on 100% of training pairs**. The verified program is then applied to the hidden test input:</w:t>
+        <w:t>Deterministic Acceptance Criterion:</w:t>
       </w:r>
     </w:p>
     <w:p>
@@ -4170,11 +5637,43 @@
       <w:r>
         <w:rPr>
           <w:rFonts w:ascii="Cambria Math" w:hAnsi="Cambria Math"/>
-          <w:i/>
+          <w:b/>
           <w:color w:val="0F3C73"/>
           <w:sz w:val="22"/>
         </w:rPr>
-        <w:t>O_test = P^*(I_{\text{test}})</w:t>
+        <w:t>Criterion:     Loss(P</w:t>
+      </w:r>
+      <w:r>
+        <w:rPr>
+          <w:rFonts w:ascii="Cambria Math" w:hAnsi="Cambria Math"/>
+          <w:b/>
+          <w:color w:val="0F3C73"/>
+          <w:sz w:val="22"/>
+          <w:vertAlign w:val="superscript"/>
+        </w:rPr>
+        <w:t>*</w:t>
+      </w:r>
+      <w:r>
+        <w:rPr>
+          <w:rFonts w:ascii="Cambria Math" w:hAnsi="Cambria Math"/>
+          <w:b/>
+          <w:color w:val="0F3C73"/>
+          <w:sz w:val="22"/>
+        </w:rPr>
+        <w:t>) = 0     (100% exact match across all training pairs)</w:t>
+      </w:r>
+    </w:p>
+    <w:p>
+      <w:pPr>
+        <w:spacing w:before="40" w:after="80" w:line="276" w:lineRule="auto"/>
+      </w:pPr>
+      <w:r>
+        <w:rPr>
+          <w:rFonts w:ascii="Calibri" w:hAnsi="Calibri"/>
+          <w:color w:val="24292F"/>
+          <w:sz w:val="20"/>
+        </w:rPr>
+        <w:t>A program is accepted if and only if it achieves zero errors across every demonstration pair. The verified program is then applied to the hidden test input:</w:t>
       </w:r>
     </w:p>
     <w:p>
@@ -4184,6 +5683,59 @@
       </w:pPr>
       <w:r>
         <w:rPr>
+          <w:rFonts w:ascii="Cambria Math" w:hAnsi="Cambria Math"/>
+          <w:b/>
+          <w:color w:val="0F3C73"/>
+          <w:sz w:val="22"/>
+        </w:rPr>
+        <w:t>Solved Test Grid = P</w:t>
+      </w:r>
+      <w:r>
+        <w:rPr>
+          <w:rFonts w:ascii="Cambria Math" w:hAnsi="Cambria Math"/>
+          <w:b/>
+          <w:color w:val="0F3C73"/>
+          <w:sz w:val="22"/>
+          <w:vertAlign w:val="superscript"/>
+        </w:rPr>
+        <w:t>*</w:t>
+      </w:r>
+      <w:r>
+        <w:rPr>
+          <w:rFonts w:ascii="Cambria Math" w:hAnsi="Cambria Math"/>
+          <w:b/>
+          <w:color w:val="0F3C73"/>
+          <w:sz w:val="22"/>
+        </w:rPr>
+        <w:t>(I</w:t>
+      </w:r>
+      <w:r>
+        <w:rPr>
+          <w:rFonts w:ascii="Cambria Math" w:hAnsi="Cambria Math"/>
+          <w:b/>
+          <w:color w:val="0F3C73"/>
+          <w:sz w:val="22"/>
+          <w:vertAlign w:val="subscript"/>
+        </w:rPr>
+        <w:t>test</w:t>
+      </w:r>
+      <w:r>
+        <w:rPr>
+          <w:rFonts w:ascii="Cambria Math" w:hAnsi="Cambria Math"/>
+          <w:b/>
+          <w:color w:val="0F3C73"/>
+          <w:sz w:val="22"/>
+        </w:rPr>
+        <w:t>)</w:t>
+      </w:r>
+    </w:p>
+    <w:p>
+      <w:pPr>
+        <w:spacing w:before="120" w:after="120"/>
+        <w:jc w:val="center"/>
+      </w:pPr>
+      <w:r>
+        <w:rPr>
           <w:color w:val="D0D7DE"/>
           <w:sz w:val="12"/>
         </w:rPr>
@@ -4200,7 +5752,7 @@
           <w:rFonts w:ascii="Calibri" w:hAnsi="Calibri"/>
           <w:b/>
           <w:color w:val="0F3C73"/>
-          <w:sz w:val="28"/>
+          <w:sz w:val="27"/>
         </w:rPr>
         <w:t>3. Empirical Validation and Canonical Benchmarks (Accuracy &amp; Completeness)</w:t>
       </w:r>
@@ -4504,7 +6056,25 @@
                 <w:color w:val="24292F"/>
                 <w:sz w:val="18"/>
               </w:rPr>
-              <w:t>Exact ($\text{Loss}=0$)</w:t>
+              <w:t>Exact (</w:t>
+            </w:r>
+            <w:r>
+              <w:rPr>
+                <w:rFonts w:ascii="Cambria Math" w:hAnsi="Cambria Math"/>
+                <w:b/>
+                <w:color w:val="0F3C73"/>
+                <w:sz w:val="18"/>
+              </w:rPr>
+              <w:t>Loss=0</w:t>
+            </w:r>
+            <w:r>
+              <w:rPr>
+                <w:rFonts w:ascii="Calibri" w:hAnsi="Calibri"/>
+                <w:b/>
+                <w:color w:val="24292F"/>
+                <w:sz w:val="18"/>
+              </w:rPr>
+              <w:t>)</w:t>
             </w:r>
           </w:p>
         </w:tc>
@@ -4637,7 +6207,25 @@
                 <w:color w:val="24292F"/>
                 <w:sz w:val="18"/>
               </w:rPr>
-              <w:t>Exact ($\text{Loss}=0$)</w:t>
+              <w:t>Exact (</w:t>
+            </w:r>
+            <w:r>
+              <w:rPr>
+                <w:rFonts w:ascii="Cambria Math" w:hAnsi="Cambria Math"/>
+                <w:b/>
+                <w:color w:val="0F3C73"/>
+                <w:sz w:val="18"/>
+              </w:rPr>
+              <w:t>Loss=0</w:t>
+            </w:r>
+            <w:r>
+              <w:rPr>
+                <w:rFonts w:ascii="Calibri" w:hAnsi="Calibri"/>
+                <w:b/>
+                <w:color w:val="24292F"/>
+                <w:sz w:val="18"/>
+              </w:rPr>
+              <w:t>)</w:t>
             </w:r>
           </w:p>
         </w:tc>
@@ -4770,7 +6358,25 @@
                 <w:color w:val="24292F"/>
                 <w:sz w:val="18"/>
               </w:rPr>
-              <w:t>Exact ($\text{Loss}=0$)</w:t>
+              <w:t>Exact (</w:t>
+            </w:r>
+            <w:r>
+              <w:rPr>
+                <w:rFonts w:ascii="Cambria Math" w:hAnsi="Cambria Math"/>
+                <w:b/>
+                <w:color w:val="0F3C73"/>
+                <w:sz w:val="18"/>
+              </w:rPr>
+              <w:t>Loss=0</w:t>
+            </w:r>
+            <w:r>
+              <w:rPr>
+                <w:rFonts w:ascii="Calibri" w:hAnsi="Calibri"/>
+                <w:b/>
+                <w:color w:val="24292F"/>
+                <w:sz w:val="18"/>
+              </w:rPr>
+              <w:t>)</w:t>
             </w:r>
           </w:p>
         </w:tc>
@@ -4903,7 +6509,25 @@
                 <w:color w:val="24292F"/>
                 <w:sz w:val="18"/>
               </w:rPr>
-              <w:t>Exact ($\text{Loss}=0$)</w:t>
+              <w:t>Exact (</w:t>
+            </w:r>
+            <w:r>
+              <w:rPr>
+                <w:rFonts w:ascii="Cambria Math" w:hAnsi="Cambria Math"/>
+                <w:b/>
+                <w:color w:val="0F3C73"/>
+                <w:sz w:val="18"/>
+              </w:rPr>
+              <w:t>Loss=0</w:t>
+            </w:r>
+            <w:r>
+              <w:rPr>
+                <w:rFonts w:ascii="Calibri" w:hAnsi="Calibri"/>
+                <w:b/>
+                <w:color w:val="24292F"/>
+                <w:sz w:val="18"/>
+              </w:rPr>
+              <w:t>)</w:t>
             </w:r>
           </w:p>
         </w:tc>
@@ -5036,7 +6660,25 @@
                 <w:color w:val="24292F"/>
                 <w:sz w:val="18"/>
               </w:rPr>
-              <w:t>Exact ($\text{Loss}=0$)</w:t>
+              <w:t>Exact (</w:t>
+            </w:r>
+            <w:r>
+              <w:rPr>
+                <w:rFonts w:ascii="Cambria Math" w:hAnsi="Cambria Math"/>
+                <w:b/>
+                <w:color w:val="0F3C73"/>
+                <w:sz w:val="18"/>
+              </w:rPr>
+              <w:t>Loss=0</w:t>
+            </w:r>
+            <w:r>
+              <w:rPr>
+                <w:rFonts w:ascii="Calibri" w:hAnsi="Calibri"/>
+                <w:b/>
+                <w:color w:val="24292F"/>
+                <w:sz w:val="18"/>
+              </w:rPr>
+              <w:t>)</w:t>
             </w:r>
           </w:p>
         </w:tc>
@@ -5190,7 +6832,7 @@
           <w:rFonts w:ascii="Calibri" w:hAnsi="Calibri"/>
           <w:b/>
           <w:color w:val="1E5AA0"/>
-          <w:sz w:val="24"/>
+          <w:sz w:val="23"/>
         </w:rPr>
         <w:t>Offline Robustness in Kaggle ARC-AGI-2</w:t>
       </w:r>
@@ -5406,7 +7048,7 @@
           <w:rFonts w:ascii="Calibri" w:hAnsi="Calibri"/>
           <w:b/>
           <w:color w:val="0F3C73"/>
-          <w:sz w:val="28"/>
+          <w:sz w:val="27"/>
         </w:rPr>
         <w:t>4. Official Verification Proof (Submission ID)</w:t>
       </w:r>
@@ -5585,7 +7227,7 @@
           <w:rFonts w:ascii="Calibri" w:hAnsi="Calibri"/>
           <w:b/>
           <w:color w:val="0F3C73"/>
-          <w:sz w:val="28"/>
+          <w:sz w:val="27"/>
         </w:rPr>
         <w:t>5. Universality Beyond ARC (Universality)</w:t>
       </w:r>
@@ -5733,7 +7375,7 @@
           <w:rFonts w:ascii="Calibri" w:hAnsi="Calibri"/>
           <w:b/>
           <w:color w:val="0F3C73"/>
-          <w:sz w:val="28"/>
+          <w:sz w:val="27"/>
         </w:rPr>
         <w:t>6. Honest Scope and Limitations (Limitations)</w:t>
       </w:r>
@@ -5813,7 +7455,7 @@
       <w:r>
         <w:rPr>
           <w:rFonts w:ascii="Cambria Math" w:hAnsi="Cambria Math"/>
-          <w:i/>
+          <w:b w:val="0"/>
           <w:color w:val="0F3C73"/>
           <w:sz w:val="20"/>
         </w:rPr>
@@ -5915,7 +7557,7 @@
           <w:rFonts w:ascii="Calibri" w:hAnsi="Calibri"/>
           <w:b/>
           <w:color w:val="0F3C73"/>
-          <w:sz w:val="28"/>
+          <w:sz w:val="27"/>
         </w:rPr>
         <w:t>7. Conclusion</w:t>
       </w:r>
@@ -5986,7 +7628,7 @@
           <w:rFonts w:ascii="Calibri" w:hAnsi="Calibri"/>
           <w:b/>
           <w:color w:val="1E5AA0"/>
-          <w:sz w:val="24"/>
+          <w:sz w:val="23"/>
         </w:rPr>
         <w:t>References</w:t>
       </w:r>

</xml_diff>